<commit_message>
Fix ActiveIngredient–DrugProduct relationship (DHSOHG-3326) AB#170231
</commit_message>
<xml_diff>
--- a/Apps/GatewayApi/src/Assets/Templates/MedicationReport.docx
+++ b/Apps/GatewayApi/src/Assets/Templates/MedicationReport.docx
@@ -1,24 +1,23 @@
 
 <file path=word/document.xml><?xml version="1.0" encoding="utf-8"?>
-<w:document xmlns:wpc="http://schemas.microsoft.com/office/word/2010/wordprocessingCanvas" xmlns:cx="http://schemas.microsoft.com/office/drawing/2014/chartex" xmlns:cx1="http://schemas.microsoft.com/office/drawing/2015/9/8/chartex" xmlns:cx2="http://schemas.microsoft.com/office/drawing/2015/10/21/chartex" xmlns:cx3="http://schemas.microsoft.com/office/drawing/2016/5/9/chartex" xmlns:cx4="http://schemas.microsoft.com/office/drawing/2016/5/10/chartex" xmlns:cx5="http://schemas.microsoft.com/office/drawing/2016/5/11/chartex" xmlns:cx6="http://schemas.microsoft.com/office/drawing/2016/5/12/chartex" xmlns:cx7="http://schemas.microsoft.com/office/drawing/2016/5/13/chartex" xmlns:cx8="http://schemas.microsoft.com/office/drawing/2016/5/14/chartex" xmlns:mc="http://schemas.openxmlformats.org/markup-compatibility/2006" xmlns:aink="http://schemas.microsoft.com/office/drawing/2016/ink" xmlns:am3d="http://schemas.microsoft.com/office/drawing/2017/model3d" xmlns:o="urn:schemas-microsoft-com:office:office" xmlns:oel="http://schemas.microsoft.com/office/2019/extlst" xmlns:r="http://schemas.openxmlformats.org/officeDocument/2006/relationships" xmlns:m="http://schemas.openxmlformats.org/officeDocument/2006/math" xmlns:v="urn:schemas-microsoft-com:vml" xmlns:wp14="http://schemas.microsoft.com/office/word/2010/wordprocessingDrawing" xmlns:wp="http://schemas.openxmlformats.org/drawingml/2006/wordprocessingDrawing" xmlns:w10="urn:schemas-microsoft-com:office:word" xmlns:w="http://schemas.openxmlformats.org/wordprocessingml/2006/main" xmlns:w14="http://schemas.microsoft.com/office/word/2010/wordml" xmlns:w15="http://schemas.microsoft.com/office/word/2012/wordml" xmlns:w16cex="http://schemas.microsoft.com/office/word/2018/wordml/cex" xmlns:w16cid="http://schemas.microsoft.com/office/word/2016/wordml/cid" xmlns:w16="http://schemas.microsoft.com/office/word/2018/wordml" xmlns:w16du="http://schemas.microsoft.com/office/word/2023/wordml/word16du" xmlns:w16sdtdh="http://schemas.microsoft.com/office/word/2020/wordml/sdtdatahash" xmlns:w16se="http://schemas.microsoft.com/office/word/2015/wordml/symex" xmlns:wpg="http://schemas.microsoft.com/office/word/2010/wordprocessingGroup" xmlns:wpi="http://schemas.microsoft.com/office/word/2010/wordprocessingInk" xmlns:wne="http://schemas.microsoft.com/office/word/2006/wordml" xmlns:wps="http://schemas.microsoft.com/office/word/2010/wordprocessingShape" mc:Ignorable="w14 w15 w16se w16cid w16 w16cex w16sdtdh w16du wp14">
+<w:document xmlns:wpc="http://schemas.microsoft.com/office/word/2010/wordprocessingCanvas" xmlns:cx="http://schemas.microsoft.com/office/drawing/2014/chartex" xmlns:cx1="http://schemas.microsoft.com/office/drawing/2015/9/8/chartex" xmlns:cx2="http://schemas.microsoft.com/office/drawing/2015/10/21/chartex" xmlns:cx3="http://schemas.microsoft.com/office/drawing/2016/5/9/chartex" xmlns:cx4="http://schemas.microsoft.com/office/drawing/2016/5/10/chartex" xmlns:cx5="http://schemas.microsoft.com/office/drawing/2016/5/11/chartex" xmlns:cx6="http://schemas.microsoft.com/office/drawing/2016/5/12/chartex" xmlns:cx7="http://schemas.microsoft.com/office/drawing/2016/5/13/chartex" xmlns:cx8="http://schemas.microsoft.com/office/drawing/2016/5/14/chartex" xmlns:mc="http://schemas.openxmlformats.org/markup-compatibility/2006" xmlns:aink="http://schemas.microsoft.com/office/drawing/2016/ink" xmlns:am3d="http://schemas.microsoft.com/office/drawing/2017/model3d" xmlns:o="urn:schemas-microsoft-com:office:office" xmlns:oel="http://schemas.microsoft.com/office/2019/extlst" xmlns:r="http://schemas.openxmlformats.org/officeDocument/2006/relationships" xmlns:m="http://schemas.openxmlformats.org/officeDocument/2006/math" xmlns:v="urn:schemas-microsoft-com:vml" xmlns:wp14="http://schemas.microsoft.com/office/word/2010/wordprocessingDrawing" xmlns:wp="http://schemas.openxmlformats.org/drawingml/2006/wordprocessingDrawing" xmlns:w10="urn:schemas-microsoft-com:office:word" xmlns:w="http://schemas.openxmlformats.org/wordprocessingml/2006/main" xmlns:w14="http://schemas.microsoft.com/office/word/2010/wordml" xmlns:w15="http://schemas.microsoft.com/office/word/2012/wordml" xmlns:w16cex="http://schemas.microsoft.com/office/word/2018/wordml/cex" xmlns:w16cid="http://schemas.microsoft.com/office/word/2016/wordml/cid" xmlns:w16="http://schemas.microsoft.com/office/word/2018/wordml" xmlns:w16du="http://schemas.microsoft.com/office/word/2023/wordml/word16du" xmlns:w16sdtdh="http://schemas.microsoft.com/office/word/2020/wordml/sdtdatahash" xmlns:w16sdtfl="http://schemas.microsoft.com/office/word/2024/wordml/sdtformatlock" xmlns:w16se="http://schemas.microsoft.com/office/word/2015/wordml/symex" xmlns:wpg="http://schemas.microsoft.com/office/word/2010/wordprocessingGroup" xmlns:wpi="http://schemas.microsoft.com/office/word/2010/wordprocessingInk" xmlns:wne="http://schemas.microsoft.com/office/word/2006/wordml" xmlns:wps="http://schemas.microsoft.com/office/word/2010/wordprocessingShape" mc:Ignorable="w14 w15 w16se w16cid w16 w16cex w16sdtdh w16sdtfl w16du wp14">
   <w:body>
     <w:tbl>
       <w:tblPr>
         <w:tblStyle w:val="HealthGatewayExportTable"/>
-        <w:tblW w:w="5000" w:type="pct"/>
+        <w:tblW w:w="4433" w:type="pct"/>
         <w:tblLayout w:type="fixed"/>
         <w:tblLook w:val="04A0" w:firstRow="1" w:lastRow="0" w:firstColumn="1" w:lastColumn="0" w:noHBand="0" w:noVBand="1"/>
       </w:tblPr>
       <w:tblGrid>
-        <w:gridCol w:w="1265"/>
-        <w:gridCol w:w="975"/>
+        <w:gridCol w:w="1062"/>
+        <w:gridCol w:w="1181"/>
+        <w:gridCol w:w="1049"/>
+        <w:gridCol w:w="1189"/>
+        <w:gridCol w:w="1361"/>
         <w:gridCol w:w="1222"/>
-        <w:gridCol w:w="1222"/>
-        <w:gridCol w:w="1222"/>
-        <w:gridCol w:w="1025"/>
-        <w:gridCol w:w="1138"/>
-        <w:gridCol w:w="1222"/>
-        <w:gridCol w:w="1509"/>
+        <w:gridCol w:w="1082"/>
+        <w:gridCol w:w="1429"/>
       </w:tblGrid>
       <w:tr>
         <w:trPr>
@@ -29,7 +28,7 @@
         </w:trPr>
         <w:tc>
           <w:tcPr>
-            <w:tcW w:w="1261" w:type="dxa"/>
+            <w:tcW w:w="2920" w:type="dxa"/>
           </w:tcPr>
           <w:p>
             <w:pPr>
@@ -59,7 +58,7 @@
         </w:tc>
         <w:tc>
           <w:tcPr>
-            <w:tcW w:w="971" w:type="dxa"/>
+            <w:tcW w:w="3291" w:type="dxa"/>
           </w:tcPr>
           <w:p>
             <w:pPr>
@@ -89,7 +88,7 @@
         </w:tc>
         <w:tc>
           <w:tcPr>
-            <w:tcW w:w="1217" w:type="dxa"/>
+            <w:tcW w:w="2876" w:type="dxa"/>
           </w:tcPr>
           <w:p>
             <w:pPr>
@@ -119,7 +118,7 @@
         </w:tc>
         <w:tc>
           <w:tcPr>
-            <w:tcW w:w="1217" w:type="dxa"/>
+            <w:tcW w:w="3314" w:type="dxa"/>
           </w:tcPr>
           <w:p>
             <w:pPr>
@@ -149,7 +148,7 @@
         </w:tc>
         <w:tc>
           <w:tcPr>
-            <w:tcW w:w="1217" w:type="dxa"/>
+            <w:tcW w:w="3853" w:type="dxa"/>
           </w:tcPr>
           <w:p>
             <w:pPr>
@@ -179,7 +178,7 @@
         </w:tc>
         <w:tc>
           <w:tcPr>
-            <w:tcW w:w="1021" w:type="dxa"/>
+            <w:tcW w:w="3419" w:type="dxa"/>
           </w:tcPr>
           <w:p>
             <w:pPr>
@@ -209,7 +208,7 @@
         </w:tc>
         <w:tc>
           <w:tcPr>
-            <w:tcW w:w="1134" w:type="dxa"/>
+            <w:tcW w:w="2982" w:type="dxa"/>
           </w:tcPr>
           <w:p>
             <w:pPr>
@@ -233,43 +232,13 @@
                 <w:sz w:val="14"/>
                 <w:szCs w:val="14"/>
               </w:rPr>
-              <w:t>Strength</w:t>
+              <w:t>Form</w:t>
             </w:r>
           </w:p>
         </w:tc>
         <w:tc>
           <w:tcPr>
-            <w:tcW w:w="1217" w:type="dxa"/>
-          </w:tcPr>
-          <w:p>
-            <w:pPr>
-              <w:rPr>
-                <w:rStyle w:val="Strong"/>
-                <w:rFonts w:ascii="Myriad-Pro, Calibri, Arial" w:hAnsi="Myriad-Pro, Calibri, Arial"/>
-                <w:b/>
-                <w:bCs w:val="0"/>
-                <w:color w:val="auto"/>
-                <w:sz w:val="14"/>
-                <w:szCs w:val="14"/>
-              </w:rPr>
-            </w:pPr>
-            <w:r>
-              <w:rPr>
-                <w:rStyle w:val="Strong"/>
-                <w:rFonts w:ascii="Myriad-Pro, Calibri, Arial" w:hAnsi="Myriad-Pro, Calibri, Arial"/>
-                <w:b/>
-                <w:bCs w:val="0"/>
-                <w:color w:val="auto"/>
-                <w:sz w:val="14"/>
-                <w:szCs w:val="14"/>
-              </w:rPr>
-              <w:t>Form</w:t>
-            </w:r>
-          </w:p>
-        </w:tc>
-        <w:tc>
-          <w:tcPr>
-            <w:tcW w:w="1503" w:type="dxa"/>
+            <w:tcW w:w="4066" w:type="dxa"/>
           </w:tcPr>
           <w:p>
             <w:pPr>
@@ -306,7 +275,7 @@
         </w:trPr>
         <w:tc>
           <w:tcPr>
-            <w:tcW w:w="1261" w:type="dxa"/>
+            <w:tcW w:w="2920" w:type="dxa"/>
           </w:tcPr>
           <w:p>
             <w:pPr>
@@ -350,18 +319,27 @@
               <w:t>i</w:t>
             </w:r>
             <w:proofErr w:type="spellEnd"/>
-            <w:r>
-              <w:rPr>
-                <w:rFonts w:ascii="Myriad-Pro, Calibri, Arial" w:hAnsi="Myriad-Pro, Calibri, Arial"/>
-                <w:color w:val="auto"/>
-              </w:rPr>
-              <w:t>].date}</w:t>
+            <w:proofErr w:type="gramStart"/>
+            <w:r>
+              <w:rPr>
+                <w:rFonts w:ascii="Myriad-Pro, Calibri, Arial" w:hAnsi="Myriad-Pro, Calibri, Arial"/>
+                <w:color w:val="auto"/>
+              </w:rPr>
+              <w:t>].date</w:t>
+            </w:r>
+            <w:proofErr w:type="gramEnd"/>
+            <w:r>
+              <w:rPr>
+                <w:rFonts w:ascii="Myriad-Pro, Calibri, Arial" w:hAnsi="Myriad-Pro, Calibri, Arial"/>
+                <w:color w:val="auto"/>
+              </w:rPr>
+              <w:t>}</w:t>
             </w:r>
           </w:p>
         </w:tc>
         <w:tc>
           <w:tcPr>
-            <w:tcW w:w="971" w:type="dxa"/>
+            <w:tcW w:w="3291" w:type="dxa"/>
           </w:tcPr>
           <w:p>
             <w:pPr>
@@ -405,6 +383,7 @@
               <w:t>i</w:t>
             </w:r>
             <w:proofErr w:type="spellEnd"/>
+            <w:proofErr w:type="gramStart"/>
             <w:r>
               <w:rPr>
                 <w:rFonts w:ascii="Myriad-Pro, Calibri, Arial" w:hAnsi="Myriad-Pro, Calibri, Arial"/>
@@ -418,7 +397,15 @@
                 <w:rFonts w:ascii="Myriad-Pro, Calibri, Arial" w:hAnsi="Myriad-Pro, Calibri, Arial"/>
                 <w:color w:val="auto"/>
               </w:rPr>
-              <w:t>din_pin</w:t>
+              <w:t>din</w:t>
+            </w:r>
+            <w:proofErr w:type="gramEnd"/>
+            <w:r>
+              <w:rPr>
+                <w:rFonts w:ascii="Myriad-Pro, Calibri, Arial" w:hAnsi="Myriad-Pro, Calibri, Arial"/>
+                <w:color w:val="auto"/>
+              </w:rPr>
+              <w:t>_pin</w:t>
             </w:r>
             <w:proofErr w:type="spellEnd"/>
             <w:r>
@@ -432,7 +419,7 @@
         </w:tc>
         <w:tc>
           <w:tcPr>
-            <w:tcW w:w="1217" w:type="dxa"/>
+            <w:tcW w:w="2876" w:type="dxa"/>
           </w:tcPr>
           <w:p>
             <w:pPr>
@@ -476,20 +463,15 @@
               <w:t>i</w:t>
             </w:r>
             <w:proofErr w:type="spellEnd"/>
-            <w:r>
-              <w:rPr>
-                <w:rFonts w:ascii="Myriad-Pro, Calibri, Arial" w:hAnsi="Myriad-Pro, Calibri, Arial"/>
-                <w:color w:val="auto"/>
-              </w:rPr>
-              <w:t>].</w:t>
-            </w:r>
-            <w:r>
-              <w:rPr>
-                <w:rFonts w:ascii="Myriad-Pro, Calibri, Arial" w:hAnsi="Myriad-Pro, Calibri, Arial"/>
-                <w:color w:val="auto"/>
-              </w:rPr>
-              <w:t>title</w:t>
-            </w:r>
+            <w:proofErr w:type="gramStart"/>
+            <w:r>
+              <w:rPr>
+                <w:rFonts w:ascii="Myriad-Pro, Calibri, Arial" w:hAnsi="Myriad-Pro, Calibri, Arial"/>
+                <w:color w:val="auto"/>
+              </w:rPr>
+              <w:t>].title</w:t>
+            </w:r>
+            <w:proofErr w:type="gramEnd"/>
             <w:r>
               <w:rPr>
                 <w:rFonts w:ascii="Myriad-Pro, Calibri, Arial" w:hAnsi="Myriad-Pro, Calibri, Arial"/>
@@ -501,7 +483,7 @@
         </w:tc>
         <w:tc>
           <w:tcPr>
-            <w:tcW w:w="1217" w:type="dxa"/>
+            <w:tcW w:w="3314" w:type="dxa"/>
           </w:tcPr>
           <w:p>
             <w:pPr>
@@ -545,20 +527,15 @@
               <w:t>i</w:t>
             </w:r>
             <w:proofErr w:type="spellEnd"/>
-            <w:r>
-              <w:rPr>
-                <w:rFonts w:ascii="Myriad-Pro, Calibri, Arial" w:hAnsi="Myriad-Pro, Calibri, Arial"/>
-                <w:color w:val="auto"/>
-              </w:rPr>
-              <w:t>].</w:t>
-            </w:r>
-            <w:r>
-              <w:rPr>
-                <w:rFonts w:ascii="Myriad-Pro, Calibri, Arial" w:hAnsi="Myriad-Pro, Calibri, Arial"/>
-                <w:color w:val="auto"/>
-              </w:rPr>
-              <w:t>subtitle</w:t>
-            </w:r>
+            <w:proofErr w:type="gramStart"/>
+            <w:r>
+              <w:rPr>
+                <w:rFonts w:ascii="Myriad-Pro, Calibri, Arial" w:hAnsi="Myriad-Pro, Calibri, Arial"/>
+                <w:color w:val="auto"/>
+              </w:rPr>
+              <w:t>].subtitle</w:t>
+            </w:r>
+            <w:proofErr w:type="gramEnd"/>
             <w:r>
               <w:rPr>
                 <w:rFonts w:ascii="Myriad-Pro, Calibri, Arial" w:hAnsi="Myriad-Pro, Calibri, Arial"/>
@@ -570,7 +547,7 @@
         </w:tc>
         <w:tc>
           <w:tcPr>
-            <w:tcW w:w="1217" w:type="dxa"/>
+            <w:tcW w:w="3853" w:type="dxa"/>
           </w:tcPr>
           <w:p>
             <w:pPr>
@@ -614,18 +591,27 @@
               <w:t>i</w:t>
             </w:r>
             <w:proofErr w:type="spellEnd"/>
-            <w:r>
-              <w:rPr>
-                <w:rFonts w:ascii="Myriad-Pro, Calibri, Arial" w:hAnsi="Myriad-Pro, Calibri, Arial"/>
-                <w:color w:val="auto"/>
-              </w:rPr>
-              <w:t>].practitioner}</w:t>
+            <w:proofErr w:type="gramStart"/>
+            <w:r>
+              <w:rPr>
+                <w:rFonts w:ascii="Myriad-Pro, Calibri, Arial" w:hAnsi="Myriad-Pro, Calibri, Arial"/>
+                <w:color w:val="auto"/>
+              </w:rPr>
+              <w:t>].practitioner</w:t>
+            </w:r>
+            <w:proofErr w:type="gramEnd"/>
+            <w:r>
+              <w:rPr>
+                <w:rFonts w:ascii="Myriad-Pro, Calibri, Arial" w:hAnsi="Myriad-Pro, Calibri, Arial"/>
+                <w:color w:val="auto"/>
+              </w:rPr>
+              <w:t>}</w:t>
             </w:r>
           </w:p>
         </w:tc>
         <w:tc>
           <w:tcPr>
-            <w:tcW w:w="1021" w:type="dxa"/>
+            <w:tcW w:w="3419" w:type="dxa"/>
           </w:tcPr>
           <w:p>
             <w:pPr>
@@ -669,18 +655,27 @@
               <w:t>i</w:t>
             </w:r>
             <w:proofErr w:type="spellEnd"/>
-            <w:r>
-              <w:rPr>
-                <w:rFonts w:ascii="Myriad-Pro, Calibri, Arial" w:hAnsi="Myriad-Pro, Calibri, Arial"/>
-                <w:color w:val="auto"/>
-              </w:rPr>
-              <w:t>].quantity}</w:t>
+            <w:proofErr w:type="gramStart"/>
+            <w:r>
+              <w:rPr>
+                <w:rFonts w:ascii="Myriad-Pro, Calibri, Arial" w:hAnsi="Myriad-Pro, Calibri, Arial"/>
+                <w:color w:val="auto"/>
+              </w:rPr>
+              <w:t>].quantity</w:t>
+            </w:r>
+            <w:proofErr w:type="gramEnd"/>
+            <w:r>
+              <w:rPr>
+                <w:rFonts w:ascii="Myriad-Pro, Calibri, Arial" w:hAnsi="Myriad-Pro, Calibri, Arial"/>
+                <w:color w:val="auto"/>
+              </w:rPr>
+              <w:t>}</w:t>
             </w:r>
           </w:p>
         </w:tc>
         <w:tc>
           <w:tcPr>
-            <w:tcW w:w="1134" w:type="dxa"/>
+            <w:tcW w:w="2982" w:type="dxa"/>
           </w:tcPr>
           <w:p>
             <w:pPr>
@@ -724,18 +719,27 @@
               <w:t>i</w:t>
             </w:r>
             <w:proofErr w:type="spellEnd"/>
-            <w:r>
-              <w:rPr>
-                <w:rFonts w:ascii="Myriad-Pro, Calibri, Arial" w:hAnsi="Myriad-Pro, Calibri, Arial"/>
-                <w:color w:val="auto"/>
-              </w:rPr>
-              <w:t>].strength}</w:t>
+            <w:proofErr w:type="gramStart"/>
+            <w:r>
+              <w:rPr>
+                <w:rFonts w:ascii="Myriad-Pro, Calibri, Arial" w:hAnsi="Myriad-Pro, Calibri, Arial"/>
+                <w:color w:val="auto"/>
+              </w:rPr>
+              <w:t>].form</w:t>
+            </w:r>
+            <w:proofErr w:type="gramEnd"/>
+            <w:r>
+              <w:rPr>
+                <w:rFonts w:ascii="Myriad-Pro, Calibri, Arial" w:hAnsi="Myriad-Pro, Calibri, Arial"/>
+                <w:color w:val="auto"/>
+              </w:rPr>
+              <w:t>}</w:t>
             </w:r>
           </w:p>
         </w:tc>
         <w:tc>
           <w:tcPr>
-            <w:tcW w:w="1217" w:type="dxa"/>
+            <w:tcW w:w="4066" w:type="dxa"/>
           </w:tcPr>
           <w:p>
             <w:pPr>
@@ -779,67 +783,21 @@
               <w:t>i</w:t>
             </w:r>
             <w:proofErr w:type="spellEnd"/>
-            <w:r>
-              <w:rPr>
-                <w:rFonts w:ascii="Myriad-Pro, Calibri, Arial" w:hAnsi="Myriad-Pro, Calibri, Arial"/>
-                <w:color w:val="auto"/>
-              </w:rPr>
-              <w:t>].form}</w:t>
-            </w:r>
-          </w:p>
-        </w:tc>
-        <w:tc>
-          <w:tcPr>
-            <w:tcW w:w="1503" w:type="dxa"/>
-          </w:tcPr>
-          <w:p>
-            <w:pPr>
-              <w:pStyle w:val="Small"/>
-              <w:rPr>
-                <w:rFonts w:ascii="Myriad-Pro, Calibri, Arial" w:hAnsi="Myriad-Pro, Calibri, Arial"/>
-                <w:color w:val="auto"/>
-              </w:rPr>
-            </w:pPr>
-            <w:r>
-              <w:rPr>
-                <w:rFonts w:ascii="Myriad-Pro, Calibri, Arial" w:hAnsi="Myriad-Pro, Calibri, Arial"/>
-                <w:color w:val="auto"/>
-              </w:rPr>
-              <w:t>{</w:t>
-            </w:r>
-            <w:proofErr w:type="spellStart"/>
-            <w:proofErr w:type="gramStart"/>
-            <w:r>
-              <w:rPr>
-                <w:rFonts w:ascii="Myriad-Pro, Calibri, Arial" w:hAnsi="Myriad-Pro, Calibri, Arial"/>
-                <w:color w:val="auto"/>
-              </w:rPr>
-              <w:t>d.records</w:t>
-            </w:r>
-            <w:proofErr w:type="spellEnd"/>
-            <w:proofErr w:type="gramEnd"/>
-            <w:r>
-              <w:rPr>
-                <w:rFonts w:ascii="Myriad-Pro, Calibri, Arial" w:hAnsi="Myriad-Pro, Calibri, Arial"/>
-                <w:color w:val="auto"/>
-              </w:rPr>
-              <w:t>[</w:t>
-            </w:r>
-            <w:proofErr w:type="spellStart"/>
-            <w:r>
-              <w:rPr>
-                <w:rFonts w:ascii="Myriad-Pro, Calibri, Arial" w:hAnsi="Myriad-Pro, Calibri, Arial"/>
-                <w:color w:val="auto"/>
-              </w:rPr>
-              <w:t>i</w:t>
-            </w:r>
-            <w:proofErr w:type="spellEnd"/>
-            <w:r>
-              <w:rPr>
-                <w:rFonts w:ascii="Myriad-Pro, Calibri, Arial" w:hAnsi="Myriad-Pro, Calibri, Arial"/>
-                <w:color w:val="auto"/>
-              </w:rPr>
-              <w:t>].manufacturer}</w:t>
+            <w:proofErr w:type="gramStart"/>
+            <w:r>
+              <w:rPr>
+                <w:rFonts w:ascii="Myriad-Pro, Calibri, Arial" w:hAnsi="Myriad-Pro, Calibri, Arial"/>
+                <w:color w:val="auto"/>
+              </w:rPr>
+              <w:t>].manufacturer</w:t>
+            </w:r>
+            <w:proofErr w:type="gramEnd"/>
+            <w:r>
+              <w:rPr>
+                <w:rFonts w:ascii="Myriad-Pro, Calibri, Arial" w:hAnsi="Myriad-Pro, Calibri, Arial"/>
+                <w:color w:val="auto"/>
+              </w:rPr>
+              <w:t>}</w:t>
             </w:r>
           </w:p>
         </w:tc>
@@ -851,12 +809,11 @@
         </w:trPr>
         <w:tc>
           <w:tcPr>
-            <w:tcW w:w="1261" w:type="dxa"/>
+            <w:tcW w:w="2920" w:type="dxa"/>
           </w:tcPr>
           <w:p>
             <w:pPr>
               <w:pStyle w:val="Small"/>
-              <w:cnfStyle w:val="000000010000" w:firstRow="0" w:lastRow="0" w:firstColumn="0" w:lastColumn="0" w:oddVBand="0" w:evenVBand="0" w:oddHBand="0" w:evenHBand="1" w:firstRowFirstColumn="0" w:firstRowLastColumn="0" w:lastRowFirstColumn="0" w:lastRowLastColumn="0"/>
               <w:rPr>
                 <w:rFonts w:ascii="Myriad-Pro, Calibri, Arial" w:hAnsi="Myriad-Pro, Calibri, Arial"/>
                 <w:color w:val="auto"/>
@@ -885,18 +842,33 @@
                 <w:rFonts w:ascii="Myriad-Pro, Calibri, Arial" w:hAnsi="Myriad-Pro, Calibri, Arial"/>
                 <w:color w:val="auto"/>
               </w:rPr>
-              <w:t>[i+1].date}</w:t>
+              <w:t>[i+1</w:t>
+            </w:r>
+            <w:proofErr w:type="gramStart"/>
+            <w:r>
+              <w:rPr>
+                <w:rFonts w:ascii="Myriad-Pro, Calibri, Arial" w:hAnsi="Myriad-Pro, Calibri, Arial"/>
+                <w:color w:val="auto"/>
+              </w:rPr>
+              <w:t>].date</w:t>
+            </w:r>
+            <w:proofErr w:type="gramEnd"/>
+            <w:r>
+              <w:rPr>
+                <w:rFonts w:ascii="Myriad-Pro, Calibri, Arial" w:hAnsi="Myriad-Pro, Calibri, Arial"/>
+                <w:color w:val="auto"/>
+              </w:rPr>
+              <w:t>}</w:t>
             </w:r>
           </w:p>
         </w:tc>
         <w:tc>
           <w:tcPr>
-            <w:tcW w:w="971" w:type="dxa"/>
+            <w:tcW w:w="3291" w:type="dxa"/>
           </w:tcPr>
           <w:p>
             <w:pPr>
               <w:pStyle w:val="Small"/>
-              <w:cnfStyle w:val="000000010000" w:firstRow="0" w:lastRow="0" w:firstColumn="0" w:lastColumn="0" w:oddVBand="0" w:evenVBand="0" w:oddHBand="0" w:evenHBand="1" w:firstRowFirstColumn="0" w:firstRowLastColumn="0" w:lastRowFirstColumn="0" w:lastRowLastColumn="0"/>
               <w:rPr>
                 <w:rFonts w:ascii="Myriad-Pro, Calibri, Arial" w:hAnsi="Myriad-Pro, Calibri, Arial"/>
                 <w:color w:val="auto"/>
@@ -925,7 +897,15 @@
                 <w:rFonts w:ascii="Myriad-Pro, Calibri, Arial" w:hAnsi="Myriad-Pro, Calibri, Arial"/>
                 <w:color w:val="auto"/>
               </w:rPr>
-              <w:t>[i+1].</w:t>
+              <w:t>[i+1</w:t>
+            </w:r>
+            <w:proofErr w:type="gramStart"/>
+            <w:r>
+              <w:rPr>
+                <w:rFonts w:ascii="Myriad-Pro, Calibri, Arial" w:hAnsi="Myriad-Pro, Calibri, Arial"/>
+                <w:color w:val="auto"/>
+              </w:rPr>
+              <w:t>].</w:t>
             </w:r>
             <w:proofErr w:type="spellStart"/>
             <w:r>
@@ -933,7 +913,15 @@
                 <w:rFonts w:ascii="Myriad-Pro, Calibri, Arial" w:hAnsi="Myriad-Pro, Calibri, Arial"/>
                 <w:color w:val="auto"/>
               </w:rPr>
-              <w:t>din_pin</w:t>
+              <w:t>din</w:t>
+            </w:r>
+            <w:proofErr w:type="gramEnd"/>
+            <w:r>
+              <w:rPr>
+                <w:rFonts w:ascii="Myriad-Pro, Calibri, Arial" w:hAnsi="Myriad-Pro, Calibri, Arial"/>
+                <w:color w:val="auto"/>
+              </w:rPr>
+              <w:t>_pin</w:t>
             </w:r>
             <w:proofErr w:type="spellEnd"/>
             <w:r>
@@ -947,12 +935,11 @@
         </w:tc>
         <w:tc>
           <w:tcPr>
-            <w:tcW w:w="1217" w:type="dxa"/>
+            <w:tcW w:w="2876" w:type="dxa"/>
           </w:tcPr>
           <w:p>
             <w:pPr>
               <w:pStyle w:val="Small"/>
-              <w:cnfStyle w:val="000000010000" w:firstRow="0" w:lastRow="0" w:firstColumn="0" w:lastColumn="0" w:oddVBand="0" w:evenVBand="0" w:oddHBand="0" w:evenHBand="1" w:firstRowFirstColumn="0" w:firstRowLastColumn="0" w:lastRowFirstColumn="0" w:lastRowLastColumn="0"/>
               <w:rPr>
                 <w:rFonts w:ascii="Myriad-Pro, Calibri, Arial" w:hAnsi="Myriad-Pro, Calibri, Arial"/>
                 <w:color w:val="auto"/>
@@ -981,15 +968,17 @@
                 <w:rFonts w:ascii="Myriad-Pro, Calibri, Arial" w:hAnsi="Myriad-Pro, Calibri, Arial"/>
                 <w:color w:val="auto"/>
               </w:rPr>
-              <w:t>[i+1].</w:t>
-            </w:r>
-            <w:r>
-              <w:rPr>
-                <w:rFonts w:ascii="Myriad-Pro, Calibri, Arial" w:hAnsi="Myriad-Pro, Calibri, Arial"/>
-                <w:color w:val="auto"/>
-              </w:rPr>
-              <w:t>title</w:t>
-            </w:r>
+              <w:t>[i+1</w:t>
+            </w:r>
+            <w:proofErr w:type="gramStart"/>
+            <w:r>
+              <w:rPr>
+                <w:rFonts w:ascii="Myriad-Pro, Calibri, Arial" w:hAnsi="Myriad-Pro, Calibri, Arial"/>
+                <w:color w:val="auto"/>
+              </w:rPr>
+              <w:t>].title</w:t>
+            </w:r>
+            <w:proofErr w:type="gramEnd"/>
             <w:r>
               <w:rPr>
                 <w:rFonts w:ascii="Myriad-Pro, Calibri, Arial" w:hAnsi="Myriad-Pro, Calibri, Arial"/>
@@ -1001,12 +990,11 @@
         </w:tc>
         <w:tc>
           <w:tcPr>
-            <w:tcW w:w="1217" w:type="dxa"/>
+            <w:tcW w:w="3314" w:type="dxa"/>
           </w:tcPr>
           <w:p>
             <w:pPr>
               <w:pStyle w:val="Small"/>
-              <w:cnfStyle w:val="000000010000" w:firstRow="0" w:lastRow="0" w:firstColumn="0" w:lastColumn="0" w:oddVBand="0" w:evenVBand="0" w:oddHBand="0" w:evenHBand="1" w:firstRowFirstColumn="0" w:firstRowLastColumn="0" w:lastRowFirstColumn="0" w:lastRowLastColumn="0"/>
               <w:rPr>
                 <w:rFonts w:ascii="Myriad-Pro, Calibri, Arial" w:hAnsi="Myriad-Pro, Calibri, Arial"/>
                 <w:color w:val="auto"/>
@@ -1035,15 +1023,17 @@
                 <w:rFonts w:ascii="Myriad-Pro, Calibri, Arial" w:hAnsi="Myriad-Pro, Calibri, Arial"/>
                 <w:color w:val="auto"/>
               </w:rPr>
-              <w:t>[i+1].</w:t>
-            </w:r>
-            <w:r>
-              <w:rPr>
-                <w:rFonts w:ascii="Myriad-Pro, Calibri, Arial" w:hAnsi="Myriad-Pro, Calibri, Arial"/>
-                <w:color w:val="auto"/>
-              </w:rPr>
-              <w:t>subtitle</w:t>
-            </w:r>
+              <w:t>[i+1</w:t>
+            </w:r>
+            <w:proofErr w:type="gramStart"/>
+            <w:r>
+              <w:rPr>
+                <w:rFonts w:ascii="Myriad-Pro, Calibri, Arial" w:hAnsi="Myriad-Pro, Calibri, Arial"/>
+                <w:color w:val="auto"/>
+              </w:rPr>
+              <w:t>].subtitle</w:t>
+            </w:r>
+            <w:proofErr w:type="gramEnd"/>
             <w:r>
               <w:rPr>
                 <w:rFonts w:ascii="Myriad-Pro, Calibri, Arial" w:hAnsi="Myriad-Pro, Calibri, Arial"/>
@@ -1055,12 +1045,11 @@
         </w:tc>
         <w:tc>
           <w:tcPr>
-            <w:tcW w:w="1217" w:type="dxa"/>
+            <w:tcW w:w="3853" w:type="dxa"/>
           </w:tcPr>
           <w:p>
             <w:pPr>
               <w:pStyle w:val="Small"/>
-              <w:cnfStyle w:val="000000010000" w:firstRow="0" w:lastRow="0" w:firstColumn="0" w:lastColumn="0" w:oddVBand="0" w:evenVBand="0" w:oddHBand="0" w:evenHBand="1" w:firstRowFirstColumn="0" w:firstRowLastColumn="0" w:lastRowFirstColumn="0" w:lastRowLastColumn="0"/>
               <w:rPr>
                 <w:rFonts w:ascii="Myriad-Pro, Calibri, Arial" w:hAnsi="Myriad-Pro, Calibri, Arial"/>
                 <w:color w:val="auto"/>
@@ -1089,18 +1078,33 @@
                 <w:rFonts w:ascii="Myriad-Pro, Calibri, Arial" w:hAnsi="Myriad-Pro, Calibri, Arial"/>
                 <w:color w:val="auto"/>
               </w:rPr>
-              <w:t>[i+1].practitioner}</w:t>
+              <w:t>[i+1</w:t>
+            </w:r>
+            <w:proofErr w:type="gramStart"/>
+            <w:r>
+              <w:rPr>
+                <w:rFonts w:ascii="Myriad-Pro, Calibri, Arial" w:hAnsi="Myriad-Pro, Calibri, Arial"/>
+                <w:color w:val="auto"/>
+              </w:rPr>
+              <w:t>].practitioner</w:t>
+            </w:r>
+            <w:proofErr w:type="gramEnd"/>
+            <w:r>
+              <w:rPr>
+                <w:rFonts w:ascii="Myriad-Pro, Calibri, Arial" w:hAnsi="Myriad-Pro, Calibri, Arial"/>
+                <w:color w:val="auto"/>
+              </w:rPr>
+              <w:t>}</w:t>
             </w:r>
           </w:p>
         </w:tc>
         <w:tc>
           <w:tcPr>
-            <w:tcW w:w="1021" w:type="dxa"/>
+            <w:tcW w:w="3419" w:type="dxa"/>
           </w:tcPr>
           <w:p>
             <w:pPr>
               <w:pStyle w:val="Small"/>
-              <w:cnfStyle w:val="000000010000" w:firstRow="0" w:lastRow="0" w:firstColumn="0" w:lastColumn="0" w:oddVBand="0" w:evenVBand="0" w:oddHBand="0" w:evenHBand="1" w:firstRowFirstColumn="0" w:firstRowLastColumn="0" w:lastRowFirstColumn="0" w:lastRowLastColumn="0"/>
               <w:rPr>
                 <w:rFonts w:ascii="Myriad-Pro, Calibri, Arial" w:hAnsi="Myriad-Pro, Calibri, Arial"/>
                 <w:color w:val="auto"/>
@@ -1129,18 +1133,33 @@
                 <w:rFonts w:ascii="Myriad-Pro, Calibri, Arial" w:hAnsi="Myriad-Pro, Calibri, Arial"/>
                 <w:color w:val="auto"/>
               </w:rPr>
-              <w:t>[i+1].quantity}</w:t>
+              <w:t>[i+1</w:t>
+            </w:r>
+            <w:proofErr w:type="gramStart"/>
+            <w:r>
+              <w:rPr>
+                <w:rFonts w:ascii="Myriad-Pro, Calibri, Arial" w:hAnsi="Myriad-Pro, Calibri, Arial"/>
+                <w:color w:val="auto"/>
+              </w:rPr>
+              <w:t>].quantity</w:t>
+            </w:r>
+            <w:proofErr w:type="gramEnd"/>
+            <w:r>
+              <w:rPr>
+                <w:rFonts w:ascii="Myriad-Pro, Calibri, Arial" w:hAnsi="Myriad-Pro, Calibri, Arial"/>
+                <w:color w:val="auto"/>
+              </w:rPr>
+              <w:t>}</w:t>
             </w:r>
           </w:p>
         </w:tc>
         <w:tc>
           <w:tcPr>
-            <w:tcW w:w="1134" w:type="dxa"/>
+            <w:tcW w:w="2982" w:type="dxa"/>
           </w:tcPr>
           <w:p>
             <w:pPr>
               <w:pStyle w:val="Small"/>
-              <w:cnfStyle w:val="000000010000" w:firstRow="0" w:lastRow="0" w:firstColumn="0" w:lastColumn="0" w:oddVBand="0" w:evenVBand="0" w:oddHBand="0" w:evenHBand="1" w:firstRowFirstColumn="0" w:firstRowLastColumn="0" w:lastRowFirstColumn="0" w:lastRowLastColumn="0"/>
               <w:rPr>
                 <w:rFonts w:ascii="Myriad-Pro, Calibri, Arial" w:hAnsi="Myriad-Pro, Calibri, Arial"/>
                 <w:color w:val="auto"/>
@@ -1169,18 +1188,33 @@
                 <w:rFonts w:ascii="Myriad-Pro, Calibri, Arial" w:hAnsi="Myriad-Pro, Calibri, Arial"/>
                 <w:color w:val="auto"/>
               </w:rPr>
-              <w:t>[i+1].strength}</w:t>
+              <w:t>[i+1</w:t>
+            </w:r>
+            <w:proofErr w:type="gramStart"/>
+            <w:r>
+              <w:rPr>
+                <w:rFonts w:ascii="Myriad-Pro, Calibri, Arial" w:hAnsi="Myriad-Pro, Calibri, Arial"/>
+                <w:color w:val="auto"/>
+              </w:rPr>
+              <w:t>].form</w:t>
+            </w:r>
+            <w:proofErr w:type="gramEnd"/>
+            <w:r>
+              <w:rPr>
+                <w:rFonts w:ascii="Myriad-Pro, Calibri, Arial" w:hAnsi="Myriad-Pro, Calibri, Arial"/>
+                <w:color w:val="auto"/>
+              </w:rPr>
+              <w:t>}</w:t>
             </w:r>
           </w:p>
         </w:tc>
         <w:tc>
           <w:tcPr>
-            <w:tcW w:w="1217" w:type="dxa"/>
+            <w:tcW w:w="4066" w:type="dxa"/>
           </w:tcPr>
           <w:p>
             <w:pPr>
               <w:pStyle w:val="Small"/>
-              <w:cnfStyle w:val="000000010000" w:firstRow="0" w:lastRow="0" w:firstColumn="0" w:lastColumn="0" w:oddVBand="0" w:evenVBand="0" w:oddHBand="0" w:evenHBand="1" w:firstRowFirstColumn="0" w:firstRowLastColumn="0" w:lastRowFirstColumn="0" w:lastRowLastColumn="0"/>
               <w:rPr>
                 <w:rFonts w:ascii="Myriad-Pro, Calibri, Arial" w:hAnsi="Myriad-Pro, Calibri, Arial"/>
                 <w:color w:val="auto"/>
@@ -1209,47 +1243,23 @@
                 <w:rFonts w:ascii="Myriad-Pro, Calibri, Arial" w:hAnsi="Myriad-Pro, Calibri, Arial"/>
                 <w:color w:val="auto"/>
               </w:rPr>
-              <w:t>[i+1].form}</w:t>
-            </w:r>
-          </w:p>
-        </w:tc>
-        <w:tc>
-          <w:tcPr>
-            <w:tcW w:w="1503" w:type="dxa"/>
-          </w:tcPr>
-          <w:p>
-            <w:pPr>
-              <w:pStyle w:val="Small"/>
-              <w:cnfStyle w:val="000000010000" w:firstRow="0" w:lastRow="0" w:firstColumn="0" w:lastColumn="0" w:oddVBand="0" w:evenVBand="0" w:oddHBand="0" w:evenHBand="1" w:firstRowFirstColumn="0" w:firstRowLastColumn="0" w:lastRowFirstColumn="0" w:lastRowLastColumn="0"/>
-              <w:rPr>
-                <w:rFonts w:ascii="Myriad-Pro, Calibri, Arial" w:hAnsi="Myriad-Pro, Calibri, Arial"/>
-                <w:color w:val="auto"/>
-              </w:rPr>
-            </w:pPr>
-            <w:r>
-              <w:rPr>
-                <w:rFonts w:ascii="Myriad-Pro, Calibri, Arial" w:hAnsi="Myriad-Pro, Calibri, Arial"/>
-                <w:color w:val="auto"/>
-              </w:rPr>
-              <w:t>{</w:t>
-            </w:r>
-            <w:proofErr w:type="spellStart"/>
-            <w:proofErr w:type="gramStart"/>
-            <w:r>
-              <w:rPr>
-                <w:rFonts w:ascii="Myriad-Pro, Calibri, Arial" w:hAnsi="Myriad-Pro, Calibri, Arial"/>
-                <w:color w:val="auto"/>
-              </w:rPr>
-              <w:t>d.records</w:t>
-            </w:r>
-            <w:proofErr w:type="spellEnd"/>
-            <w:proofErr w:type="gramEnd"/>
-            <w:r>
-              <w:rPr>
-                <w:rFonts w:ascii="Myriad-Pro, Calibri, Arial" w:hAnsi="Myriad-Pro, Calibri, Arial"/>
-                <w:color w:val="auto"/>
-              </w:rPr>
-              <w:t>[i+1].manufacturer}</w:t>
+              <w:t>[i+1</w:t>
+            </w:r>
+            <w:proofErr w:type="gramStart"/>
+            <w:r>
+              <w:rPr>
+                <w:rFonts w:ascii="Myriad-Pro, Calibri, Arial" w:hAnsi="Myriad-Pro, Calibri, Arial"/>
+                <w:color w:val="auto"/>
+              </w:rPr>
+              <w:t>].manufacturer</w:t>
+            </w:r>
+            <w:proofErr w:type="gramEnd"/>
+            <w:r>
+              <w:rPr>
+                <w:rFonts w:ascii="Myriad-Pro, Calibri, Arial" w:hAnsi="Myriad-Pro, Calibri, Arial"/>
+                <w:color w:val="auto"/>
+              </w:rPr>
+              <w:t>}</w:t>
             </w:r>
           </w:p>
         </w:tc>
@@ -1271,21 +1281,12 @@
         <w:t>{</w:t>
       </w:r>
       <w:proofErr w:type="spellStart"/>
-      <w:proofErr w:type="gramStart"/>
       <w:r>
         <w:rPr>
           <w:rFonts w:ascii="Myriad-Pro, Calibri, Arial" w:hAnsi="Myriad-Pro, Calibri, Arial"/>
           <w:color w:val="000000" w:themeColor="text1"/>
         </w:rPr>
-        <w:t>d.records</w:t>
-      </w:r>
-      <w:proofErr w:type="gramEnd"/>
-      <w:r>
-        <w:rPr>
-          <w:rFonts w:ascii="Myriad-Pro, Calibri, Arial" w:hAnsi="Myriad-Pro, Calibri, Arial"/>
-          <w:color w:val="000000" w:themeColor="text1"/>
-        </w:rPr>
-        <w:t>:ifEM</w:t>
+        <w:t>d.records:ifEM</w:t>
       </w:r>
       <w:proofErr w:type="spellEnd"/>
       <w:r>
@@ -1312,12 +1313,21 @@
         <w:t>}No records found.{</w:t>
       </w:r>
       <w:proofErr w:type="spellStart"/>
+      <w:proofErr w:type="gramStart"/>
       <w:r>
         <w:rPr>
           <w:rFonts w:ascii="Myriad-Pro, Calibri, Arial" w:hAnsi="Myriad-Pro, Calibri, Arial"/>
           <w:color w:val="000000" w:themeColor="text1"/>
         </w:rPr>
-        <w:t>d.records:showEnd</w:t>
+        <w:t>d.records</w:t>
+      </w:r>
+      <w:proofErr w:type="gramEnd"/>
+      <w:r>
+        <w:rPr>
+          <w:rFonts w:ascii="Myriad-Pro, Calibri, Arial" w:hAnsi="Myriad-Pro, Calibri, Arial"/>
+          <w:color w:val="000000" w:themeColor="text1"/>
+        </w:rPr>
+        <w:t>:showEnd</w:t>
       </w:r>
       <w:proofErr w:type="spellEnd"/>
       <w:r>
@@ -1342,7 +1352,7 @@
 </file>
 
 <file path=word/endnotes.xml><?xml version="1.0" encoding="utf-8"?>
-<w:endnotes xmlns:wpc="http://schemas.microsoft.com/office/word/2010/wordprocessingCanvas" xmlns:cx="http://schemas.microsoft.com/office/drawing/2014/chartex" xmlns:cx1="http://schemas.microsoft.com/office/drawing/2015/9/8/chartex" xmlns:cx2="http://schemas.microsoft.com/office/drawing/2015/10/21/chartex" xmlns:cx3="http://schemas.microsoft.com/office/drawing/2016/5/9/chartex" xmlns:cx4="http://schemas.microsoft.com/office/drawing/2016/5/10/chartex" xmlns:cx5="http://schemas.microsoft.com/office/drawing/2016/5/11/chartex" xmlns:cx6="http://schemas.microsoft.com/office/drawing/2016/5/12/chartex" xmlns:cx7="http://schemas.microsoft.com/office/drawing/2016/5/13/chartex" xmlns:cx8="http://schemas.microsoft.com/office/drawing/2016/5/14/chartex" xmlns:mc="http://schemas.openxmlformats.org/markup-compatibility/2006" xmlns:aink="http://schemas.microsoft.com/office/drawing/2016/ink" xmlns:am3d="http://schemas.microsoft.com/office/drawing/2017/model3d" xmlns:o="urn:schemas-microsoft-com:office:office" xmlns:oel="http://schemas.microsoft.com/office/2019/extlst" xmlns:r="http://schemas.openxmlformats.org/officeDocument/2006/relationships" xmlns:m="http://schemas.openxmlformats.org/officeDocument/2006/math" xmlns:v="urn:schemas-microsoft-com:vml" xmlns:wp14="http://schemas.microsoft.com/office/word/2010/wordprocessingDrawing" xmlns:wp="http://schemas.openxmlformats.org/drawingml/2006/wordprocessingDrawing" xmlns:w10="urn:schemas-microsoft-com:office:word" xmlns:w="http://schemas.openxmlformats.org/wordprocessingml/2006/main" xmlns:w14="http://schemas.microsoft.com/office/word/2010/wordml" xmlns:w15="http://schemas.microsoft.com/office/word/2012/wordml" xmlns:w16cex="http://schemas.microsoft.com/office/word/2018/wordml/cex" xmlns:w16cid="http://schemas.microsoft.com/office/word/2016/wordml/cid" xmlns:w16="http://schemas.microsoft.com/office/word/2018/wordml" xmlns:w16du="http://schemas.microsoft.com/office/word/2023/wordml/word16du" xmlns:w16sdtdh="http://schemas.microsoft.com/office/word/2020/wordml/sdtdatahash" xmlns:w16se="http://schemas.microsoft.com/office/word/2015/wordml/symex" xmlns:wpg="http://schemas.microsoft.com/office/word/2010/wordprocessingGroup" xmlns:wpi="http://schemas.microsoft.com/office/word/2010/wordprocessingInk" xmlns:wne="http://schemas.microsoft.com/office/word/2006/wordml" xmlns:wps="http://schemas.microsoft.com/office/word/2010/wordprocessingShape" mc:Ignorable="w14 w15 w16se w16cid w16 w16cex w16sdtdh w16du wp14">
+<w:endnotes xmlns:wpc="http://schemas.microsoft.com/office/word/2010/wordprocessingCanvas" xmlns:cx="http://schemas.microsoft.com/office/drawing/2014/chartex" xmlns:cx1="http://schemas.microsoft.com/office/drawing/2015/9/8/chartex" xmlns:cx2="http://schemas.microsoft.com/office/drawing/2015/10/21/chartex" xmlns:cx3="http://schemas.microsoft.com/office/drawing/2016/5/9/chartex" xmlns:cx4="http://schemas.microsoft.com/office/drawing/2016/5/10/chartex" xmlns:cx5="http://schemas.microsoft.com/office/drawing/2016/5/11/chartex" xmlns:cx6="http://schemas.microsoft.com/office/drawing/2016/5/12/chartex" xmlns:cx7="http://schemas.microsoft.com/office/drawing/2016/5/13/chartex" xmlns:cx8="http://schemas.microsoft.com/office/drawing/2016/5/14/chartex" xmlns:mc="http://schemas.openxmlformats.org/markup-compatibility/2006" xmlns:aink="http://schemas.microsoft.com/office/drawing/2016/ink" xmlns:am3d="http://schemas.microsoft.com/office/drawing/2017/model3d" xmlns:o="urn:schemas-microsoft-com:office:office" xmlns:oel="http://schemas.microsoft.com/office/2019/extlst" xmlns:r="http://schemas.openxmlformats.org/officeDocument/2006/relationships" xmlns:m="http://schemas.openxmlformats.org/officeDocument/2006/math" xmlns:v="urn:schemas-microsoft-com:vml" xmlns:wp14="http://schemas.microsoft.com/office/word/2010/wordprocessingDrawing" xmlns:wp="http://schemas.openxmlformats.org/drawingml/2006/wordprocessingDrawing" xmlns:w10="urn:schemas-microsoft-com:office:word" xmlns:w="http://schemas.openxmlformats.org/wordprocessingml/2006/main" xmlns:w14="http://schemas.microsoft.com/office/word/2010/wordml" xmlns:w15="http://schemas.microsoft.com/office/word/2012/wordml" xmlns:w16cex="http://schemas.microsoft.com/office/word/2018/wordml/cex" xmlns:w16cid="http://schemas.microsoft.com/office/word/2016/wordml/cid" xmlns:w16="http://schemas.microsoft.com/office/word/2018/wordml" xmlns:w16du="http://schemas.microsoft.com/office/word/2023/wordml/word16du" xmlns:w16sdtdh="http://schemas.microsoft.com/office/word/2020/wordml/sdtdatahash" xmlns:w16sdtfl="http://schemas.microsoft.com/office/word/2024/wordml/sdtformatlock" xmlns:w16se="http://schemas.microsoft.com/office/word/2015/wordml/symex" xmlns:wpg="http://schemas.microsoft.com/office/word/2010/wordprocessingGroup" xmlns:wpi="http://schemas.microsoft.com/office/word/2010/wordprocessingInk" xmlns:wne="http://schemas.microsoft.com/office/word/2006/wordml" xmlns:wps="http://schemas.microsoft.com/office/word/2010/wordprocessingShape" mc:Ignorable="w14 w15 w16se w16cid w16 w16cex w16sdtdh w16sdtfl w16du wp14">
   <w:endnote w:type="separator" w:id="-1">
     <w:p>
       <w:r>
@@ -1361,7 +1371,7 @@
 </file>
 
 <file path=word/footer1.xml><?xml version="1.0" encoding="utf-8"?>
-<w:ftr xmlns:wpc="http://schemas.microsoft.com/office/word/2010/wordprocessingCanvas" xmlns:cx="http://schemas.microsoft.com/office/drawing/2014/chartex" xmlns:cx1="http://schemas.microsoft.com/office/drawing/2015/9/8/chartex" xmlns:cx2="http://schemas.microsoft.com/office/drawing/2015/10/21/chartex" xmlns:cx3="http://schemas.microsoft.com/office/drawing/2016/5/9/chartex" xmlns:cx4="http://schemas.microsoft.com/office/drawing/2016/5/10/chartex" xmlns:cx5="http://schemas.microsoft.com/office/drawing/2016/5/11/chartex" xmlns:cx6="http://schemas.microsoft.com/office/drawing/2016/5/12/chartex" xmlns:cx7="http://schemas.microsoft.com/office/drawing/2016/5/13/chartex" xmlns:cx8="http://schemas.microsoft.com/office/drawing/2016/5/14/chartex" xmlns:mc="http://schemas.openxmlformats.org/markup-compatibility/2006" xmlns:aink="http://schemas.microsoft.com/office/drawing/2016/ink" xmlns:am3d="http://schemas.microsoft.com/office/drawing/2017/model3d" xmlns:o="urn:schemas-microsoft-com:office:office" xmlns:oel="http://schemas.microsoft.com/office/2019/extlst" xmlns:r="http://schemas.openxmlformats.org/officeDocument/2006/relationships" xmlns:m="http://schemas.openxmlformats.org/officeDocument/2006/math" xmlns:v="urn:schemas-microsoft-com:vml" xmlns:wp14="http://schemas.microsoft.com/office/word/2010/wordprocessingDrawing" xmlns:wp="http://schemas.openxmlformats.org/drawingml/2006/wordprocessingDrawing" xmlns:w10="urn:schemas-microsoft-com:office:word" xmlns:w="http://schemas.openxmlformats.org/wordprocessingml/2006/main" xmlns:w14="http://schemas.microsoft.com/office/word/2010/wordml" xmlns:w15="http://schemas.microsoft.com/office/word/2012/wordml" xmlns:w16cex="http://schemas.microsoft.com/office/word/2018/wordml/cex" xmlns:w16cid="http://schemas.microsoft.com/office/word/2016/wordml/cid" xmlns:w16="http://schemas.microsoft.com/office/word/2018/wordml" xmlns:w16du="http://schemas.microsoft.com/office/word/2023/wordml/word16du" xmlns:w16sdtdh="http://schemas.microsoft.com/office/word/2020/wordml/sdtdatahash" xmlns:w16se="http://schemas.microsoft.com/office/word/2015/wordml/symex" xmlns:wpg="http://schemas.microsoft.com/office/word/2010/wordprocessingGroup" xmlns:wpi="http://schemas.microsoft.com/office/word/2010/wordprocessingInk" xmlns:wne="http://schemas.microsoft.com/office/word/2006/wordml" xmlns:wps="http://schemas.microsoft.com/office/word/2010/wordprocessingShape" mc:Ignorable="w14 w15 w16se w16cid w16 w16cex w16sdtdh w16du wp14">
+<w:ftr xmlns:wpc="http://schemas.microsoft.com/office/word/2010/wordprocessingCanvas" xmlns:cx="http://schemas.microsoft.com/office/drawing/2014/chartex" xmlns:cx1="http://schemas.microsoft.com/office/drawing/2015/9/8/chartex" xmlns:cx2="http://schemas.microsoft.com/office/drawing/2015/10/21/chartex" xmlns:cx3="http://schemas.microsoft.com/office/drawing/2016/5/9/chartex" xmlns:cx4="http://schemas.microsoft.com/office/drawing/2016/5/10/chartex" xmlns:cx5="http://schemas.microsoft.com/office/drawing/2016/5/11/chartex" xmlns:cx6="http://schemas.microsoft.com/office/drawing/2016/5/12/chartex" xmlns:cx7="http://schemas.microsoft.com/office/drawing/2016/5/13/chartex" xmlns:cx8="http://schemas.microsoft.com/office/drawing/2016/5/14/chartex" xmlns:mc="http://schemas.openxmlformats.org/markup-compatibility/2006" xmlns:aink="http://schemas.microsoft.com/office/drawing/2016/ink" xmlns:am3d="http://schemas.microsoft.com/office/drawing/2017/model3d" xmlns:o="urn:schemas-microsoft-com:office:office" xmlns:oel="http://schemas.microsoft.com/office/2019/extlst" xmlns:r="http://schemas.openxmlformats.org/officeDocument/2006/relationships" xmlns:m="http://schemas.openxmlformats.org/officeDocument/2006/math" xmlns:v="urn:schemas-microsoft-com:vml" xmlns:wp14="http://schemas.microsoft.com/office/word/2010/wordprocessingDrawing" xmlns:wp="http://schemas.openxmlformats.org/drawingml/2006/wordprocessingDrawing" xmlns:w10="urn:schemas-microsoft-com:office:word" xmlns:w="http://schemas.openxmlformats.org/wordprocessingml/2006/main" xmlns:w14="http://schemas.microsoft.com/office/word/2010/wordml" xmlns:w15="http://schemas.microsoft.com/office/word/2012/wordml" xmlns:w16cex="http://schemas.microsoft.com/office/word/2018/wordml/cex" xmlns:w16cid="http://schemas.microsoft.com/office/word/2016/wordml/cid" xmlns:w16="http://schemas.microsoft.com/office/word/2018/wordml" xmlns:w16du="http://schemas.microsoft.com/office/word/2023/wordml/word16du" xmlns:w16sdtdh="http://schemas.microsoft.com/office/word/2020/wordml/sdtdatahash" xmlns:w16sdtfl="http://schemas.microsoft.com/office/word/2024/wordml/sdtformatlock" xmlns:w16se="http://schemas.microsoft.com/office/word/2015/wordml/symex" xmlns:wpg="http://schemas.microsoft.com/office/word/2010/wordprocessingGroup" xmlns:wpi="http://schemas.microsoft.com/office/word/2010/wordprocessingInk" xmlns:wne="http://schemas.microsoft.com/office/word/2006/wordml" xmlns:wps="http://schemas.microsoft.com/office/word/2010/wordprocessingShape" mc:Ignorable="w14 w15 w16se w16cid w16 w16cex w16sdtdh w16sdtfl w16du wp14">
   <w:p>
     <w:pPr>
       <w:pStyle w:val="Footer"/>
@@ -1372,7 +1382,7 @@
 </file>
 
 <file path=word/footer2.xml><?xml version="1.0" encoding="utf-8"?>
-<w:ftr xmlns:wpc="http://schemas.microsoft.com/office/word/2010/wordprocessingCanvas" xmlns:cx="http://schemas.microsoft.com/office/drawing/2014/chartex" xmlns:cx1="http://schemas.microsoft.com/office/drawing/2015/9/8/chartex" xmlns:cx2="http://schemas.microsoft.com/office/drawing/2015/10/21/chartex" xmlns:cx3="http://schemas.microsoft.com/office/drawing/2016/5/9/chartex" xmlns:cx4="http://schemas.microsoft.com/office/drawing/2016/5/10/chartex" xmlns:cx5="http://schemas.microsoft.com/office/drawing/2016/5/11/chartex" xmlns:cx6="http://schemas.microsoft.com/office/drawing/2016/5/12/chartex" xmlns:cx7="http://schemas.microsoft.com/office/drawing/2016/5/13/chartex" xmlns:cx8="http://schemas.microsoft.com/office/drawing/2016/5/14/chartex" xmlns:mc="http://schemas.openxmlformats.org/markup-compatibility/2006" xmlns:aink="http://schemas.microsoft.com/office/drawing/2016/ink" xmlns:am3d="http://schemas.microsoft.com/office/drawing/2017/model3d" xmlns:o="urn:schemas-microsoft-com:office:office" xmlns:oel="http://schemas.microsoft.com/office/2019/extlst" xmlns:r="http://schemas.openxmlformats.org/officeDocument/2006/relationships" xmlns:m="http://schemas.openxmlformats.org/officeDocument/2006/math" xmlns:v="urn:schemas-microsoft-com:vml" xmlns:wp14="http://schemas.microsoft.com/office/word/2010/wordprocessingDrawing" xmlns:wp="http://schemas.openxmlformats.org/drawingml/2006/wordprocessingDrawing" xmlns:w10="urn:schemas-microsoft-com:office:word" xmlns:w="http://schemas.openxmlformats.org/wordprocessingml/2006/main" xmlns:w14="http://schemas.microsoft.com/office/word/2010/wordml" xmlns:w15="http://schemas.microsoft.com/office/word/2012/wordml" xmlns:w16cex="http://schemas.microsoft.com/office/word/2018/wordml/cex" xmlns:w16cid="http://schemas.microsoft.com/office/word/2016/wordml/cid" xmlns:w16="http://schemas.microsoft.com/office/word/2018/wordml" xmlns:w16du="http://schemas.microsoft.com/office/word/2023/wordml/word16du" xmlns:w16sdtdh="http://schemas.microsoft.com/office/word/2020/wordml/sdtdatahash" xmlns:w16se="http://schemas.microsoft.com/office/word/2015/wordml/symex" xmlns:wpg="http://schemas.microsoft.com/office/word/2010/wordprocessingGroup" xmlns:wpi="http://schemas.microsoft.com/office/word/2010/wordprocessingInk" xmlns:wne="http://schemas.microsoft.com/office/word/2006/wordml" xmlns:wps="http://schemas.microsoft.com/office/word/2010/wordprocessingShape" mc:Ignorable="w14 w15 w16se w16cid w16 w16cex w16sdtdh w16du wp14">
+<w:ftr xmlns:wpc="http://schemas.microsoft.com/office/word/2010/wordprocessingCanvas" xmlns:cx="http://schemas.microsoft.com/office/drawing/2014/chartex" xmlns:cx1="http://schemas.microsoft.com/office/drawing/2015/9/8/chartex" xmlns:cx2="http://schemas.microsoft.com/office/drawing/2015/10/21/chartex" xmlns:cx3="http://schemas.microsoft.com/office/drawing/2016/5/9/chartex" xmlns:cx4="http://schemas.microsoft.com/office/drawing/2016/5/10/chartex" xmlns:cx5="http://schemas.microsoft.com/office/drawing/2016/5/11/chartex" xmlns:cx6="http://schemas.microsoft.com/office/drawing/2016/5/12/chartex" xmlns:cx7="http://schemas.microsoft.com/office/drawing/2016/5/13/chartex" xmlns:cx8="http://schemas.microsoft.com/office/drawing/2016/5/14/chartex" xmlns:mc="http://schemas.openxmlformats.org/markup-compatibility/2006" xmlns:aink="http://schemas.microsoft.com/office/drawing/2016/ink" xmlns:am3d="http://schemas.microsoft.com/office/drawing/2017/model3d" xmlns:o="urn:schemas-microsoft-com:office:office" xmlns:oel="http://schemas.microsoft.com/office/2019/extlst" xmlns:r="http://schemas.openxmlformats.org/officeDocument/2006/relationships" xmlns:m="http://schemas.openxmlformats.org/officeDocument/2006/math" xmlns:v="urn:schemas-microsoft-com:vml" xmlns:wp14="http://schemas.microsoft.com/office/word/2010/wordprocessingDrawing" xmlns:wp="http://schemas.openxmlformats.org/drawingml/2006/wordprocessingDrawing" xmlns:w10="urn:schemas-microsoft-com:office:word" xmlns:w="http://schemas.openxmlformats.org/wordprocessingml/2006/main" xmlns:w14="http://schemas.microsoft.com/office/word/2010/wordml" xmlns:w15="http://schemas.microsoft.com/office/word/2012/wordml" xmlns:w16cex="http://schemas.microsoft.com/office/word/2018/wordml/cex" xmlns:w16cid="http://schemas.microsoft.com/office/word/2016/wordml/cid" xmlns:w16="http://schemas.microsoft.com/office/word/2018/wordml" xmlns:w16du="http://schemas.microsoft.com/office/word/2023/wordml/word16du" xmlns:w16sdtdh="http://schemas.microsoft.com/office/word/2020/wordml/sdtdatahash" xmlns:w16sdtfl="http://schemas.microsoft.com/office/word/2024/wordml/sdtformatlock" xmlns:w16se="http://schemas.microsoft.com/office/word/2015/wordml/symex" xmlns:wpg="http://schemas.microsoft.com/office/word/2010/wordprocessingGroup" xmlns:wpi="http://schemas.microsoft.com/office/word/2010/wordprocessingInk" xmlns:wne="http://schemas.microsoft.com/office/word/2006/wordml" xmlns:wps="http://schemas.microsoft.com/office/word/2010/wordprocessingShape" mc:Ignorable="w14 w15 w16se w16cid w16 w16cex w16sdtdh w16sdtfl w16du wp14">
   <w:sdt>
     <w:sdtPr>
       <w:id w:val="-786121602"/>
@@ -1404,27 +1414,11 @@
           </w:rPr>
           <w:t xml:space="preserve"> {</w:t>
         </w:r>
-        <w:proofErr w:type="spellStart"/>
-        <w:proofErr w:type="gramStart"/>
         <w:r>
           <w:rPr>
             <w:rFonts w:ascii="Myriad-Pro, Calibri, Arial" w:hAnsi="Myriad-Pro, Calibri, Arial"/>
           </w:rPr>
-          <w:t>d.header</w:t>
-        </w:r>
-        <w:proofErr w:type="gramEnd"/>
-        <w:r>
-          <w:rPr>
-            <w:rFonts w:ascii="Myriad-Pro, Calibri, Arial" w:hAnsi="Myriad-Pro, Calibri, Arial"/>
-          </w:rPr>
-          <w:t>.datePrinted</w:t>
-        </w:r>
-        <w:proofErr w:type="spellEnd"/>
-        <w:r>
-          <w:rPr>
-            <w:rFonts w:ascii="Myriad-Pro, Calibri, Arial" w:hAnsi="Myriad-Pro, Calibri, Arial"/>
-          </w:rPr>
-          <w:t>}</w:t>
+          <w:t>d.header.datePrinted}</w:t>
         </w:r>
         <w:r>
           <w:rPr>
@@ -1523,7 +1517,7 @@
 </file>
 
 <file path=word/footnotes.xml><?xml version="1.0" encoding="utf-8"?>
-<w:footnotes xmlns:wpc="http://schemas.microsoft.com/office/word/2010/wordprocessingCanvas" xmlns:cx="http://schemas.microsoft.com/office/drawing/2014/chartex" xmlns:cx1="http://schemas.microsoft.com/office/drawing/2015/9/8/chartex" xmlns:cx2="http://schemas.microsoft.com/office/drawing/2015/10/21/chartex" xmlns:cx3="http://schemas.microsoft.com/office/drawing/2016/5/9/chartex" xmlns:cx4="http://schemas.microsoft.com/office/drawing/2016/5/10/chartex" xmlns:cx5="http://schemas.microsoft.com/office/drawing/2016/5/11/chartex" xmlns:cx6="http://schemas.microsoft.com/office/drawing/2016/5/12/chartex" xmlns:cx7="http://schemas.microsoft.com/office/drawing/2016/5/13/chartex" xmlns:cx8="http://schemas.microsoft.com/office/drawing/2016/5/14/chartex" xmlns:mc="http://schemas.openxmlformats.org/markup-compatibility/2006" xmlns:aink="http://schemas.microsoft.com/office/drawing/2016/ink" xmlns:am3d="http://schemas.microsoft.com/office/drawing/2017/model3d" xmlns:o="urn:schemas-microsoft-com:office:office" xmlns:oel="http://schemas.microsoft.com/office/2019/extlst" xmlns:r="http://schemas.openxmlformats.org/officeDocument/2006/relationships" xmlns:m="http://schemas.openxmlformats.org/officeDocument/2006/math" xmlns:v="urn:schemas-microsoft-com:vml" xmlns:wp14="http://schemas.microsoft.com/office/word/2010/wordprocessingDrawing" xmlns:wp="http://schemas.openxmlformats.org/drawingml/2006/wordprocessingDrawing" xmlns:w10="urn:schemas-microsoft-com:office:word" xmlns:w="http://schemas.openxmlformats.org/wordprocessingml/2006/main" xmlns:w14="http://schemas.microsoft.com/office/word/2010/wordml" xmlns:w15="http://schemas.microsoft.com/office/word/2012/wordml" xmlns:w16cex="http://schemas.microsoft.com/office/word/2018/wordml/cex" xmlns:w16cid="http://schemas.microsoft.com/office/word/2016/wordml/cid" xmlns:w16="http://schemas.microsoft.com/office/word/2018/wordml" xmlns:w16du="http://schemas.microsoft.com/office/word/2023/wordml/word16du" xmlns:w16sdtdh="http://schemas.microsoft.com/office/word/2020/wordml/sdtdatahash" xmlns:w16se="http://schemas.microsoft.com/office/word/2015/wordml/symex" xmlns:wpg="http://schemas.microsoft.com/office/word/2010/wordprocessingGroup" xmlns:wpi="http://schemas.microsoft.com/office/word/2010/wordprocessingInk" xmlns:wne="http://schemas.microsoft.com/office/word/2006/wordml" xmlns:wps="http://schemas.microsoft.com/office/word/2010/wordprocessingShape" mc:Ignorable="w14 w15 w16se w16cid w16 w16cex w16sdtdh w16du wp14">
+<w:footnotes xmlns:wpc="http://schemas.microsoft.com/office/word/2010/wordprocessingCanvas" xmlns:cx="http://schemas.microsoft.com/office/drawing/2014/chartex" xmlns:cx1="http://schemas.microsoft.com/office/drawing/2015/9/8/chartex" xmlns:cx2="http://schemas.microsoft.com/office/drawing/2015/10/21/chartex" xmlns:cx3="http://schemas.microsoft.com/office/drawing/2016/5/9/chartex" xmlns:cx4="http://schemas.microsoft.com/office/drawing/2016/5/10/chartex" xmlns:cx5="http://schemas.microsoft.com/office/drawing/2016/5/11/chartex" xmlns:cx6="http://schemas.microsoft.com/office/drawing/2016/5/12/chartex" xmlns:cx7="http://schemas.microsoft.com/office/drawing/2016/5/13/chartex" xmlns:cx8="http://schemas.microsoft.com/office/drawing/2016/5/14/chartex" xmlns:mc="http://schemas.openxmlformats.org/markup-compatibility/2006" xmlns:aink="http://schemas.microsoft.com/office/drawing/2016/ink" xmlns:am3d="http://schemas.microsoft.com/office/drawing/2017/model3d" xmlns:o="urn:schemas-microsoft-com:office:office" xmlns:oel="http://schemas.microsoft.com/office/2019/extlst" xmlns:r="http://schemas.openxmlformats.org/officeDocument/2006/relationships" xmlns:m="http://schemas.openxmlformats.org/officeDocument/2006/math" xmlns:v="urn:schemas-microsoft-com:vml" xmlns:wp14="http://schemas.microsoft.com/office/word/2010/wordprocessingDrawing" xmlns:wp="http://schemas.openxmlformats.org/drawingml/2006/wordprocessingDrawing" xmlns:w10="urn:schemas-microsoft-com:office:word" xmlns:w="http://schemas.openxmlformats.org/wordprocessingml/2006/main" xmlns:w14="http://schemas.microsoft.com/office/word/2010/wordml" xmlns:w15="http://schemas.microsoft.com/office/word/2012/wordml" xmlns:w16cex="http://schemas.microsoft.com/office/word/2018/wordml/cex" xmlns:w16cid="http://schemas.microsoft.com/office/word/2016/wordml/cid" xmlns:w16="http://schemas.microsoft.com/office/word/2018/wordml" xmlns:w16du="http://schemas.microsoft.com/office/word/2023/wordml/word16du" xmlns:w16sdtdh="http://schemas.microsoft.com/office/word/2020/wordml/sdtdatahash" xmlns:w16sdtfl="http://schemas.microsoft.com/office/word/2024/wordml/sdtformatlock" xmlns:w16se="http://schemas.microsoft.com/office/word/2015/wordml/symex" xmlns:wpg="http://schemas.microsoft.com/office/word/2010/wordprocessingGroup" xmlns:wpi="http://schemas.microsoft.com/office/word/2010/wordprocessingInk" xmlns:wne="http://schemas.microsoft.com/office/word/2006/wordml" xmlns:wps="http://schemas.microsoft.com/office/word/2010/wordprocessingShape" mc:Ignorable="w14 w15 w16se w16cid w16 w16cex w16sdtdh w16sdtfl w16du wp14">
   <w:footnote w:type="separator" w:id="-1">
     <w:p>
       <w:r>
@@ -1542,7 +1536,7 @@
 </file>
 
 <file path=word/header1.xml><?xml version="1.0" encoding="utf-8"?>
-<w:hdr xmlns:wpc="http://schemas.microsoft.com/office/word/2010/wordprocessingCanvas" xmlns:cx="http://schemas.microsoft.com/office/drawing/2014/chartex" xmlns:cx1="http://schemas.microsoft.com/office/drawing/2015/9/8/chartex" xmlns:cx2="http://schemas.microsoft.com/office/drawing/2015/10/21/chartex" xmlns:cx3="http://schemas.microsoft.com/office/drawing/2016/5/9/chartex" xmlns:cx4="http://schemas.microsoft.com/office/drawing/2016/5/10/chartex" xmlns:cx5="http://schemas.microsoft.com/office/drawing/2016/5/11/chartex" xmlns:cx6="http://schemas.microsoft.com/office/drawing/2016/5/12/chartex" xmlns:cx7="http://schemas.microsoft.com/office/drawing/2016/5/13/chartex" xmlns:cx8="http://schemas.microsoft.com/office/drawing/2016/5/14/chartex" xmlns:mc="http://schemas.openxmlformats.org/markup-compatibility/2006" xmlns:aink="http://schemas.microsoft.com/office/drawing/2016/ink" xmlns:am3d="http://schemas.microsoft.com/office/drawing/2017/model3d" xmlns:o="urn:schemas-microsoft-com:office:office" xmlns:oel="http://schemas.microsoft.com/office/2019/extlst" xmlns:r="http://schemas.openxmlformats.org/officeDocument/2006/relationships" xmlns:m="http://schemas.openxmlformats.org/officeDocument/2006/math" xmlns:v="urn:schemas-microsoft-com:vml" xmlns:wp14="http://schemas.microsoft.com/office/word/2010/wordprocessingDrawing" xmlns:wp="http://schemas.openxmlformats.org/drawingml/2006/wordprocessingDrawing" xmlns:w10="urn:schemas-microsoft-com:office:word" xmlns:w="http://schemas.openxmlformats.org/wordprocessingml/2006/main" xmlns:w14="http://schemas.microsoft.com/office/word/2010/wordml" xmlns:w15="http://schemas.microsoft.com/office/word/2012/wordml" xmlns:w16cex="http://schemas.microsoft.com/office/word/2018/wordml/cex" xmlns:w16cid="http://schemas.microsoft.com/office/word/2016/wordml/cid" xmlns:w16="http://schemas.microsoft.com/office/word/2018/wordml" xmlns:w16du="http://schemas.microsoft.com/office/word/2023/wordml/word16du" xmlns:w16sdtdh="http://schemas.microsoft.com/office/word/2020/wordml/sdtdatahash" xmlns:w16se="http://schemas.microsoft.com/office/word/2015/wordml/symex" xmlns:wpg="http://schemas.microsoft.com/office/word/2010/wordprocessingGroup" xmlns:wpi="http://schemas.microsoft.com/office/word/2010/wordprocessingInk" xmlns:wne="http://schemas.microsoft.com/office/word/2006/wordml" xmlns:wps="http://schemas.microsoft.com/office/word/2010/wordprocessingShape" mc:Ignorable="w14 w15 w16se w16cid w16 w16cex w16sdtdh w16du wp14">
+<w:hdr xmlns:wpc="http://schemas.microsoft.com/office/word/2010/wordprocessingCanvas" xmlns:cx="http://schemas.microsoft.com/office/drawing/2014/chartex" xmlns:cx1="http://schemas.microsoft.com/office/drawing/2015/9/8/chartex" xmlns:cx2="http://schemas.microsoft.com/office/drawing/2015/10/21/chartex" xmlns:cx3="http://schemas.microsoft.com/office/drawing/2016/5/9/chartex" xmlns:cx4="http://schemas.microsoft.com/office/drawing/2016/5/10/chartex" xmlns:cx5="http://schemas.microsoft.com/office/drawing/2016/5/11/chartex" xmlns:cx6="http://schemas.microsoft.com/office/drawing/2016/5/12/chartex" xmlns:cx7="http://schemas.microsoft.com/office/drawing/2016/5/13/chartex" xmlns:cx8="http://schemas.microsoft.com/office/drawing/2016/5/14/chartex" xmlns:mc="http://schemas.openxmlformats.org/markup-compatibility/2006" xmlns:aink="http://schemas.microsoft.com/office/drawing/2016/ink" xmlns:am3d="http://schemas.microsoft.com/office/drawing/2017/model3d" xmlns:o="urn:schemas-microsoft-com:office:office" xmlns:oel="http://schemas.microsoft.com/office/2019/extlst" xmlns:r="http://schemas.openxmlformats.org/officeDocument/2006/relationships" xmlns:m="http://schemas.openxmlformats.org/officeDocument/2006/math" xmlns:v="urn:schemas-microsoft-com:vml" xmlns:wp14="http://schemas.microsoft.com/office/word/2010/wordprocessingDrawing" xmlns:wp="http://schemas.openxmlformats.org/drawingml/2006/wordprocessingDrawing" xmlns:w10="urn:schemas-microsoft-com:office:word" xmlns:w="http://schemas.openxmlformats.org/wordprocessingml/2006/main" xmlns:w14="http://schemas.microsoft.com/office/word/2010/wordml" xmlns:w15="http://schemas.microsoft.com/office/word/2012/wordml" xmlns:w16cex="http://schemas.microsoft.com/office/word/2018/wordml/cex" xmlns:w16cid="http://schemas.microsoft.com/office/word/2016/wordml/cid" xmlns:w16="http://schemas.microsoft.com/office/word/2018/wordml" xmlns:w16du="http://schemas.microsoft.com/office/word/2023/wordml/word16du" xmlns:w16sdtdh="http://schemas.microsoft.com/office/word/2020/wordml/sdtdatahash" xmlns:w16sdtfl="http://schemas.microsoft.com/office/word/2024/wordml/sdtformatlock" xmlns:w16se="http://schemas.microsoft.com/office/word/2015/wordml/symex" xmlns:wpg="http://schemas.microsoft.com/office/word/2010/wordprocessingGroup" xmlns:wpi="http://schemas.microsoft.com/office/word/2010/wordprocessingInk" xmlns:wne="http://schemas.microsoft.com/office/word/2006/wordml" xmlns:wps="http://schemas.microsoft.com/office/word/2010/wordprocessingShape" mc:Ignorable="w14 w15 w16se w16cid w16 w16cex w16sdtdh w16sdtfl w16du wp14">
   <w:tbl>
     <w:tblPr>
       <w:tblStyle w:val="TableGrid"/>
@@ -1654,8 +1648,6 @@
       </w:rPr>
       <w:t>{</w:t>
     </w:r>
-    <w:proofErr w:type="spellStart"/>
-    <w:proofErr w:type="gramStart"/>
     <w:r>
       <w:rPr>
         <w:rFonts w:ascii="Myriad-Pro, Calibri, Arial" w:hAnsi="Myriad-Pro, Calibri, Arial"/>
@@ -1666,14 +1658,7 @@
       <w:rPr>
         <w:rFonts w:ascii="Myriad-Pro, Calibri, Arial" w:hAnsi="Myriad-Pro, Calibri, Arial"/>
       </w:rPr>
-      <w:t>header</w:t>
-    </w:r>
-    <w:proofErr w:type="gramEnd"/>
-    <w:r>
-      <w:rPr>
-        <w:rFonts w:ascii="Myriad-Pro, Calibri, Arial" w:hAnsi="Myriad-Pro, Calibri, Arial"/>
-      </w:rPr>
-      <w:t>.</w:t>
+      <w:t>header.</w:t>
     </w:r>
     <w:r>
       <w:rPr>
@@ -1685,34 +1670,13 @@
       <w:rPr>
         <w:rFonts w:ascii="Myriad-Pro, Calibri, Arial" w:hAnsi="Myriad-Pro, Calibri, Arial"/>
       </w:rPr>
-      <w:t>edacted:ifEQ</w:t>
-    </w:r>
-    <w:proofErr w:type="spellEnd"/>
-    <w:r>
-      <w:rPr>
-        <w:rFonts w:ascii="Myriad-Pro, Calibri, Arial" w:hAnsi="Myriad-Pro, Calibri, Arial"/>
-      </w:rPr>
-      <w:t>(true):</w:t>
-    </w:r>
-    <w:proofErr w:type="spellStart"/>
-    <w:r>
-      <w:rPr>
-        <w:rFonts w:ascii="Myriad-Pro, Calibri, Arial" w:hAnsi="Myriad-Pro, Calibri, Arial"/>
-      </w:rPr>
-      <w:t>show</w:t>
-    </w:r>
-    <w:r>
-      <w:rPr>
-        <w:rFonts w:ascii="Myriad-Pro, Calibri, Arial" w:hAnsi="Myriad-Pro, Calibri, Arial"/>
-      </w:rPr>
-      <w:t>Begin</w:t>
-    </w:r>
-    <w:proofErr w:type="spellEnd"/>
-    <w:r>
-      <w:rPr>
-        <w:rFonts w:ascii="Myriad-Pro, Calibri, Arial" w:hAnsi="Myriad-Pro, Calibri, Arial"/>
-      </w:rPr>
-      <w:t>}(</w:t>
+      <w:t>edacted:ifEQ(true):show</w:t>
+    </w:r>
+    <w:r>
+      <w:rPr>
+        <w:rFonts w:ascii="Myriad-Pro, Calibri, Arial" w:hAnsi="Myriad-Pro, Calibri, Arial"/>
+      </w:rPr>
+      <w:t>Begin}(</w:t>
     </w:r>
     <w:r>
       <w:rPr>
@@ -1732,7 +1696,6 @@
       </w:rPr>
       <w:t xml:space="preserve"> </w:t>
     </w:r>
-    <w:proofErr w:type="spellStart"/>
     <w:r>
       <w:rPr>
         <w:rFonts w:ascii="Myriad-Pro, Calibri, Arial" w:hAnsi="Myriad-Pro, Calibri, Arial"/>
@@ -1749,14 +1712,7 @@
       <w:rPr>
         <w:rFonts w:ascii="Myriad-Pro, Calibri, Arial" w:hAnsi="Myriad-Pro, Calibri, Arial"/>
       </w:rPr>
-      <w:t>edacted:showEnd</w:t>
-    </w:r>
-    <w:proofErr w:type="spellEnd"/>
-    <w:r>
-      <w:rPr>
-        <w:rFonts w:ascii="Myriad-Pro, Calibri, Arial" w:hAnsi="Myriad-Pro, Calibri, Arial"/>
-      </w:rPr>
-      <w:t>}</w:t>
+      <w:t>edacted:showEnd}</w:t>
     </w:r>
   </w:p>
   <w:p>
@@ -1862,14 +1818,7 @@
             <w:rPr>
               <w:rFonts w:ascii="Myriad-Pro, Calibri, Arial" w:hAnsi="Myriad-Pro, Calibri, Arial"/>
             </w:rPr>
-            <w:t xml:space="preserve"> {</w:t>
-          </w:r>
-          <w:proofErr w:type="gramStart"/>
-          <w:r>
-            <w:rPr>
-              <w:rFonts w:ascii="Myriad-Pro, Calibri, Arial" w:hAnsi="Myriad-Pro, Calibri, Arial"/>
-            </w:rPr>
-            <w:t>d.</w:t>
+            <w:t xml:space="preserve"> {d.</w:t>
           </w:r>
           <w:r>
             <w:rPr>
@@ -1881,14 +1830,7 @@
             <w:rPr>
               <w:rFonts w:ascii="Myriad-Pro, Calibri, Arial" w:hAnsi="Myriad-Pro, Calibri, Arial"/>
             </w:rPr>
-            <w:t>name</w:t>
-          </w:r>
-          <w:proofErr w:type="gramEnd"/>
-          <w:r>
-            <w:rPr>
-              <w:rFonts w:ascii="Myriad-Pro, Calibri, Arial" w:hAnsi="Myriad-Pro, Calibri, Arial"/>
-            </w:rPr>
-            <w:t>}</w:t>
+            <w:t>name}</w:t>
           </w:r>
         </w:p>
       </w:tc>
@@ -1914,14 +1856,7 @@
             <w:rPr>
               <w:rFonts w:ascii="Myriad-Pro, Calibri, Arial" w:hAnsi="Myriad-Pro, Calibri, Arial"/>
             </w:rPr>
-            <w:t xml:space="preserve"> {</w:t>
-          </w:r>
-          <w:proofErr w:type="spellStart"/>
-          <w:r>
-            <w:rPr>
-              <w:rFonts w:ascii="Myriad-Pro, Calibri, Arial" w:hAnsi="Myriad-Pro, Calibri, Arial"/>
-            </w:rPr>
-            <w:t>d.</w:t>
+            <w:t xml:space="preserve"> {d.</w:t>
           </w:r>
           <w:r>
             <w:rPr>
@@ -1935,7 +1870,6 @@
             </w:rPr>
             <w:t>.phn</w:t>
           </w:r>
-          <w:proofErr w:type="spellEnd"/>
           <w:r>
             <w:rPr>
               <w:rFonts w:ascii="Myriad-Pro, Calibri, Arial" w:hAnsi="Myriad-Pro, Calibri, Arial"/>
@@ -1966,15 +1900,7 @@
             <w:rPr>
               <w:rFonts w:ascii="Myriad-Pro, Calibri, Arial" w:hAnsi="Myriad-Pro, Calibri, Arial"/>
             </w:rPr>
-            <w:t xml:space="preserve"> {</w:t>
-          </w:r>
-          <w:proofErr w:type="spellStart"/>
-          <w:proofErr w:type="gramStart"/>
-          <w:r>
-            <w:rPr>
-              <w:rFonts w:ascii="Myriad-Pro, Calibri, Arial" w:hAnsi="Myriad-Pro, Calibri, Arial"/>
-            </w:rPr>
-            <w:t>d</w:t>
+            <w:t xml:space="preserve"> {d</w:t>
           </w:r>
           <w:r>
             <w:rPr>
@@ -1988,14 +1914,12 @@
             </w:rPr>
             <w:t>header</w:t>
           </w:r>
-          <w:proofErr w:type="gramEnd"/>
           <w:r>
             <w:rPr>
               <w:rFonts w:ascii="Myriad-Pro, Calibri, Arial" w:hAnsi="Myriad-Pro, Calibri, Arial"/>
             </w:rPr>
             <w:t>.dateOfBirth</w:t>
           </w:r>
-          <w:proofErr w:type="spellEnd"/>
           <w:r>
             <w:rPr>
               <w:rFonts w:ascii="Myriad-Pro, Calibri, Arial" w:hAnsi="Myriad-Pro, Calibri, Arial"/>
@@ -2022,17 +1946,15 @@
         <w:sz w:val="18"/>
         <w:szCs w:val="18"/>
       </w:rPr>
-      <w:t>{</w:t>
-    </w:r>
-    <w:proofErr w:type="spellStart"/>
-    <w:proofErr w:type="gramStart"/>
+      <w:t>{d</w:t>
+    </w:r>
     <w:r>
       <w:rPr>
         <w:rFonts w:ascii="Myriad-Pro, Calibri, Arial" w:hAnsi="Myriad-Pro, Calibri, Arial"/>
         <w:sz w:val="18"/>
         <w:szCs w:val="18"/>
       </w:rPr>
-      <w:t>d</w:t>
+      <w:t>.</w:t>
     </w:r>
     <w:r>
       <w:rPr>
@@ -2040,7 +1962,7 @@
         <w:sz w:val="18"/>
         <w:szCs w:val="18"/>
       </w:rPr>
-      <w:t>.</w:t>
+      <w:t>header</w:t>
     </w:r>
     <w:r>
       <w:rPr>
@@ -2048,16 +1970,15 @@
         <w:sz w:val="18"/>
         <w:szCs w:val="18"/>
       </w:rPr>
-      <w:t>header</w:t>
-    </w:r>
-    <w:proofErr w:type="gramEnd"/>
+      <w:t>.filterText</w:t>
+    </w:r>
     <w:r>
       <w:rPr>
         <w:rFonts w:ascii="Myriad-Pro, Calibri, Arial" w:hAnsi="Myriad-Pro, Calibri, Arial"/>
         <w:sz w:val="18"/>
         <w:szCs w:val="18"/>
       </w:rPr>
-      <w:t>.filterText</w:t>
+      <w:t>:ifNEM():showBegin</w:t>
     </w:r>
     <w:r>
       <w:rPr>
@@ -2065,34 +1986,31 @@
         <w:sz w:val="18"/>
         <w:szCs w:val="18"/>
       </w:rPr>
-      <w:t>:ifNEM</w:t>
-    </w:r>
-    <w:proofErr w:type="spellEnd"/>
+      <w:t>}</w:t>
+    </w:r>
     <w:r>
       <w:rPr>
         <w:rFonts w:ascii="Myriad-Pro, Calibri, Arial" w:hAnsi="Myriad-Pro, Calibri, Arial"/>
         <w:sz w:val="18"/>
         <w:szCs w:val="18"/>
       </w:rPr>
-      <w:t>():</w:t>
-    </w:r>
-    <w:proofErr w:type="spellStart"/>
+      <w:t>{d</w:t>
+    </w:r>
     <w:r>
       <w:rPr>
         <w:rFonts w:ascii="Myriad-Pro, Calibri, Arial" w:hAnsi="Myriad-Pro, Calibri, Arial"/>
         <w:sz w:val="18"/>
         <w:szCs w:val="18"/>
       </w:rPr>
-      <w:t>showBegin</w:t>
-    </w:r>
-    <w:proofErr w:type="spellEnd"/>
+      <w:t>.</w:t>
+    </w:r>
     <w:r>
       <w:rPr>
         <w:rFonts w:ascii="Myriad-Pro, Calibri, Arial" w:hAnsi="Myriad-Pro, Calibri, Arial"/>
         <w:sz w:val="18"/>
         <w:szCs w:val="18"/>
       </w:rPr>
-      <w:t>}</w:t>
+      <w:t>header</w:t>
     </w:r>
     <w:r>
       <w:rPr>
@@ -2100,50 +2018,16 @@
         <w:sz w:val="18"/>
         <w:szCs w:val="18"/>
       </w:rPr>
-      <w:t>{</w:t>
-    </w:r>
-    <w:proofErr w:type="spellStart"/>
+      <w:t>.</w:t>
+    </w:r>
     <w:r>
       <w:rPr>
         <w:rFonts w:ascii="Myriad-Pro, Calibri, Arial" w:hAnsi="Myriad-Pro, Calibri, Arial"/>
         <w:sz w:val="18"/>
         <w:szCs w:val="18"/>
       </w:rPr>
-      <w:t>d</w:t>
-    </w:r>
-    <w:r>
-      <w:rPr>
-        <w:rFonts w:ascii="Myriad-Pro, Calibri, Arial" w:hAnsi="Myriad-Pro, Calibri, Arial"/>
-        <w:sz w:val="18"/>
-        <w:szCs w:val="18"/>
-      </w:rPr>
-      <w:t>.</w:t>
-    </w:r>
-    <w:r>
-      <w:rPr>
-        <w:rFonts w:ascii="Myriad-Pro, Calibri, Arial" w:hAnsi="Myriad-Pro, Calibri, Arial"/>
-        <w:sz w:val="18"/>
-        <w:szCs w:val="18"/>
-      </w:rPr>
-      <w:t>header</w:t>
-    </w:r>
-    <w:r>
-      <w:rPr>
-        <w:rFonts w:ascii="Myriad-Pro, Calibri, Arial" w:hAnsi="Myriad-Pro, Calibri, Arial"/>
-        <w:sz w:val="18"/>
-        <w:szCs w:val="18"/>
-      </w:rPr>
-      <w:t>.</w:t>
-    </w:r>
-    <w:r>
-      <w:rPr>
-        <w:rFonts w:ascii="Myriad-Pro, Calibri, Arial" w:hAnsi="Myriad-Pro, Calibri, Arial"/>
-        <w:sz w:val="18"/>
-        <w:szCs w:val="18"/>
-      </w:rPr>
       <w:t>filterText</w:t>
     </w:r>
-    <w:proofErr w:type="spellEnd"/>
     <w:r>
       <w:rPr>
         <w:rFonts w:ascii="Myriad-Pro, Calibri, Arial" w:hAnsi="Myriad-Pro, Calibri, Arial"/>
@@ -2164,42 +2048,14 @@
         <w:sz w:val="18"/>
         <w:szCs w:val="18"/>
       </w:rPr>
-      <w:t>{</w:t>
-    </w:r>
-    <w:proofErr w:type="spellStart"/>
-    <w:proofErr w:type="gramStart"/>
-    <w:r>
-      <w:rPr>
-        <w:rFonts w:ascii="Myriad-Pro, Calibri, Arial" w:hAnsi="Myriad-Pro, Calibri, Arial"/>
-        <w:sz w:val="18"/>
-        <w:szCs w:val="18"/>
-      </w:rPr>
-      <w:t>d.header</w:t>
-    </w:r>
-    <w:proofErr w:type="gramEnd"/>
-    <w:r>
-      <w:rPr>
-        <w:rFonts w:ascii="Myriad-Pro, Calibri, Arial" w:hAnsi="Myriad-Pro, Calibri, Arial"/>
-        <w:sz w:val="18"/>
-        <w:szCs w:val="18"/>
-      </w:rPr>
-      <w:t>.filterText:showEnd</w:t>
-    </w:r>
-    <w:proofErr w:type="spellEnd"/>
-    <w:r>
-      <w:rPr>
-        <w:rFonts w:ascii="Myriad-Pro, Calibri, Arial" w:hAnsi="Myriad-Pro, Calibri, Arial"/>
-        <w:sz w:val="18"/>
-        <w:szCs w:val="18"/>
-      </w:rPr>
-      <w:t>}</w:t>
+      <w:t>{d.header.filterText:showEnd}</w:t>
     </w:r>
   </w:p>
 </w:hdr>
 </file>
 
 <file path=word/styles.xml><?xml version="1.0" encoding="utf-8"?>
-<w:styles xmlns:mc="http://schemas.openxmlformats.org/markup-compatibility/2006" xmlns:r="http://schemas.openxmlformats.org/officeDocument/2006/relationships" xmlns:w="http://schemas.openxmlformats.org/wordprocessingml/2006/main" xmlns:w14="http://schemas.microsoft.com/office/word/2010/wordml" xmlns:w15="http://schemas.microsoft.com/office/word/2012/wordml" xmlns:w16cex="http://schemas.microsoft.com/office/word/2018/wordml/cex" xmlns:w16cid="http://schemas.microsoft.com/office/word/2016/wordml/cid" xmlns:w16="http://schemas.microsoft.com/office/word/2018/wordml" xmlns:w16du="http://schemas.microsoft.com/office/word/2023/wordml/word16du" xmlns:w16sdtdh="http://schemas.microsoft.com/office/word/2020/wordml/sdtdatahash" xmlns:w16se="http://schemas.microsoft.com/office/word/2015/wordml/symex" mc:Ignorable="w14 w15 w16se w16cid w16 w16cex w16sdtdh w16du">
+<w:styles xmlns:mc="http://schemas.openxmlformats.org/markup-compatibility/2006" xmlns:r="http://schemas.openxmlformats.org/officeDocument/2006/relationships" xmlns:w="http://schemas.openxmlformats.org/wordprocessingml/2006/main" xmlns:w14="http://schemas.microsoft.com/office/word/2010/wordml" xmlns:w15="http://schemas.microsoft.com/office/word/2012/wordml" xmlns:w16cex="http://schemas.microsoft.com/office/word/2018/wordml/cex" xmlns:w16cid="http://schemas.microsoft.com/office/word/2016/wordml/cid" xmlns:w16="http://schemas.microsoft.com/office/word/2018/wordml" xmlns:w16du="http://schemas.microsoft.com/office/word/2023/wordml/word16du" xmlns:w16sdtdh="http://schemas.microsoft.com/office/word/2020/wordml/sdtdatahash" xmlns:w16sdtfl="http://schemas.microsoft.com/office/word/2024/wordml/sdtformatlock" xmlns:w16se="http://schemas.microsoft.com/office/word/2015/wordml/symex" mc:Ignorable="w14 w15 w16se w16cid w16 w16cex w16sdtdh w16sdtfl w16du">
   <w:docDefaults>
     <w:rPrDefault>
       <w:rPr>

</xml_diff>

<commit_message>
Add Active Ingredients table to Medication timeline entry card (DHSOHG-3326) for AB#17031 (#6631)
* Fix ActiveIngredient–DrugProduct relationship (DHSOHG-3326) AB#170231

* Add defensive checks for large PDF report downloads for AB#17031

* Add controller and service for drug lookup by DIN for AB#17031

* Add Active Ingredients table to Medication Entry (DHSOHG-3326) AB#17031

* Handle null CDOGS report payload for AB#170231

* Remove unused ActiveIngredient fields & improve report source AB#17031
</commit_message>
<xml_diff>
--- a/Apps/GatewayApi/src/Assets/Templates/MedicationReport.docx
+++ b/Apps/GatewayApi/src/Assets/Templates/MedicationReport.docx
@@ -1,24 +1,23 @@
 
 <file path=word/document.xml><?xml version="1.0" encoding="utf-8"?>
-<w:document xmlns:wpc="http://schemas.microsoft.com/office/word/2010/wordprocessingCanvas" xmlns:cx="http://schemas.microsoft.com/office/drawing/2014/chartex" xmlns:cx1="http://schemas.microsoft.com/office/drawing/2015/9/8/chartex" xmlns:cx2="http://schemas.microsoft.com/office/drawing/2015/10/21/chartex" xmlns:cx3="http://schemas.microsoft.com/office/drawing/2016/5/9/chartex" xmlns:cx4="http://schemas.microsoft.com/office/drawing/2016/5/10/chartex" xmlns:cx5="http://schemas.microsoft.com/office/drawing/2016/5/11/chartex" xmlns:cx6="http://schemas.microsoft.com/office/drawing/2016/5/12/chartex" xmlns:cx7="http://schemas.microsoft.com/office/drawing/2016/5/13/chartex" xmlns:cx8="http://schemas.microsoft.com/office/drawing/2016/5/14/chartex" xmlns:mc="http://schemas.openxmlformats.org/markup-compatibility/2006" xmlns:aink="http://schemas.microsoft.com/office/drawing/2016/ink" xmlns:am3d="http://schemas.microsoft.com/office/drawing/2017/model3d" xmlns:o="urn:schemas-microsoft-com:office:office" xmlns:oel="http://schemas.microsoft.com/office/2019/extlst" xmlns:r="http://schemas.openxmlformats.org/officeDocument/2006/relationships" xmlns:m="http://schemas.openxmlformats.org/officeDocument/2006/math" xmlns:v="urn:schemas-microsoft-com:vml" xmlns:wp14="http://schemas.microsoft.com/office/word/2010/wordprocessingDrawing" xmlns:wp="http://schemas.openxmlformats.org/drawingml/2006/wordprocessingDrawing" xmlns:w10="urn:schemas-microsoft-com:office:word" xmlns:w="http://schemas.openxmlformats.org/wordprocessingml/2006/main" xmlns:w14="http://schemas.microsoft.com/office/word/2010/wordml" xmlns:w15="http://schemas.microsoft.com/office/word/2012/wordml" xmlns:w16cex="http://schemas.microsoft.com/office/word/2018/wordml/cex" xmlns:w16cid="http://schemas.microsoft.com/office/word/2016/wordml/cid" xmlns:w16="http://schemas.microsoft.com/office/word/2018/wordml" xmlns:w16du="http://schemas.microsoft.com/office/word/2023/wordml/word16du" xmlns:w16sdtdh="http://schemas.microsoft.com/office/word/2020/wordml/sdtdatahash" xmlns:w16se="http://schemas.microsoft.com/office/word/2015/wordml/symex" xmlns:wpg="http://schemas.microsoft.com/office/word/2010/wordprocessingGroup" xmlns:wpi="http://schemas.microsoft.com/office/word/2010/wordprocessingInk" xmlns:wne="http://schemas.microsoft.com/office/word/2006/wordml" xmlns:wps="http://schemas.microsoft.com/office/word/2010/wordprocessingShape" mc:Ignorable="w14 w15 w16se w16cid w16 w16cex w16sdtdh w16du wp14">
+<w:document xmlns:wpc="http://schemas.microsoft.com/office/word/2010/wordprocessingCanvas" xmlns:cx="http://schemas.microsoft.com/office/drawing/2014/chartex" xmlns:cx1="http://schemas.microsoft.com/office/drawing/2015/9/8/chartex" xmlns:cx2="http://schemas.microsoft.com/office/drawing/2015/10/21/chartex" xmlns:cx3="http://schemas.microsoft.com/office/drawing/2016/5/9/chartex" xmlns:cx4="http://schemas.microsoft.com/office/drawing/2016/5/10/chartex" xmlns:cx5="http://schemas.microsoft.com/office/drawing/2016/5/11/chartex" xmlns:cx6="http://schemas.microsoft.com/office/drawing/2016/5/12/chartex" xmlns:cx7="http://schemas.microsoft.com/office/drawing/2016/5/13/chartex" xmlns:cx8="http://schemas.microsoft.com/office/drawing/2016/5/14/chartex" xmlns:mc="http://schemas.openxmlformats.org/markup-compatibility/2006" xmlns:aink="http://schemas.microsoft.com/office/drawing/2016/ink" xmlns:am3d="http://schemas.microsoft.com/office/drawing/2017/model3d" xmlns:o="urn:schemas-microsoft-com:office:office" xmlns:oel="http://schemas.microsoft.com/office/2019/extlst" xmlns:r="http://schemas.openxmlformats.org/officeDocument/2006/relationships" xmlns:m="http://schemas.openxmlformats.org/officeDocument/2006/math" xmlns:v="urn:schemas-microsoft-com:vml" xmlns:wp14="http://schemas.microsoft.com/office/word/2010/wordprocessingDrawing" xmlns:wp="http://schemas.openxmlformats.org/drawingml/2006/wordprocessingDrawing" xmlns:w10="urn:schemas-microsoft-com:office:word" xmlns:w="http://schemas.openxmlformats.org/wordprocessingml/2006/main" xmlns:w14="http://schemas.microsoft.com/office/word/2010/wordml" xmlns:w15="http://schemas.microsoft.com/office/word/2012/wordml" xmlns:w16cex="http://schemas.microsoft.com/office/word/2018/wordml/cex" xmlns:w16cid="http://schemas.microsoft.com/office/word/2016/wordml/cid" xmlns:w16="http://schemas.microsoft.com/office/word/2018/wordml" xmlns:w16du="http://schemas.microsoft.com/office/word/2023/wordml/word16du" xmlns:w16sdtdh="http://schemas.microsoft.com/office/word/2020/wordml/sdtdatahash" xmlns:w16sdtfl="http://schemas.microsoft.com/office/word/2024/wordml/sdtformatlock" xmlns:w16se="http://schemas.microsoft.com/office/word/2015/wordml/symex" xmlns:wpg="http://schemas.microsoft.com/office/word/2010/wordprocessingGroup" xmlns:wpi="http://schemas.microsoft.com/office/word/2010/wordprocessingInk" xmlns:wne="http://schemas.microsoft.com/office/word/2006/wordml" xmlns:wps="http://schemas.microsoft.com/office/word/2010/wordprocessingShape" mc:Ignorable="w14 w15 w16se w16cid w16 w16cex w16sdtdh w16sdtfl w16du wp14">
   <w:body>
     <w:tbl>
       <w:tblPr>
         <w:tblStyle w:val="HealthGatewayExportTable"/>
-        <w:tblW w:w="5000" w:type="pct"/>
+        <w:tblW w:w="4433" w:type="pct"/>
         <w:tblLayout w:type="fixed"/>
         <w:tblLook w:val="04A0" w:firstRow="1" w:lastRow="0" w:firstColumn="1" w:lastColumn="0" w:noHBand="0" w:noVBand="1"/>
       </w:tblPr>
       <w:tblGrid>
-        <w:gridCol w:w="1265"/>
-        <w:gridCol w:w="975"/>
+        <w:gridCol w:w="1062"/>
+        <w:gridCol w:w="1181"/>
+        <w:gridCol w:w="1049"/>
+        <w:gridCol w:w="1189"/>
+        <w:gridCol w:w="1361"/>
         <w:gridCol w:w="1222"/>
-        <w:gridCol w:w="1222"/>
-        <w:gridCol w:w="1222"/>
-        <w:gridCol w:w="1025"/>
-        <w:gridCol w:w="1138"/>
-        <w:gridCol w:w="1222"/>
-        <w:gridCol w:w="1509"/>
+        <w:gridCol w:w="1082"/>
+        <w:gridCol w:w="1429"/>
       </w:tblGrid>
       <w:tr>
         <w:trPr>
@@ -29,7 +28,7 @@
         </w:trPr>
         <w:tc>
           <w:tcPr>
-            <w:tcW w:w="1261" w:type="dxa"/>
+            <w:tcW w:w="2920" w:type="dxa"/>
           </w:tcPr>
           <w:p>
             <w:pPr>
@@ -59,7 +58,7 @@
         </w:tc>
         <w:tc>
           <w:tcPr>
-            <w:tcW w:w="971" w:type="dxa"/>
+            <w:tcW w:w="3291" w:type="dxa"/>
           </w:tcPr>
           <w:p>
             <w:pPr>
@@ -89,7 +88,7 @@
         </w:tc>
         <w:tc>
           <w:tcPr>
-            <w:tcW w:w="1217" w:type="dxa"/>
+            <w:tcW w:w="2876" w:type="dxa"/>
           </w:tcPr>
           <w:p>
             <w:pPr>
@@ -119,7 +118,7 @@
         </w:tc>
         <w:tc>
           <w:tcPr>
-            <w:tcW w:w="1217" w:type="dxa"/>
+            <w:tcW w:w="3314" w:type="dxa"/>
           </w:tcPr>
           <w:p>
             <w:pPr>
@@ -149,7 +148,7 @@
         </w:tc>
         <w:tc>
           <w:tcPr>
-            <w:tcW w:w="1217" w:type="dxa"/>
+            <w:tcW w:w="3853" w:type="dxa"/>
           </w:tcPr>
           <w:p>
             <w:pPr>
@@ -179,7 +178,7 @@
         </w:tc>
         <w:tc>
           <w:tcPr>
-            <w:tcW w:w="1021" w:type="dxa"/>
+            <w:tcW w:w="3419" w:type="dxa"/>
           </w:tcPr>
           <w:p>
             <w:pPr>
@@ -209,7 +208,7 @@
         </w:tc>
         <w:tc>
           <w:tcPr>
-            <w:tcW w:w="1134" w:type="dxa"/>
+            <w:tcW w:w="2982" w:type="dxa"/>
           </w:tcPr>
           <w:p>
             <w:pPr>
@@ -233,43 +232,13 @@
                 <w:sz w:val="14"/>
                 <w:szCs w:val="14"/>
               </w:rPr>
-              <w:t>Strength</w:t>
+              <w:t>Form</w:t>
             </w:r>
           </w:p>
         </w:tc>
         <w:tc>
           <w:tcPr>
-            <w:tcW w:w="1217" w:type="dxa"/>
-          </w:tcPr>
-          <w:p>
-            <w:pPr>
-              <w:rPr>
-                <w:rStyle w:val="Strong"/>
-                <w:rFonts w:ascii="Myriad-Pro, Calibri, Arial" w:hAnsi="Myriad-Pro, Calibri, Arial"/>
-                <w:b/>
-                <w:bCs w:val="0"/>
-                <w:color w:val="auto"/>
-                <w:sz w:val="14"/>
-                <w:szCs w:val="14"/>
-              </w:rPr>
-            </w:pPr>
-            <w:r>
-              <w:rPr>
-                <w:rStyle w:val="Strong"/>
-                <w:rFonts w:ascii="Myriad-Pro, Calibri, Arial" w:hAnsi="Myriad-Pro, Calibri, Arial"/>
-                <w:b/>
-                <w:bCs w:val="0"/>
-                <w:color w:val="auto"/>
-                <w:sz w:val="14"/>
-                <w:szCs w:val="14"/>
-              </w:rPr>
-              <w:t>Form</w:t>
-            </w:r>
-          </w:p>
-        </w:tc>
-        <w:tc>
-          <w:tcPr>
-            <w:tcW w:w="1503" w:type="dxa"/>
+            <w:tcW w:w="4066" w:type="dxa"/>
           </w:tcPr>
           <w:p>
             <w:pPr>
@@ -306,7 +275,7 @@
         </w:trPr>
         <w:tc>
           <w:tcPr>
-            <w:tcW w:w="1261" w:type="dxa"/>
+            <w:tcW w:w="2920" w:type="dxa"/>
           </w:tcPr>
           <w:p>
             <w:pPr>
@@ -350,18 +319,27 @@
               <w:t>i</w:t>
             </w:r>
             <w:proofErr w:type="spellEnd"/>
-            <w:r>
-              <w:rPr>
-                <w:rFonts w:ascii="Myriad-Pro, Calibri, Arial" w:hAnsi="Myriad-Pro, Calibri, Arial"/>
-                <w:color w:val="auto"/>
-              </w:rPr>
-              <w:t>].date}</w:t>
+            <w:proofErr w:type="gramStart"/>
+            <w:r>
+              <w:rPr>
+                <w:rFonts w:ascii="Myriad-Pro, Calibri, Arial" w:hAnsi="Myriad-Pro, Calibri, Arial"/>
+                <w:color w:val="auto"/>
+              </w:rPr>
+              <w:t>].date</w:t>
+            </w:r>
+            <w:proofErr w:type="gramEnd"/>
+            <w:r>
+              <w:rPr>
+                <w:rFonts w:ascii="Myriad-Pro, Calibri, Arial" w:hAnsi="Myriad-Pro, Calibri, Arial"/>
+                <w:color w:val="auto"/>
+              </w:rPr>
+              <w:t>}</w:t>
             </w:r>
           </w:p>
         </w:tc>
         <w:tc>
           <w:tcPr>
-            <w:tcW w:w="971" w:type="dxa"/>
+            <w:tcW w:w="3291" w:type="dxa"/>
           </w:tcPr>
           <w:p>
             <w:pPr>
@@ -405,6 +383,7 @@
               <w:t>i</w:t>
             </w:r>
             <w:proofErr w:type="spellEnd"/>
+            <w:proofErr w:type="gramStart"/>
             <w:r>
               <w:rPr>
                 <w:rFonts w:ascii="Myriad-Pro, Calibri, Arial" w:hAnsi="Myriad-Pro, Calibri, Arial"/>
@@ -418,7 +397,15 @@
                 <w:rFonts w:ascii="Myriad-Pro, Calibri, Arial" w:hAnsi="Myriad-Pro, Calibri, Arial"/>
                 <w:color w:val="auto"/>
               </w:rPr>
-              <w:t>din_pin</w:t>
+              <w:t>din</w:t>
+            </w:r>
+            <w:proofErr w:type="gramEnd"/>
+            <w:r>
+              <w:rPr>
+                <w:rFonts w:ascii="Myriad-Pro, Calibri, Arial" w:hAnsi="Myriad-Pro, Calibri, Arial"/>
+                <w:color w:val="auto"/>
+              </w:rPr>
+              <w:t>_pin</w:t>
             </w:r>
             <w:proofErr w:type="spellEnd"/>
             <w:r>
@@ -432,7 +419,7 @@
         </w:tc>
         <w:tc>
           <w:tcPr>
-            <w:tcW w:w="1217" w:type="dxa"/>
+            <w:tcW w:w="2876" w:type="dxa"/>
           </w:tcPr>
           <w:p>
             <w:pPr>
@@ -476,20 +463,15 @@
               <w:t>i</w:t>
             </w:r>
             <w:proofErr w:type="spellEnd"/>
-            <w:r>
-              <w:rPr>
-                <w:rFonts w:ascii="Myriad-Pro, Calibri, Arial" w:hAnsi="Myriad-Pro, Calibri, Arial"/>
-                <w:color w:val="auto"/>
-              </w:rPr>
-              <w:t>].</w:t>
-            </w:r>
-            <w:r>
-              <w:rPr>
-                <w:rFonts w:ascii="Myriad-Pro, Calibri, Arial" w:hAnsi="Myriad-Pro, Calibri, Arial"/>
-                <w:color w:val="auto"/>
-              </w:rPr>
-              <w:t>title</w:t>
-            </w:r>
+            <w:proofErr w:type="gramStart"/>
+            <w:r>
+              <w:rPr>
+                <w:rFonts w:ascii="Myriad-Pro, Calibri, Arial" w:hAnsi="Myriad-Pro, Calibri, Arial"/>
+                <w:color w:val="auto"/>
+              </w:rPr>
+              <w:t>].title</w:t>
+            </w:r>
+            <w:proofErr w:type="gramEnd"/>
             <w:r>
               <w:rPr>
                 <w:rFonts w:ascii="Myriad-Pro, Calibri, Arial" w:hAnsi="Myriad-Pro, Calibri, Arial"/>
@@ -501,7 +483,7 @@
         </w:tc>
         <w:tc>
           <w:tcPr>
-            <w:tcW w:w="1217" w:type="dxa"/>
+            <w:tcW w:w="3314" w:type="dxa"/>
           </w:tcPr>
           <w:p>
             <w:pPr>
@@ -545,20 +527,15 @@
               <w:t>i</w:t>
             </w:r>
             <w:proofErr w:type="spellEnd"/>
-            <w:r>
-              <w:rPr>
-                <w:rFonts w:ascii="Myriad-Pro, Calibri, Arial" w:hAnsi="Myriad-Pro, Calibri, Arial"/>
-                <w:color w:val="auto"/>
-              </w:rPr>
-              <w:t>].</w:t>
-            </w:r>
-            <w:r>
-              <w:rPr>
-                <w:rFonts w:ascii="Myriad-Pro, Calibri, Arial" w:hAnsi="Myriad-Pro, Calibri, Arial"/>
-                <w:color w:val="auto"/>
-              </w:rPr>
-              <w:t>subtitle</w:t>
-            </w:r>
+            <w:proofErr w:type="gramStart"/>
+            <w:r>
+              <w:rPr>
+                <w:rFonts w:ascii="Myriad-Pro, Calibri, Arial" w:hAnsi="Myriad-Pro, Calibri, Arial"/>
+                <w:color w:val="auto"/>
+              </w:rPr>
+              <w:t>].subtitle</w:t>
+            </w:r>
+            <w:proofErr w:type="gramEnd"/>
             <w:r>
               <w:rPr>
                 <w:rFonts w:ascii="Myriad-Pro, Calibri, Arial" w:hAnsi="Myriad-Pro, Calibri, Arial"/>
@@ -570,7 +547,7 @@
         </w:tc>
         <w:tc>
           <w:tcPr>
-            <w:tcW w:w="1217" w:type="dxa"/>
+            <w:tcW w:w="3853" w:type="dxa"/>
           </w:tcPr>
           <w:p>
             <w:pPr>
@@ -614,18 +591,27 @@
               <w:t>i</w:t>
             </w:r>
             <w:proofErr w:type="spellEnd"/>
-            <w:r>
-              <w:rPr>
-                <w:rFonts w:ascii="Myriad-Pro, Calibri, Arial" w:hAnsi="Myriad-Pro, Calibri, Arial"/>
-                <w:color w:val="auto"/>
-              </w:rPr>
-              <w:t>].practitioner}</w:t>
+            <w:proofErr w:type="gramStart"/>
+            <w:r>
+              <w:rPr>
+                <w:rFonts w:ascii="Myriad-Pro, Calibri, Arial" w:hAnsi="Myriad-Pro, Calibri, Arial"/>
+                <w:color w:val="auto"/>
+              </w:rPr>
+              <w:t>].practitioner</w:t>
+            </w:r>
+            <w:proofErr w:type="gramEnd"/>
+            <w:r>
+              <w:rPr>
+                <w:rFonts w:ascii="Myriad-Pro, Calibri, Arial" w:hAnsi="Myriad-Pro, Calibri, Arial"/>
+                <w:color w:val="auto"/>
+              </w:rPr>
+              <w:t>}</w:t>
             </w:r>
           </w:p>
         </w:tc>
         <w:tc>
           <w:tcPr>
-            <w:tcW w:w="1021" w:type="dxa"/>
+            <w:tcW w:w="3419" w:type="dxa"/>
           </w:tcPr>
           <w:p>
             <w:pPr>
@@ -669,18 +655,27 @@
               <w:t>i</w:t>
             </w:r>
             <w:proofErr w:type="spellEnd"/>
-            <w:r>
-              <w:rPr>
-                <w:rFonts w:ascii="Myriad-Pro, Calibri, Arial" w:hAnsi="Myriad-Pro, Calibri, Arial"/>
-                <w:color w:val="auto"/>
-              </w:rPr>
-              <w:t>].quantity}</w:t>
+            <w:proofErr w:type="gramStart"/>
+            <w:r>
+              <w:rPr>
+                <w:rFonts w:ascii="Myriad-Pro, Calibri, Arial" w:hAnsi="Myriad-Pro, Calibri, Arial"/>
+                <w:color w:val="auto"/>
+              </w:rPr>
+              <w:t>].quantity</w:t>
+            </w:r>
+            <w:proofErr w:type="gramEnd"/>
+            <w:r>
+              <w:rPr>
+                <w:rFonts w:ascii="Myriad-Pro, Calibri, Arial" w:hAnsi="Myriad-Pro, Calibri, Arial"/>
+                <w:color w:val="auto"/>
+              </w:rPr>
+              <w:t>}</w:t>
             </w:r>
           </w:p>
         </w:tc>
         <w:tc>
           <w:tcPr>
-            <w:tcW w:w="1134" w:type="dxa"/>
+            <w:tcW w:w="2982" w:type="dxa"/>
           </w:tcPr>
           <w:p>
             <w:pPr>
@@ -724,18 +719,27 @@
               <w:t>i</w:t>
             </w:r>
             <w:proofErr w:type="spellEnd"/>
-            <w:r>
-              <w:rPr>
-                <w:rFonts w:ascii="Myriad-Pro, Calibri, Arial" w:hAnsi="Myriad-Pro, Calibri, Arial"/>
-                <w:color w:val="auto"/>
-              </w:rPr>
-              <w:t>].strength}</w:t>
+            <w:proofErr w:type="gramStart"/>
+            <w:r>
+              <w:rPr>
+                <w:rFonts w:ascii="Myriad-Pro, Calibri, Arial" w:hAnsi="Myriad-Pro, Calibri, Arial"/>
+                <w:color w:val="auto"/>
+              </w:rPr>
+              <w:t>].form</w:t>
+            </w:r>
+            <w:proofErr w:type="gramEnd"/>
+            <w:r>
+              <w:rPr>
+                <w:rFonts w:ascii="Myriad-Pro, Calibri, Arial" w:hAnsi="Myriad-Pro, Calibri, Arial"/>
+                <w:color w:val="auto"/>
+              </w:rPr>
+              <w:t>}</w:t>
             </w:r>
           </w:p>
         </w:tc>
         <w:tc>
           <w:tcPr>
-            <w:tcW w:w="1217" w:type="dxa"/>
+            <w:tcW w:w="4066" w:type="dxa"/>
           </w:tcPr>
           <w:p>
             <w:pPr>
@@ -779,67 +783,21 @@
               <w:t>i</w:t>
             </w:r>
             <w:proofErr w:type="spellEnd"/>
-            <w:r>
-              <w:rPr>
-                <w:rFonts w:ascii="Myriad-Pro, Calibri, Arial" w:hAnsi="Myriad-Pro, Calibri, Arial"/>
-                <w:color w:val="auto"/>
-              </w:rPr>
-              <w:t>].form}</w:t>
-            </w:r>
-          </w:p>
-        </w:tc>
-        <w:tc>
-          <w:tcPr>
-            <w:tcW w:w="1503" w:type="dxa"/>
-          </w:tcPr>
-          <w:p>
-            <w:pPr>
-              <w:pStyle w:val="Small"/>
-              <w:rPr>
-                <w:rFonts w:ascii="Myriad-Pro, Calibri, Arial" w:hAnsi="Myriad-Pro, Calibri, Arial"/>
-                <w:color w:val="auto"/>
-              </w:rPr>
-            </w:pPr>
-            <w:r>
-              <w:rPr>
-                <w:rFonts w:ascii="Myriad-Pro, Calibri, Arial" w:hAnsi="Myriad-Pro, Calibri, Arial"/>
-                <w:color w:val="auto"/>
-              </w:rPr>
-              <w:t>{</w:t>
-            </w:r>
-            <w:proofErr w:type="spellStart"/>
-            <w:proofErr w:type="gramStart"/>
-            <w:r>
-              <w:rPr>
-                <w:rFonts w:ascii="Myriad-Pro, Calibri, Arial" w:hAnsi="Myriad-Pro, Calibri, Arial"/>
-                <w:color w:val="auto"/>
-              </w:rPr>
-              <w:t>d.records</w:t>
-            </w:r>
-            <w:proofErr w:type="spellEnd"/>
-            <w:proofErr w:type="gramEnd"/>
-            <w:r>
-              <w:rPr>
-                <w:rFonts w:ascii="Myriad-Pro, Calibri, Arial" w:hAnsi="Myriad-Pro, Calibri, Arial"/>
-                <w:color w:val="auto"/>
-              </w:rPr>
-              <w:t>[</w:t>
-            </w:r>
-            <w:proofErr w:type="spellStart"/>
-            <w:r>
-              <w:rPr>
-                <w:rFonts w:ascii="Myriad-Pro, Calibri, Arial" w:hAnsi="Myriad-Pro, Calibri, Arial"/>
-                <w:color w:val="auto"/>
-              </w:rPr>
-              <w:t>i</w:t>
-            </w:r>
-            <w:proofErr w:type="spellEnd"/>
-            <w:r>
-              <w:rPr>
-                <w:rFonts w:ascii="Myriad-Pro, Calibri, Arial" w:hAnsi="Myriad-Pro, Calibri, Arial"/>
-                <w:color w:val="auto"/>
-              </w:rPr>
-              <w:t>].manufacturer}</w:t>
+            <w:proofErr w:type="gramStart"/>
+            <w:r>
+              <w:rPr>
+                <w:rFonts w:ascii="Myriad-Pro, Calibri, Arial" w:hAnsi="Myriad-Pro, Calibri, Arial"/>
+                <w:color w:val="auto"/>
+              </w:rPr>
+              <w:t>].manufacturer</w:t>
+            </w:r>
+            <w:proofErr w:type="gramEnd"/>
+            <w:r>
+              <w:rPr>
+                <w:rFonts w:ascii="Myriad-Pro, Calibri, Arial" w:hAnsi="Myriad-Pro, Calibri, Arial"/>
+                <w:color w:val="auto"/>
+              </w:rPr>
+              <w:t>}</w:t>
             </w:r>
           </w:p>
         </w:tc>
@@ -851,12 +809,11 @@
         </w:trPr>
         <w:tc>
           <w:tcPr>
-            <w:tcW w:w="1261" w:type="dxa"/>
+            <w:tcW w:w="2920" w:type="dxa"/>
           </w:tcPr>
           <w:p>
             <w:pPr>
               <w:pStyle w:val="Small"/>
-              <w:cnfStyle w:val="000000010000" w:firstRow="0" w:lastRow="0" w:firstColumn="0" w:lastColumn="0" w:oddVBand="0" w:evenVBand="0" w:oddHBand="0" w:evenHBand="1" w:firstRowFirstColumn="0" w:firstRowLastColumn="0" w:lastRowFirstColumn="0" w:lastRowLastColumn="0"/>
               <w:rPr>
                 <w:rFonts w:ascii="Myriad-Pro, Calibri, Arial" w:hAnsi="Myriad-Pro, Calibri, Arial"/>
                 <w:color w:val="auto"/>
@@ -885,18 +842,33 @@
                 <w:rFonts w:ascii="Myriad-Pro, Calibri, Arial" w:hAnsi="Myriad-Pro, Calibri, Arial"/>
                 <w:color w:val="auto"/>
               </w:rPr>
-              <w:t>[i+1].date}</w:t>
+              <w:t>[i+1</w:t>
+            </w:r>
+            <w:proofErr w:type="gramStart"/>
+            <w:r>
+              <w:rPr>
+                <w:rFonts w:ascii="Myriad-Pro, Calibri, Arial" w:hAnsi="Myriad-Pro, Calibri, Arial"/>
+                <w:color w:val="auto"/>
+              </w:rPr>
+              <w:t>].date</w:t>
+            </w:r>
+            <w:proofErr w:type="gramEnd"/>
+            <w:r>
+              <w:rPr>
+                <w:rFonts w:ascii="Myriad-Pro, Calibri, Arial" w:hAnsi="Myriad-Pro, Calibri, Arial"/>
+                <w:color w:val="auto"/>
+              </w:rPr>
+              <w:t>}</w:t>
             </w:r>
           </w:p>
         </w:tc>
         <w:tc>
           <w:tcPr>
-            <w:tcW w:w="971" w:type="dxa"/>
+            <w:tcW w:w="3291" w:type="dxa"/>
           </w:tcPr>
           <w:p>
             <w:pPr>
               <w:pStyle w:val="Small"/>
-              <w:cnfStyle w:val="000000010000" w:firstRow="0" w:lastRow="0" w:firstColumn="0" w:lastColumn="0" w:oddVBand="0" w:evenVBand="0" w:oddHBand="0" w:evenHBand="1" w:firstRowFirstColumn="0" w:firstRowLastColumn="0" w:lastRowFirstColumn="0" w:lastRowLastColumn="0"/>
               <w:rPr>
                 <w:rFonts w:ascii="Myriad-Pro, Calibri, Arial" w:hAnsi="Myriad-Pro, Calibri, Arial"/>
                 <w:color w:val="auto"/>
@@ -925,7 +897,15 @@
                 <w:rFonts w:ascii="Myriad-Pro, Calibri, Arial" w:hAnsi="Myriad-Pro, Calibri, Arial"/>
                 <w:color w:val="auto"/>
               </w:rPr>
-              <w:t>[i+1].</w:t>
+              <w:t>[i+1</w:t>
+            </w:r>
+            <w:proofErr w:type="gramStart"/>
+            <w:r>
+              <w:rPr>
+                <w:rFonts w:ascii="Myriad-Pro, Calibri, Arial" w:hAnsi="Myriad-Pro, Calibri, Arial"/>
+                <w:color w:val="auto"/>
+              </w:rPr>
+              <w:t>].</w:t>
             </w:r>
             <w:proofErr w:type="spellStart"/>
             <w:r>
@@ -933,7 +913,15 @@
                 <w:rFonts w:ascii="Myriad-Pro, Calibri, Arial" w:hAnsi="Myriad-Pro, Calibri, Arial"/>
                 <w:color w:val="auto"/>
               </w:rPr>
-              <w:t>din_pin</w:t>
+              <w:t>din</w:t>
+            </w:r>
+            <w:proofErr w:type="gramEnd"/>
+            <w:r>
+              <w:rPr>
+                <w:rFonts w:ascii="Myriad-Pro, Calibri, Arial" w:hAnsi="Myriad-Pro, Calibri, Arial"/>
+                <w:color w:val="auto"/>
+              </w:rPr>
+              <w:t>_pin</w:t>
             </w:r>
             <w:proofErr w:type="spellEnd"/>
             <w:r>
@@ -947,12 +935,11 @@
         </w:tc>
         <w:tc>
           <w:tcPr>
-            <w:tcW w:w="1217" w:type="dxa"/>
+            <w:tcW w:w="2876" w:type="dxa"/>
           </w:tcPr>
           <w:p>
             <w:pPr>
               <w:pStyle w:val="Small"/>
-              <w:cnfStyle w:val="000000010000" w:firstRow="0" w:lastRow="0" w:firstColumn="0" w:lastColumn="0" w:oddVBand="0" w:evenVBand="0" w:oddHBand="0" w:evenHBand="1" w:firstRowFirstColumn="0" w:firstRowLastColumn="0" w:lastRowFirstColumn="0" w:lastRowLastColumn="0"/>
               <w:rPr>
                 <w:rFonts w:ascii="Myriad-Pro, Calibri, Arial" w:hAnsi="Myriad-Pro, Calibri, Arial"/>
                 <w:color w:val="auto"/>
@@ -981,15 +968,17 @@
                 <w:rFonts w:ascii="Myriad-Pro, Calibri, Arial" w:hAnsi="Myriad-Pro, Calibri, Arial"/>
                 <w:color w:val="auto"/>
               </w:rPr>
-              <w:t>[i+1].</w:t>
-            </w:r>
-            <w:r>
-              <w:rPr>
-                <w:rFonts w:ascii="Myriad-Pro, Calibri, Arial" w:hAnsi="Myriad-Pro, Calibri, Arial"/>
-                <w:color w:val="auto"/>
-              </w:rPr>
-              <w:t>title</w:t>
-            </w:r>
+              <w:t>[i+1</w:t>
+            </w:r>
+            <w:proofErr w:type="gramStart"/>
+            <w:r>
+              <w:rPr>
+                <w:rFonts w:ascii="Myriad-Pro, Calibri, Arial" w:hAnsi="Myriad-Pro, Calibri, Arial"/>
+                <w:color w:val="auto"/>
+              </w:rPr>
+              <w:t>].title</w:t>
+            </w:r>
+            <w:proofErr w:type="gramEnd"/>
             <w:r>
               <w:rPr>
                 <w:rFonts w:ascii="Myriad-Pro, Calibri, Arial" w:hAnsi="Myriad-Pro, Calibri, Arial"/>
@@ -1001,12 +990,11 @@
         </w:tc>
         <w:tc>
           <w:tcPr>
-            <w:tcW w:w="1217" w:type="dxa"/>
+            <w:tcW w:w="3314" w:type="dxa"/>
           </w:tcPr>
           <w:p>
             <w:pPr>
               <w:pStyle w:val="Small"/>
-              <w:cnfStyle w:val="000000010000" w:firstRow="0" w:lastRow="0" w:firstColumn="0" w:lastColumn="0" w:oddVBand="0" w:evenVBand="0" w:oddHBand="0" w:evenHBand="1" w:firstRowFirstColumn="0" w:firstRowLastColumn="0" w:lastRowFirstColumn="0" w:lastRowLastColumn="0"/>
               <w:rPr>
                 <w:rFonts w:ascii="Myriad-Pro, Calibri, Arial" w:hAnsi="Myriad-Pro, Calibri, Arial"/>
                 <w:color w:val="auto"/>
@@ -1035,15 +1023,17 @@
                 <w:rFonts w:ascii="Myriad-Pro, Calibri, Arial" w:hAnsi="Myriad-Pro, Calibri, Arial"/>
                 <w:color w:val="auto"/>
               </w:rPr>
-              <w:t>[i+1].</w:t>
-            </w:r>
-            <w:r>
-              <w:rPr>
-                <w:rFonts w:ascii="Myriad-Pro, Calibri, Arial" w:hAnsi="Myriad-Pro, Calibri, Arial"/>
-                <w:color w:val="auto"/>
-              </w:rPr>
-              <w:t>subtitle</w:t>
-            </w:r>
+              <w:t>[i+1</w:t>
+            </w:r>
+            <w:proofErr w:type="gramStart"/>
+            <w:r>
+              <w:rPr>
+                <w:rFonts w:ascii="Myriad-Pro, Calibri, Arial" w:hAnsi="Myriad-Pro, Calibri, Arial"/>
+                <w:color w:val="auto"/>
+              </w:rPr>
+              <w:t>].subtitle</w:t>
+            </w:r>
+            <w:proofErr w:type="gramEnd"/>
             <w:r>
               <w:rPr>
                 <w:rFonts w:ascii="Myriad-Pro, Calibri, Arial" w:hAnsi="Myriad-Pro, Calibri, Arial"/>
@@ -1055,12 +1045,11 @@
         </w:tc>
         <w:tc>
           <w:tcPr>
-            <w:tcW w:w="1217" w:type="dxa"/>
+            <w:tcW w:w="3853" w:type="dxa"/>
           </w:tcPr>
           <w:p>
             <w:pPr>
               <w:pStyle w:val="Small"/>
-              <w:cnfStyle w:val="000000010000" w:firstRow="0" w:lastRow="0" w:firstColumn="0" w:lastColumn="0" w:oddVBand="0" w:evenVBand="0" w:oddHBand="0" w:evenHBand="1" w:firstRowFirstColumn="0" w:firstRowLastColumn="0" w:lastRowFirstColumn="0" w:lastRowLastColumn="0"/>
               <w:rPr>
                 <w:rFonts w:ascii="Myriad-Pro, Calibri, Arial" w:hAnsi="Myriad-Pro, Calibri, Arial"/>
                 <w:color w:val="auto"/>
@@ -1089,18 +1078,33 @@
                 <w:rFonts w:ascii="Myriad-Pro, Calibri, Arial" w:hAnsi="Myriad-Pro, Calibri, Arial"/>
                 <w:color w:val="auto"/>
               </w:rPr>
-              <w:t>[i+1].practitioner}</w:t>
+              <w:t>[i+1</w:t>
+            </w:r>
+            <w:proofErr w:type="gramStart"/>
+            <w:r>
+              <w:rPr>
+                <w:rFonts w:ascii="Myriad-Pro, Calibri, Arial" w:hAnsi="Myriad-Pro, Calibri, Arial"/>
+                <w:color w:val="auto"/>
+              </w:rPr>
+              <w:t>].practitioner</w:t>
+            </w:r>
+            <w:proofErr w:type="gramEnd"/>
+            <w:r>
+              <w:rPr>
+                <w:rFonts w:ascii="Myriad-Pro, Calibri, Arial" w:hAnsi="Myriad-Pro, Calibri, Arial"/>
+                <w:color w:val="auto"/>
+              </w:rPr>
+              <w:t>}</w:t>
             </w:r>
           </w:p>
         </w:tc>
         <w:tc>
           <w:tcPr>
-            <w:tcW w:w="1021" w:type="dxa"/>
+            <w:tcW w:w="3419" w:type="dxa"/>
           </w:tcPr>
           <w:p>
             <w:pPr>
               <w:pStyle w:val="Small"/>
-              <w:cnfStyle w:val="000000010000" w:firstRow="0" w:lastRow="0" w:firstColumn="0" w:lastColumn="0" w:oddVBand="0" w:evenVBand="0" w:oddHBand="0" w:evenHBand="1" w:firstRowFirstColumn="0" w:firstRowLastColumn="0" w:lastRowFirstColumn="0" w:lastRowLastColumn="0"/>
               <w:rPr>
                 <w:rFonts w:ascii="Myriad-Pro, Calibri, Arial" w:hAnsi="Myriad-Pro, Calibri, Arial"/>
                 <w:color w:val="auto"/>
@@ -1129,18 +1133,33 @@
                 <w:rFonts w:ascii="Myriad-Pro, Calibri, Arial" w:hAnsi="Myriad-Pro, Calibri, Arial"/>
                 <w:color w:val="auto"/>
               </w:rPr>
-              <w:t>[i+1].quantity}</w:t>
+              <w:t>[i+1</w:t>
+            </w:r>
+            <w:proofErr w:type="gramStart"/>
+            <w:r>
+              <w:rPr>
+                <w:rFonts w:ascii="Myriad-Pro, Calibri, Arial" w:hAnsi="Myriad-Pro, Calibri, Arial"/>
+                <w:color w:val="auto"/>
+              </w:rPr>
+              <w:t>].quantity</w:t>
+            </w:r>
+            <w:proofErr w:type="gramEnd"/>
+            <w:r>
+              <w:rPr>
+                <w:rFonts w:ascii="Myriad-Pro, Calibri, Arial" w:hAnsi="Myriad-Pro, Calibri, Arial"/>
+                <w:color w:val="auto"/>
+              </w:rPr>
+              <w:t>}</w:t>
             </w:r>
           </w:p>
         </w:tc>
         <w:tc>
           <w:tcPr>
-            <w:tcW w:w="1134" w:type="dxa"/>
+            <w:tcW w:w="2982" w:type="dxa"/>
           </w:tcPr>
           <w:p>
             <w:pPr>
               <w:pStyle w:val="Small"/>
-              <w:cnfStyle w:val="000000010000" w:firstRow="0" w:lastRow="0" w:firstColumn="0" w:lastColumn="0" w:oddVBand="0" w:evenVBand="0" w:oddHBand="0" w:evenHBand="1" w:firstRowFirstColumn="0" w:firstRowLastColumn="0" w:lastRowFirstColumn="0" w:lastRowLastColumn="0"/>
               <w:rPr>
                 <w:rFonts w:ascii="Myriad-Pro, Calibri, Arial" w:hAnsi="Myriad-Pro, Calibri, Arial"/>
                 <w:color w:val="auto"/>
@@ -1169,18 +1188,33 @@
                 <w:rFonts w:ascii="Myriad-Pro, Calibri, Arial" w:hAnsi="Myriad-Pro, Calibri, Arial"/>
                 <w:color w:val="auto"/>
               </w:rPr>
-              <w:t>[i+1].strength}</w:t>
+              <w:t>[i+1</w:t>
+            </w:r>
+            <w:proofErr w:type="gramStart"/>
+            <w:r>
+              <w:rPr>
+                <w:rFonts w:ascii="Myriad-Pro, Calibri, Arial" w:hAnsi="Myriad-Pro, Calibri, Arial"/>
+                <w:color w:val="auto"/>
+              </w:rPr>
+              <w:t>].form</w:t>
+            </w:r>
+            <w:proofErr w:type="gramEnd"/>
+            <w:r>
+              <w:rPr>
+                <w:rFonts w:ascii="Myriad-Pro, Calibri, Arial" w:hAnsi="Myriad-Pro, Calibri, Arial"/>
+                <w:color w:val="auto"/>
+              </w:rPr>
+              <w:t>}</w:t>
             </w:r>
           </w:p>
         </w:tc>
         <w:tc>
           <w:tcPr>
-            <w:tcW w:w="1217" w:type="dxa"/>
+            <w:tcW w:w="4066" w:type="dxa"/>
           </w:tcPr>
           <w:p>
             <w:pPr>
               <w:pStyle w:val="Small"/>
-              <w:cnfStyle w:val="000000010000" w:firstRow="0" w:lastRow="0" w:firstColumn="0" w:lastColumn="0" w:oddVBand="0" w:evenVBand="0" w:oddHBand="0" w:evenHBand="1" w:firstRowFirstColumn="0" w:firstRowLastColumn="0" w:lastRowFirstColumn="0" w:lastRowLastColumn="0"/>
               <w:rPr>
                 <w:rFonts w:ascii="Myriad-Pro, Calibri, Arial" w:hAnsi="Myriad-Pro, Calibri, Arial"/>
                 <w:color w:val="auto"/>
@@ -1209,47 +1243,23 @@
                 <w:rFonts w:ascii="Myriad-Pro, Calibri, Arial" w:hAnsi="Myriad-Pro, Calibri, Arial"/>
                 <w:color w:val="auto"/>
               </w:rPr>
-              <w:t>[i+1].form}</w:t>
-            </w:r>
-          </w:p>
-        </w:tc>
-        <w:tc>
-          <w:tcPr>
-            <w:tcW w:w="1503" w:type="dxa"/>
-          </w:tcPr>
-          <w:p>
-            <w:pPr>
-              <w:pStyle w:val="Small"/>
-              <w:cnfStyle w:val="000000010000" w:firstRow="0" w:lastRow="0" w:firstColumn="0" w:lastColumn="0" w:oddVBand="0" w:evenVBand="0" w:oddHBand="0" w:evenHBand="1" w:firstRowFirstColumn="0" w:firstRowLastColumn="0" w:lastRowFirstColumn="0" w:lastRowLastColumn="0"/>
-              <w:rPr>
-                <w:rFonts w:ascii="Myriad-Pro, Calibri, Arial" w:hAnsi="Myriad-Pro, Calibri, Arial"/>
-                <w:color w:val="auto"/>
-              </w:rPr>
-            </w:pPr>
-            <w:r>
-              <w:rPr>
-                <w:rFonts w:ascii="Myriad-Pro, Calibri, Arial" w:hAnsi="Myriad-Pro, Calibri, Arial"/>
-                <w:color w:val="auto"/>
-              </w:rPr>
-              <w:t>{</w:t>
-            </w:r>
-            <w:proofErr w:type="spellStart"/>
-            <w:proofErr w:type="gramStart"/>
-            <w:r>
-              <w:rPr>
-                <w:rFonts w:ascii="Myriad-Pro, Calibri, Arial" w:hAnsi="Myriad-Pro, Calibri, Arial"/>
-                <w:color w:val="auto"/>
-              </w:rPr>
-              <w:t>d.records</w:t>
-            </w:r>
-            <w:proofErr w:type="spellEnd"/>
-            <w:proofErr w:type="gramEnd"/>
-            <w:r>
-              <w:rPr>
-                <w:rFonts w:ascii="Myriad-Pro, Calibri, Arial" w:hAnsi="Myriad-Pro, Calibri, Arial"/>
-                <w:color w:val="auto"/>
-              </w:rPr>
-              <w:t>[i+1].manufacturer}</w:t>
+              <w:t>[i+1</w:t>
+            </w:r>
+            <w:proofErr w:type="gramStart"/>
+            <w:r>
+              <w:rPr>
+                <w:rFonts w:ascii="Myriad-Pro, Calibri, Arial" w:hAnsi="Myriad-Pro, Calibri, Arial"/>
+                <w:color w:val="auto"/>
+              </w:rPr>
+              <w:t>].manufacturer</w:t>
+            </w:r>
+            <w:proofErr w:type="gramEnd"/>
+            <w:r>
+              <w:rPr>
+                <w:rFonts w:ascii="Myriad-Pro, Calibri, Arial" w:hAnsi="Myriad-Pro, Calibri, Arial"/>
+                <w:color w:val="auto"/>
+              </w:rPr>
+              <w:t>}</w:t>
             </w:r>
           </w:p>
         </w:tc>
@@ -1271,21 +1281,12 @@
         <w:t>{</w:t>
       </w:r>
       <w:proofErr w:type="spellStart"/>
-      <w:proofErr w:type="gramStart"/>
       <w:r>
         <w:rPr>
           <w:rFonts w:ascii="Myriad-Pro, Calibri, Arial" w:hAnsi="Myriad-Pro, Calibri, Arial"/>
           <w:color w:val="000000" w:themeColor="text1"/>
         </w:rPr>
-        <w:t>d.records</w:t>
-      </w:r>
-      <w:proofErr w:type="gramEnd"/>
-      <w:r>
-        <w:rPr>
-          <w:rFonts w:ascii="Myriad-Pro, Calibri, Arial" w:hAnsi="Myriad-Pro, Calibri, Arial"/>
-          <w:color w:val="000000" w:themeColor="text1"/>
-        </w:rPr>
-        <w:t>:ifEM</w:t>
+        <w:t>d.records:ifEM</w:t>
       </w:r>
       <w:proofErr w:type="spellEnd"/>
       <w:r>
@@ -1312,12 +1313,21 @@
         <w:t>}No records found.{</w:t>
       </w:r>
       <w:proofErr w:type="spellStart"/>
+      <w:proofErr w:type="gramStart"/>
       <w:r>
         <w:rPr>
           <w:rFonts w:ascii="Myriad-Pro, Calibri, Arial" w:hAnsi="Myriad-Pro, Calibri, Arial"/>
           <w:color w:val="000000" w:themeColor="text1"/>
         </w:rPr>
-        <w:t>d.records:showEnd</w:t>
+        <w:t>d.records</w:t>
+      </w:r>
+      <w:proofErr w:type="gramEnd"/>
+      <w:r>
+        <w:rPr>
+          <w:rFonts w:ascii="Myriad-Pro, Calibri, Arial" w:hAnsi="Myriad-Pro, Calibri, Arial"/>
+          <w:color w:val="000000" w:themeColor="text1"/>
+        </w:rPr>
+        <w:t>:showEnd</w:t>
       </w:r>
       <w:proofErr w:type="spellEnd"/>
       <w:r>
@@ -1342,7 +1352,7 @@
 </file>
 
 <file path=word/endnotes.xml><?xml version="1.0" encoding="utf-8"?>
-<w:endnotes xmlns:wpc="http://schemas.microsoft.com/office/word/2010/wordprocessingCanvas" xmlns:cx="http://schemas.microsoft.com/office/drawing/2014/chartex" xmlns:cx1="http://schemas.microsoft.com/office/drawing/2015/9/8/chartex" xmlns:cx2="http://schemas.microsoft.com/office/drawing/2015/10/21/chartex" xmlns:cx3="http://schemas.microsoft.com/office/drawing/2016/5/9/chartex" xmlns:cx4="http://schemas.microsoft.com/office/drawing/2016/5/10/chartex" xmlns:cx5="http://schemas.microsoft.com/office/drawing/2016/5/11/chartex" xmlns:cx6="http://schemas.microsoft.com/office/drawing/2016/5/12/chartex" xmlns:cx7="http://schemas.microsoft.com/office/drawing/2016/5/13/chartex" xmlns:cx8="http://schemas.microsoft.com/office/drawing/2016/5/14/chartex" xmlns:mc="http://schemas.openxmlformats.org/markup-compatibility/2006" xmlns:aink="http://schemas.microsoft.com/office/drawing/2016/ink" xmlns:am3d="http://schemas.microsoft.com/office/drawing/2017/model3d" xmlns:o="urn:schemas-microsoft-com:office:office" xmlns:oel="http://schemas.microsoft.com/office/2019/extlst" xmlns:r="http://schemas.openxmlformats.org/officeDocument/2006/relationships" xmlns:m="http://schemas.openxmlformats.org/officeDocument/2006/math" xmlns:v="urn:schemas-microsoft-com:vml" xmlns:wp14="http://schemas.microsoft.com/office/word/2010/wordprocessingDrawing" xmlns:wp="http://schemas.openxmlformats.org/drawingml/2006/wordprocessingDrawing" xmlns:w10="urn:schemas-microsoft-com:office:word" xmlns:w="http://schemas.openxmlformats.org/wordprocessingml/2006/main" xmlns:w14="http://schemas.microsoft.com/office/word/2010/wordml" xmlns:w15="http://schemas.microsoft.com/office/word/2012/wordml" xmlns:w16cex="http://schemas.microsoft.com/office/word/2018/wordml/cex" xmlns:w16cid="http://schemas.microsoft.com/office/word/2016/wordml/cid" xmlns:w16="http://schemas.microsoft.com/office/word/2018/wordml" xmlns:w16du="http://schemas.microsoft.com/office/word/2023/wordml/word16du" xmlns:w16sdtdh="http://schemas.microsoft.com/office/word/2020/wordml/sdtdatahash" xmlns:w16se="http://schemas.microsoft.com/office/word/2015/wordml/symex" xmlns:wpg="http://schemas.microsoft.com/office/word/2010/wordprocessingGroup" xmlns:wpi="http://schemas.microsoft.com/office/word/2010/wordprocessingInk" xmlns:wne="http://schemas.microsoft.com/office/word/2006/wordml" xmlns:wps="http://schemas.microsoft.com/office/word/2010/wordprocessingShape" mc:Ignorable="w14 w15 w16se w16cid w16 w16cex w16sdtdh w16du wp14">
+<w:endnotes xmlns:wpc="http://schemas.microsoft.com/office/word/2010/wordprocessingCanvas" xmlns:cx="http://schemas.microsoft.com/office/drawing/2014/chartex" xmlns:cx1="http://schemas.microsoft.com/office/drawing/2015/9/8/chartex" xmlns:cx2="http://schemas.microsoft.com/office/drawing/2015/10/21/chartex" xmlns:cx3="http://schemas.microsoft.com/office/drawing/2016/5/9/chartex" xmlns:cx4="http://schemas.microsoft.com/office/drawing/2016/5/10/chartex" xmlns:cx5="http://schemas.microsoft.com/office/drawing/2016/5/11/chartex" xmlns:cx6="http://schemas.microsoft.com/office/drawing/2016/5/12/chartex" xmlns:cx7="http://schemas.microsoft.com/office/drawing/2016/5/13/chartex" xmlns:cx8="http://schemas.microsoft.com/office/drawing/2016/5/14/chartex" xmlns:mc="http://schemas.openxmlformats.org/markup-compatibility/2006" xmlns:aink="http://schemas.microsoft.com/office/drawing/2016/ink" xmlns:am3d="http://schemas.microsoft.com/office/drawing/2017/model3d" xmlns:o="urn:schemas-microsoft-com:office:office" xmlns:oel="http://schemas.microsoft.com/office/2019/extlst" xmlns:r="http://schemas.openxmlformats.org/officeDocument/2006/relationships" xmlns:m="http://schemas.openxmlformats.org/officeDocument/2006/math" xmlns:v="urn:schemas-microsoft-com:vml" xmlns:wp14="http://schemas.microsoft.com/office/word/2010/wordprocessingDrawing" xmlns:wp="http://schemas.openxmlformats.org/drawingml/2006/wordprocessingDrawing" xmlns:w10="urn:schemas-microsoft-com:office:word" xmlns:w="http://schemas.openxmlformats.org/wordprocessingml/2006/main" xmlns:w14="http://schemas.microsoft.com/office/word/2010/wordml" xmlns:w15="http://schemas.microsoft.com/office/word/2012/wordml" xmlns:w16cex="http://schemas.microsoft.com/office/word/2018/wordml/cex" xmlns:w16cid="http://schemas.microsoft.com/office/word/2016/wordml/cid" xmlns:w16="http://schemas.microsoft.com/office/word/2018/wordml" xmlns:w16du="http://schemas.microsoft.com/office/word/2023/wordml/word16du" xmlns:w16sdtdh="http://schemas.microsoft.com/office/word/2020/wordml/sdtdatahash" xmlns:w16sdtfl="http://schemas.microsoft.com/office/word/2024/wordml/sdtformatlock" xmlns:w16se="http://schemas.microsoft.com/office/word/2015/wordml/symex" xmlns:wpg="http://schemas.microsoft.com/office/word/2010/wordprocessingGroup" xmlns:wpi="http://schemas.microsoft.com/office/word/2010/wordprocessingInk" xmlns:wne="http://schemas.microsoft.com/office/word/2006/wordml" xmlns:wps="http://schemas.microsoft.com/office/word/2010/wordprocessingShape" mc:Ignorable="w14 w15 w16se w16cid w16 w16cex w16sdtdh w16sdtfl w16du wp14">
   <w:endnote w:type="separator" w:id="-1">
     <w:p>
       <w:r>
@@ -1361,7 +1371,7 @@
 </file>
 
 <file path=word/footer1.xml><?xml version="1.0" encoding="utf-8"?>
-<w:ftr xmlns:wpc="http://schemas.microsoft.com/office/word/2010/wordprocessingCanvas" xmlns:cx="http://schemas.microsoft.com/office/drawing/2014/chartex" xmlns:cx1="http://schemas.microsoft.com/office/drawing/2015/9/8/chartex" xmlns:cx2="http://schemas.microsoft.com/office/drawing/2015/10/21/chartex" xmlns:cx3="http://schemas.microsoft.com/office/drawing/2016/5/9/chartex" xmlns:cx4="http://schemas.microsoft.com/office/drawing/2016/5/10/chartex" xmlns:cx5="http://schemas.microsoft.com/office/drawing/2016/5/11/chartex" xmlns:cx6="http://schemas.microsoft.com/office/drawing/2016/5/12/chartex" xmlns:cx7="http://schemas.microsoft.com/office/drawing/2016/5/13/chartex" xmlns:cx8="http://schemas.microsoft.com/office/drawing/2016/5/14/chartex" xmlns:mc="http://schemas.openxmlformats.org/markup-compatibility/2006" xmlns:aink="http://schemas.microsoft.com/office/drawing/2016/ink" xmlns:am3d="http://schemas.microsoft.com/office/drawing/2017/model3d" xmlns:o="urn:schemas-microsoft-com:office:office" xmlns:oel="http://schemas.microsoft.com/office/2019/extlst" xmlns:r="http://schemas.openxmlformats.org/officeDocument/2006/relationships" xmlns:m="http://schemas.openxmlformats.org/officeDocument/2006/math" xmlns:v="urn:schemas-microsoft-com:vml" xmlns:wp14="http://schemas.microsoft.com/office/word/2010/wordprocessingDrawing" xmlns:wp="http://schemas.openxmlformats.org/drawingml/2006/wordprocessingDrawing" xmlns:w10="urn:schemas-microsoft-com:office:word" xmlns:w="http://schemas.openxmlformats.org/wordprocessingml/2006/main" xmlns:w14="http://schemas.microsoft.com/office/word/2010/wordml" xmlns:w15="http://schemas.microsoft.com/office/word/2012/wordml" xmlns:w16cex="http://schemas.microsoft.com/office/word/2018/wordml/cex" xmlns:w16cid="http://schemas.microsoft.com/office/word/2016/wordml/cid" xmlns:w16="http://schemas.microsoft.com/office/word/2018/wordml" xmlns:w16du="http://schemas.microsoft.com/office/word/2023/wordml/word16du" xmlns:w16sdtdh="http://schemas.microsoft.com/office/word/2020/wordml/sdtdatahash" xmlns:w16se="http://schemas.microsoft.com/office/word/2015/wordml/symex" xmlns:wpg="http://schemas.microsoft.com/office/word/2010/wordprocessingGroup" xmlns:wpi="http://schemas.microsoft.com/office/word/2010/wordprocessingInk" xmlns:wne="http://schemas.microsoft.com/office/word/2006/wordml" xmlns:wps="http://schemas.microsoft.com/office/word/2010/wordprocessingShape" mc:Ignorable="w14 w15 w16se w16cid w16 w16cex w16sdtdh w16du wp14">
+<w:ftr xmlns:wpc="http://schemas.microsoft.com/office/word/2010/wordprocessingCanvas" xmlns:cx="http://schemas.microsoft.com/office/drawing/2014/chartex" xmlns:cx1="http://schemas.microsoft.com/office/drawing/2015/9/8/chartex" xmlns:cx2="http://schemas.microsoft.com/office/drawing/2015/10/21/chartex" xmlns:cx3="http://schemas.microsoft.com/office/drawing/2016/5/9/chartex" xmlns:cx4="http://schemas.microsoft.com/office/drawing/2016/5/10/chartex" xmlns:cx5="http://schemas.microsoft.com/office/drawing/2016/5/11/chartex" xmlns:cx6="http://schemas.microsoft.com/office/drawing/2016/5/12/chartex" xmlns:cx7="http://schemas.microsoft.com/office/drawing/2016/5/13/chartex" xmlns:cx8="http://schemas.microsoft.com/office/drawing/2016/5/14/chartex" xmlns:mc="http://schemas.openxmlformats.org/markup-compatibility/2006" xmlns:aink="http://schemas.microsoft.com/office/drawing/2016/ink" xmlns:am3d="http://schemas.microsoft.com/office/drawing/2017/model3d" xmlns:o="urn:schemas-microsoft-com:office:office" xmlns:oel="http://schemas.microsoft.com/office/2019/extlst" xmlns:r="http://schemas.openxmlformats.org/officeDocument/2006/relationships" xmlns:m="http://schemas.openxmlformats.org/officeDocument/2006/math" xmlns:v="urn:schemas-microsoft-com:vml" xmlns:wp14="http://schemas.microsoft.com/office/word/2010/wordprocessingDrawing" xmlns:wp="http://schemas.openxmlformats.org/drawingml/2006/wordprocessingDrawing" xmlns:w10="urn:schemas-microsoft-com:office:word" xmlns:w="http://schemas.openxmlformats.org/wordprocessingml/2006/main" xmlns:w14="http://schemas.microsoft.com/office/word/2010/wordml" xmlns:w15="http://schemas.microsoft.com/office/word/2012/wordml" xmlns:w16cex="http://schemas.microsoft.com/office/word/2018/wordml/cex" xmlns:w16cid="http://schemas.microsoft.com/office/word/2016/wordml/cid" xmlns:w16="http://schemas.microsoft.com/office/word/2018/wordml" xmlns:w16du="http://schemas.microsoft.com/office/word/2023/wordml/word16du" xmlns:w16sdtdh="http://schemas.microsoft.com/office/word/2020/wordml/sdtdatahash" xmlns:w16sdtfl="http://schemas.microsoft.com/office/word/2024/wordml/sdtformatlock" xmlns:w16se="http://schemas.microsoft.com/office/word/2015/wordml/symex" xmlns:wpg="http://schemas.microsoft.com/office/word/2010/wordprocessingGroup" xmlns:wpi="http://schemas.microsoft.com/office/word/2010/wordprocessingInk" xmlns:wne="http://schemas.microsoft.com/office/word/2006/wordml" xmlns:wps="http://schemas.microsoft.com/office/word/2010/wordprocessingShape" mc:Ignorable="w14 w15 w16se w16cid w16 w16cex w16sdtdh w16sdtfl w16du wp14">
   <w:p>
     <w:pPr>
       <w:pStyle w:val="Footer"/>
@@ -1372,7 +1382,7 @@
 </file>
 
 <file path=word/footer2.xml><?xml version="1.0" encoding="utf-8"?>
-<w:ftr xmlns:wpc="http://schemas.microsoft.com/office/word/2010/wordprocessingCanvas" xmlns:cx="http://schemas.microsoft.com/office/drawing/2014/chartex" xmlns:cx1="http://schemas.microsoft.com/office/drawing/2015/9/8/chartex" xmlns:cx2="http://schemas.microsoft.com/office/drawing/2015/10/21/chartex" xmlns:cx3="http://schemas.microsoft.com/office/drawing/2016/5/9/chartex" xmlns:cx4="http://schemas.microsoft.com/office/drawing/2016/5/10/chartex" xmlns:cx5="http://schemas.microsoft.com/office/drawing/2016/5/11/chartex" xmlns:cx6="http://schemas.microsoft.com/office/drawing/2016/5/12/chartex" xmlns:cx7="http://schemas.microsoft.com/office/drawing/2016/5/13/chartex" xmlns:cx8="http://schemas.microsoft.com/office/drawing/2016/5/14/chartex" xmlns:mc="http://schemas.openxmlformats.org/markup-compatibility/2006" xmlns:aink="http://schemas.microsoft.com/office/drawing/2016/ink" xmlns:am3d="http://schemas.microsoft.com/office/drawing/2017/model3d" xmlns:o="urn:schemas-microsoft-com:office:office" xmlns:oel="http://schemas.microsoft.com/office/2019/extlst" xmlns:r="http://schemas.openxmlformats.org/officeDocument/2006/relationships" xmlns:m="http://schemas.openxmlformats.org/officeDocument/2006/math" xmlns:v="urn:schemas-microsoft-com:vml" xmlns:wp14="http://schemas.microsoft.com/office/word/2010/wordprocessingDrawing" xmlns:wp="http://schemas.openxmlformats.org/drawingml/2006/wordprocessingDrawing" xmlns:w10="urn:schemas-microsoft-com:office:word" xmlns:w="http://schemas.openxmlformats.org/wordprocessingml/2006/main" xmlns:w14="http://schemas.microsoft.com/office/word/2010/wordml" xmlns:w15="http://schemas.microsoft.com/office/word/2012/wordml" xmlns:w16cex="http://schemas.microsoft.com/office/word/2018/wordml/cex" xmlns:w16cid="http://schemas.microsoft.com/office/word/2016/wordml/cid" xmlns:w16="http://schemas.microsoft.com/office/word/2018/wordml" xmlns:w16du="http://schemas.microsoft.com/office/word/2023/wordml/word16du" xmlns:w16sdtdh="http://schemas.microsoft.com/office/word/2020/wordml/sdtdatahash" xmlns:w16se="http://schemas.microsoft.com/office/word/2015/wordml/symex" xmlns:wpg="http://schemas.microsoft.com/office/word/2010/wordprocessingGroup" xmlns:wpi="http://schemas.microsoft.com/office/word/2010/wordprocessingInk" xmlns:wne="http://schemas.microsoft.com/office/word/2006/wordml" xmlns:wps="http://schemas.microsoft.com/office/word/2010/wordprocessingShape" mc:Ignorable="w14 w15 w16se w16cid w16 w16cex w16sdtdh w16du wp14">
+<w:ftr xmlns:wpc="http://schemas.microsoft.com/office/word/2010/wordprocessingCanvas" xmlns:cx="http://schemas.microsoft.com/office/drawing/2014/chartex" xmlns:cx1="http://schemas.microsoft.com/office/drawing/2015/9/8/chartex" xmlns:cx2="http://schemas.microsoft.com/office/drawing/2015/10/21/chartex" xmlns:cx3="http://schemas.microsoft.com/office/drawing/2016/5/9/chartex" xmlns:cx4="http://schemas.microsoft.com/office/drawing/2016/5/10/chartex" xmlns:cx5="http://schemas.microsoft.com/office/drawing/2016/5/11/chartex" xmlns:cx6="http://schemas.microsoft.com/office/drawing/2016/5/12/chartex" xmlns:cx7="http://schemas.microsoft.com/office/drawing/2016/5/13/chartex" xmlns:cx8="http://schemas.microsoft.com/office/drawing/2016/5/14/chartex" xmlns:mc="http://schemas.openxmlformats.org/markup-compatibility/2006" xmlns:aink="http://schemas.microsoft.com/office/drawing/2016/ink" xmlns:am3d="http://schemas.microsoft.com/office/drawing/2017/model3d" xmlns:o="urn:schemas-microsoft-com:office:office" xmlns:oel="http://schemas.microsoft.com/office/2019/extlst" xmlns:r="http://schemas.openxmlformats.org/officeDocument/2006/relationships" xmlns:m="http://schemas.openxmlformats.org/officeDocument/2006/math" xmlns:v="urn:schemas-microsoft-com:vml" xmlns:wp14="http://schemas.microsoft.com/office/word/2010/wordprocessingDrawing" xmlns:wp="http://schemas.openxmlformats.org/drawingml/2006/wordprocessingDrawing" xmlns:w10="urn:schemas-microsoft-com:office:word" xmlns:w="http://schemas.openxmlformats.org/wordprocessingml/2006/main" xmlns:w14="http://schemas.microsoft.com/office/word/2010/wordml" xmlns:w15="http://schemas.microsoft.com/office/word/2012/wordml" xmlns:w16cex="http://schemas.microsoft.com/office/word/2018/wordml/cex" xmlns:w16cid="http://schemas.microsoft.com/office/word/2016/wordml/cid" xmlns:w16="http://schemas.microsoft.com/office/word/2018/wordml" xmlns:w16du="http://schemas.microsoft.com/office/word/2023/wordml/word16du" xmlns:w16sdtdh="http://schemas.microsoft.com/office/word/2020/wordml/sdtdatahash" xmlns:w16sdtfl="http://schemas.microsoft.com/office/word/2024/wordml/sdtformatlock" xmlns:w16se="http://schemas.microsoft.com/office/word/2015/wordml/symex" xmlns:wpg="http://schemas.microsoft.com/office/word/2010/wordprocessingGroup" xmlns:wpi="http://schemas.microsoft.com/office/word/2010/wordprocessingInk" xmlns:wne="http://schemas.microsoft.com/office/word/2006/wordml" xmlns:wps="http://schemas.microsoft.com/office/word/2010/wordprocessingShape" mc:Ignorable="w14 w15 w16se w16cid w16 w16cex w16sdtdh w16sdtfl w16du wp14">
   <w:sdt>
     <w:sdtPr>
       <w:id w:val="-786121602"/>
@@ -1404,27 +1414,11 @@
           </w:rPr>
           <w:t xml:space="preserve"> {</w:t>
         </w:r>
-        <w:proofErr w:type="spellStart"/>
-        <w:proofErr w:type="gramStart"/>
         <w:r>
           <w:rPr>
             <w:rFonts w:ascii="Myriad-Pro, Calibri, Arial" w:hAnsi="Myriad-Pro, Calibri, Arial"/>
           </w:rPr>
-          <w:t>d.header</w:t>
-        </w:r>
-        <w:proofErr w:type="gramEnd"/>
-        <w:r>
-          <w:rPr>
-            <w:rFonts w:ascii="Myriad-Pro, Calibri, Arial" w:hAnsi="Myriad-Pro, Calibri, Arial"/>
-          </w:rPr>
-          <w:t>.datePrinted</w:t>
-        </w:r>
-        <w:proofErr w:type="spellEnd"/>
-        <w:r>
-          <w:rPr>
-            <w:rFonts w:ascii="Myriad-Pro, Calibri, Arial" w:hAnsi="Myriad-Pro, Calibri, Arial"/>
-          </w:rPr>
-          <w:t>}</w:t>
+          <w:t>d.header.datePrinted}</w:t>
         </w:r>
         <w:r>
           <w:rPr>
@@ -1523,7 +1517,7 @@
 </file>
 
 <file path=word/footnotes.xml><?xml version="1.0" encoding="utf-8"?>
-<w:footnotes xmlns:wpc="http://schemas.microsoft.com/office/word/2010/wordprocessingCanvas" xmlns:cx="http://schemas.microsoft.com/office/drawing/2014/chartex" xmlns:cx1="http://schemas.microsoft.com/office/drawing/2015/9/8/chartex" xmlns:cx2="http://schemas.microsoft.com/office/drawing/2015/10/21/chartex" xmlns:cx3="http://schemas.microsoft.com/office/drawing/2016/5/9/chartex" xmlns:cx4="http://schemas.microsoft.com/office/drawing/2016/5/10/chartex" xmlns:cx5="http://schemas.microsoft.com/office/drawing/2016/5/11/chartex" xmlns:cx6="http://schemas.microsoft.com/office/drawing/2016/5/12/chartex" xmlns:cx7="http://schemas.microsoft.com/office/drawing/2016/5/13/chartex" xmlns:cx8="http://schemas.microsoft.com/office/drawing/2016/5/14/chartex" xmlns:mc="http://schemas.openxmlformats.org/markup-compatibility/2006" xmlns:aink="http://schemas.microsoft.com/office/drawing/2016/ink" xmlns:am3d="http://schemas.microsoft.com/office/drawing/2017/model3d" xmlns:o="urn:schemas-microsoft-com:office:office" xmlns:oel="http://schemas.microsoft.com/office/2019/extlst" xmlns:r="http://schemas.openxmlformats.org/officeDocument/2006/relationships" xmlns:m="http://schemas.openxmlformats.org/officeDocument/2006/math" xmlns:v="urn:schemas-microsoft-com:vml" xmlns:wp14="http://schemas.microsoft.com/office/word/2010/wordprocessingDrawing" xmlns:wp="http://schemas.openxmlformats.org/drawingml/2006/wordprocessingDrawing" xmlns:w10="urn:schemas-microsoft-com:office:word" xmlns:w="http://schemas.openxmlformats.org/wordprocessingml/2006/main" xmlns:w14="http://schemas.microsoft.com/office/word/2010/wordml" xmlns:w15="http://schemas.microsoft.com/office/word/2012/wordml" xmlns:w16cex="http://schemas.microsoft.com/office/word/2018/wordml/cex" xmlns:w16cid="http://schemas.microsoft.com/office/word/2016/wordml/cid" xmlns:w16="http://schemas.microsoft.com/office/word/2018/wordml" xmlns:w16du="http://schemas.microsoft.com/office/word/2023/wordml/word16du" xmlns:w16sdtdh="http://schemas.microsoft.com/office/word/2020/wordml/sdtdatahash" xmlns:w16se="http://schemas.microsoft.com/office/word/2015/wordml/symex" xmlns:wpg="http://schemas.microsoft.com/office/word/2010/wordprocessingGroup" xmlns:wpi="http://schemas.microsoft.com/office/word/2010/wordprocessingInk" xmlns:wne="http://schemas.microsoft.com/office/word/2006/wordml" xmlns:wps="http://schemas.microsoft.com/office/word/2010/wordprocessingShape" mc:Ignorable="w14 w15 w16se w16cid w16 w16cex w16sdtdh w16du wp14">
+<w:footnotes xmlns:wpc="http://schemas.microsoft.com/office/word/2010/wordprocessingCanvas" xmlns:cx="http://schemas.microsoft.com/office/drawing/2014/chartex" xmlns:cx1="http://schemas.microsoft.com/office/drawing/2015/9/8/chartex" xmlns:cx2="http://schemas.microsoft.com/office/drawing/2015/10/21/chartex" xmlns:cx3="http://schemas.microsoft.com/office/drawing/2016/5/9/chartex" xmlns:cx4="http://schemas.microsoft.com/office/drawing/2016/5/10/chartex" xmlns:cx5="http://schemas.microsoft.com/office/drawing/2016/5/11/chartex" xmlns:cx6="http://schemas.microsoft.com/office/drawing/2016/5/12/chartex" xmlns:cx7="http://schemas.microsoft.com/office/drawing/2016/5/13/chartex" xmlns:cx8="http://schemas.microsoft.com/office/drawing/2016/5/14/chartex" xmlns:mc="http://schemas.openxmlformats.org/markup-compatibility/2006" xmlns:aink="http://schemas.microsoft.com/office/drawing/2016/ink" xmlns:am3d="http://schemas.microsoft.com/office/drawing/2017/model3d" xmlns:o="urn:schemas-microsoft-com:office:office" xmlns:oel="http://schemas.microsoft.com/office/2019/extlst" xmlns:r="http://schemas.openxmlformats.org/officeDocument/2006/relationships" xmlns:m="http://schemas.openxmlformats.org/officeDocument/2006/math" xmlns:v="urn:schemas-microsoft-com:vml" xmlns:wp14="http://schemas.microsoft.com/office/word/2010/wordprocessingDrawing" xmlns:wp="http://schemas.openxmlformats.org/drawingml/2006/wordprocessingDrawing" xmlns:w10="urn:schemas-microsoft-com:office:word" xmlns:w="http://schemas.openxmlformats.org/wordprocessingml/2006/main" xmlns:w14="http://schemas.microsoft.com/office/word/2010/wordml" xmlns:w15="http://schemas.microsoft.com/office/word/2012/wordml" xmlns:w16cex="http://schemas.microsoft.com/office/word/2018/wordml/cex" xmlns:w16cid="http://schemas.microsoft.com/office/word/2016/wordml/cid" xmlns:w16="http://schemas.microsoft.com/office/word/2018/wordml" xmlns:w16du="http://schemas.microsoft.com/office/word/2023/wordml/word16du" xmlns:w16sdtdh="http://schemas.microsoft.com/office/word/2020/wordml/sdtdatahash" xmlns:w16sdtfl="http://schemas.microsoft.com/office/word/2024/wordml/sdtformatlock" xmlns:w16se="http://schemas.microsoft.com/office/word/2015/wordml/symex" xmlns:wpg="http://schemas.microsoft.com/office/word/2010/wordprocessingGroup" xmlns:wpi="http://schemas.microsoft.com/office/word/2010/wordprocessingInk" xmlns:wne="http://schemas.microsoft.com/office/word/2006/wordml" xmlns:wps="http://schemas.microsoft.com/office/word/2010/wordprocessingShape" mc:Ignorable="w14 w15 w16se w16cid w16 w16cex w16sdtdh w16sdtfl w16du wp14">
   <w:footnote w:type="separator" w:id="-1">
     <w:p>
       <w:r>
@@ -1542,7 +1536,7 @@
 </file>
 
 <file path=word/header1.xml><?xml version="1.0" encoding="utf-8"?>
-<w:hdr xmlns:wpc="http://schemas.microsoft.com/office/word/2010/wordprocessingCanvas" xmlns:cx="http://schemas.microsoft.com/office/drawing/2014/chartex" xmlns:cx1="http://schemas.microsoft.com/office/drawing/2015/9/8/chartex" xmlns:cx2="http://schemas.microsoft.com/office/drawing/2015/10/21/chartex" xmlns:cx3="http://schemas.microsoft.com/office/drawing/2016/5/9/chartex" xmlns:cx4="http://schemas.microsoft.com/office/drawing/2016/5/10/chartex" xmlns:cx5="http://schemas.microsoft.com/office/drawing/2016/5/11/chartex" xmlns:cx6="http://schemas.microsoft.com/office/drawing/2016/5/12/chartex" xmlns:cx7="http://schemas.microsoft.com/office/drawing/2016/5/13/chartex" xmlns:cx8="http://schemas.microsoft.com/office/drawing/2016/5/14/chartex" xmlns:mc="http://schemas.openxmlformats.org/markup-compatibility/2006" xmlns:aink="http://schemas.microsoft.com/office/drawing/2016/ink" xmlns:am3d="http://schemas.microsoft.com/office/drawing/2017/model3d" xmlns:o="urn:schemas-microsoft-com:office:office" xmlns:oel="http://schemas.microsoft.com/office/2019/extlst" xmlns:r="http://schemas.openxmlformats.org/officeDocument/2006/relationships" xmlns:m="http://schemas.openxmlformats.org/officeDocument/2006/math" xmlns:v="urn:schemas-microsoft-com:vml" xmlns:wp14="http://schemas.microsoft.com/office/word/2010/wordprocessingDrawing" xmlns:wp="http://schemas.openxmlformats.org/drawingml/2006/wordprocessingDrawing" xmlns:w10="urn:schemas-microsoft-com:office:word" xmlns:w="http://schemas.openxmlformats.org/wordprocessingml/2006/main" xmlns:w14="http://schemas.microsoft.com/office/word/2010/wordml" xmlns:w15="http://schemas.microsoft.com/office/word/2012/wordml" xmlns:w16cex="http://schemas.microsoft.com/office/word/2018/wordml/cex" xmlns:w16cid="http://schemas.microsoft.com/office/word/2016/wordml/cid" xmlns:w16="http://schemas.microsoft.com/office/word/2018/wordml" xmlns:w16du="http://schemas.microsoft.com/office/word/2023/wordml/word16du" xmlns:w16sdtdh="http://schemas.microsoft.com/office/word/2020/wordml/sdtdatahash" xmlns:w16se="http://schemas.microsoft.com/office/word/2015/wordml/symex" xmlns:wpg="http://schemas.microsoft.com/office/word/2010/wordprocessingGroup" xmlns:wpi="http://schemas.microsoft.com/office/word/2010/wordprocessingInk" xmlns:wne="http://schemas.microsoft.com/office/word/2006/wordml" xmlns:wps="http://schemas.microsoft.com/office/word/2010/wordprocessingShape" mc:Ignorable="w14 w15 w16se w16cid w16 w16cex w16sdtdh w16du wp14">
+<w:hdr xmlns:wpc="http://schemas.microsoft.com/office/word/2010/wordprocessingCanvas" xmlns:cx="http://schemas.microsoft.com/office/drawing/2014/chartex" xmlns:cx1="http://schemas.microsoft.com/office/drawing/2015/9/8/chartex" xmlns:cx2="http://schemas.microsoft.com/office/drawing/2015/10/21/chartex" xmlns:cx3="http://schemas.microsoft.com/office/drawing/2016/5/9/chartex" xmlns:cx4="http://schemas.microsoft.com/office/drawing/2016/5/10/chartex" xmlns:cx5="http://schemas.microsoft.com/office/drawing/2016/5/11/chartex" xmlns:cx6="http://schemas.microsoft.com/office/drawing/2016/5/12/chartex" xmlns:cx7="http://schemas.microsoft.com/office/drawing/2016/5/13/chartex" xmlns:cx8="http://schemas.microsoft.com/office/drawing/2016/5/14/chartex" xmlns:mc="http://schemas.openxmlformats.org/markup-compatibility/2006" xmlns:aink="http://schemas.microsoft.com/office/drawing/2016/ink" xmlns:am3d="http://schemas.microsoft.com/office/drawing/2017/model3d" xmlns:o="urn:schemas-microsoft-com:office:office" xmlns:oel="http://schemas.microsoft.com/office/2019/extlst" xmlns:r="http://schemas.openxmlformats.org/officeDocument/2006/relationships" xmlns:m="http://schemas.openxmlformats.org/officeDocument/2006/math" xmlns:v="urn:schemas-microsoft-com:vml" xmlns:wp14="http://schemas.microsoft.com/office/word/2010/wordprocessingDrawing" xmlns:wp="http://schemas.openxmlformats.org/drawingml/2006/wordprocessingDrawing" xmlns:w10="urn:schemas-microsoft-com:office:word" xmlns:w="http://schemas.openxmlformats.org/wordprocessingml/2006/main" xmlns:w14="http://schemas.microsoft.com/office/word/2010/wordml" xmlns:w15="http://schemas.microsoft.com/office/word/2012/wordml" xmlns:w16cex="http://schemas.microsoft.com/office/word/2018/wordml/cex" xmlns:w16cid="http://schemas.microsoft.com/office/word/2016/wordml/cid" xmlns:w16="http://schemas.microsoft.com/office/word/2018/wordml" xmlns:w16du="http://schemas.microsoft.com/office/word/2023/wordml/word16du" xmlns:w16sdtdh="http://schemas.microsoft.com/office/word/2020/wordml/sdtdatahash" xmlns:w16sdtfl="http://schemas.microsoft.com/office/word/2024/wordml/sdtformatlock" xmlns:w16se="http://schemas.microsoft.com/office/word/2015/wordml/symex" xmlns:wpg="http://schemas.microsoft.com/office/word/2010/wordprocessingGroup" xmlns:wpi="http://schemas.microsoft.com/office/word/2010/wordprocessingInk" xmlns:wne="http://schemas.microsoft.com/office/word/2006/wordml" xmlns:wps="http://schemas.microsoft.com/office/word/2010/wordprocessingShape" mc:Ignorable="w14 w15 w16se w16cid w16 w16cex w16sdtdh w16sdtfl w16du wp14">
   <w:tbl>
     <w:tblPr>
       <w:tblStyle w:val="TableGrid"/>
@@ -1654,8 +1648,6 @@
       </w:rPr>
       <w:t>{</w:t>
     </w:r>
-    <w:proofErr w:type="spellStart"/>
-    <w:proofErr w:type="gramStart"/>
     <w:r>
       <w:rPr>
         <w:rFonts w:ascii="Myriad-Pro, Calibri, Arial" w:hAnsi="Myriad-Pro, Calibri, Arial"/>
@@ -1666,14 +1658,7 @@
       <w:rPr>
         <w:rFonts w:ascii="Myriad-Pro, Calibri, Arial" w:hAnsi="Myriad-Pro, Calibri, Arial"/>
       </w:rPr>
-      <w:t>header</w:t>
-    </w:r>
-    <w:proofErr w:type="gramEnd"/>
-    <w:r>
-      <w:rPr>
-        <w:rFonts w:ascii="Myriad-Pro, Calibri, Arial" w:hAnsi="Myriad-Pro, Calibri, Arial"/>
-      </w:rPr>
-      <w:t>.</w:t>
+      <w:t>header.</w:t>
     </w:r>
     <w:r>
       <w:rPr>
@@ -1685,34 +1670,13 @@
       <w:rPr>
         <w:rFonts w:ascii="Myriad-Pro, Calibri, Arial" w:hAnsi="Myriad-Pro, Calibri, Arial"/>
       </w:rPr>
-      <w:t>edacted:ifEQ</w:t>
-    </w:r>
-    <w:proofErr w:type="spellEnd"/>
-    <w:r>
-      <w:rPr>
-        <w:rFonts w:ascii="Myriad-Pro, Calibri, Arial" w:hAnsi="Myriad-Pro, Calibri, Arial"/>
-      </w:rPr>
-      <w:t>(true):</w:t>
-    </w:r>
-    <w:proofErr w:type="spellStart"/>
-    <w:r>
-      <w:rPr>
-        <w:rFonts w:ascii="Myriad-Pro, Calibri, Arial" w:hAnsi="Myriad-Pro, Calibri, Arial"/>
-      </w:rPr>
-      <w:t>show</w:t>
-    </w:r>
-    <w:r>
-      <w:rPr>
-        <w:rFonts w:ascii="Myriad-Pro, Calibri, Arial" w:hAnsi="Myriad-Pro, Calibri, Arial"/>
-      </w:rPr>
-      <w:t>Begin</w:t>
-    </w:r>
-    <w:proofErr w:type="spellEnd"/>
-    <w:r>
-      <w:rPr>
-        <w:rFonts w:ascii="Myriad-Pro, Calibri, Arial" w:hAnsi="Myriad-Pro, Calibri, Arial"/>
-      </w:rPr>
-      <w:t>}(</w:t>
+      <w:t>edacted:ifEQ(true):show</w:t>
+    </w:r>
+    <w:r>
+      <w:rPr>
+        <w:rFonts w:ascii="Myriad-Pro, Calibri, Arial" w:hAnsi="Myriad-Pro, Calibri, Arial"/>
+      </w:rPr>
+      <w:t>Begin}(</w:t>
     </w:r>
     <w:r>
       <w:rPr>
@@ -1732,7 +1696,6 @@
       </w:rPr>
       <w:t xml:space="preserve"> </w:t>
     </w:r>
-    <w:proofErr w:type="spellStart"/>
     <w:r>
       <w:rPr>
         <w:rFonts w:ascii="Myriad-Pro, Calibri, Arial" w:hAnsi="Myriad-Pro, Calibri, Arial"/>
@@ -1749,14 +1712,7 @@
       <w:rPr>
         <w:rFonts w:ascii="Myriad-Pro, Calibri, Arial" w:hAnsi="Myriad-Pro, Calibri, Arial"/>
       </w:rPr>
-      <w:t>edacted:showEnd</w:t>
-    </w:r>
-    <w:proofErr w:type="spellEnd"/>
-    <w:r>
-      <w:rPr>
-        <w:rFonts w:ascii="Myriad-Pro, Calibri, Arial" w:hAnsi="Myriad-Pro, Calibri, Arial"/>
-      </w:rPr>
-      <w:t>}</w:t>
+      <w:t>edacted:showEnd}</w:t>
     </w:r>
   </w:p>
   <w:p>
@@ -1862,14 +1818,7 @@
             <w:rPr>
               <w:rFonts w:ascii="Myriad-Pro, Calibri, Arial" w:hAnsi="Myriad-Pro, Calibri, Arial"/>
             </w:rPr>
-            <w:t xml:space="preserve"> {</w:t>
-          </w:r>
-          <w:proofErr w:type="gramStart"/>
-          <w:r>
-            <w:rPr>
-              <w:rFonts w:ascii="Myriad-Pro, Calibri, Arial" w:hAnsi="Myriad-Pro, Calibri, Arial"/>
-            </w:rPr>
-            <w:t>d.</w:t>
+            <w:t xml:space="preserve"> {d.</w:t>
           </w:r>
           <w:r>
             <w:rPr>
@@ -1881,14 +1830,7 @@
             <w:rPr>
               <w:rFonts w:ascii="Myriad-Pro, Calibri, Arial" w:hAnsi="Myriad-Pro, Calibri, Arial"/>
             </w:rPr>
-            <w:t>name</w:t>
-          </w:r>
-          <w:proofErr w:type="gramEnd"/>
-          <w:r>
-            <w:rPr>
-              <w:rFonts w:ascii="Myriad-Pro, Calibri, Arial" w:hAnsi="Myriad-Pro, Calibri, Arial"/>
-            </w:rPr>
-            <w:t>}</w:t>
+            <w:t>name}</w:t>
           </w:r>
         </w:p>
       </w:tc>
@@ -1914,14 +1856,7 @@
             <w:rPr>
               <w:rFonts w:ascii="Myriad-Pro, Calibri, Arial" w:hAnsi="Myriad-Pro, Calibri, Arial"/>
             </w:rPr>
-            <w:t xml:space="preserve"> {</w:t>
-          </w:r>
-          <w:proofErr w:type="spellStart"/>
-          <w:r>
-            <w:rPr>
-              <w:rFonts w:ascii="Myriad-Pro, Calibri, Arial" w:hAnsi="Myriad-Pro, Calibri, Arial"/>
-            </w:rPr>
-            <w:t>d.</w:t>
+            <w:t xml:space="preserve"> {d.</w:t>
           </w:r>
           <w:r>
             <w:rPr>
@@ -1935,7 +1870,6 @@
             </w:rPr>
             <w:t>.phn</w:t>
           </w:r>
-          <w:proofErr w:type="spellEnd"/>
           <w:r>
             <w:rPr>
               <w:rFonts w:ascii="Myriad-Pro, Calibri, Arial" w:hAnsi="Myriad-Pro, Calibri, Arial"/>
@@ -1966,15 +1900,7 @@
             <w:rPr>
               <w:rFonts w:ascii="Myriad-Pro, Calibri, Arial" w:hAnsi="Myriad-Pro, Calibri, Arial"/>
             </w:rPr>
-            <w:t xml:space="preserve"> {</w:t>
-          </w:r>
-          <w:proofErr w:type="spellStart"/>
-          <w:proofErr w:type="gramStart"/>
-          <w:r>
-            <w:rPr>
-              <w:rFonts w:ascii="Myriad-Pro, Calibri, Arial" w:hAnsi="Myriad-Pro, Calibri, Arial"/>
-            </w:rPr>
-            <w:t>d</w:t>
+            <w:t xml:space="preserve"> {d</w:t>
           </w:r>
           <w:r>
             <w:rPr>
@@ -1988,14 +1914,12 @@
             </w:rPr>
             <w:t>header</w:t>
           </w:r>
-          <w:proofErr w:type="gramEnd"/>
           <w:r>
             <w:rPr>
               <w:rFonts w:ascii="Myriad-Pro, Calibri, Arial" w:hAnsi="Myriad-Pro, Calibri, Arial"/>
             </w:rPr>
             <w:t>.dateOfBirth</w:t>
           </w:r>
-          <w:proofErr w:type="spellEnd"/>
           <w:r>
             <w:rPr>
               <w:rFonts w:ascii="Myriad-Pro, Calibri, Arial" w:hAnsi="Myriad-Pro, Calibri, Arial"/>
@@ -2022,17 +1946,15 @@
         <w:sz w:val="18"/>
         <w:szCs w:val="18"/>
       </w:rPr>
-      <w:t>{</w:t>
-    </w:r>
-    <w:proofErr w:type="spellStart"/>
-    <w:proofErr w:type="gramStart"/>
+      <w:t>{d</w:t>
+    </w:r>
     <w:r>
       <w:rPr>
         <w:rFonts w:ascii="Myriad-Pro, Calibri, Arial" w:hAnsi="Myriad-Pro, Calibri, Arial"/>
         <w:sz w:val="18"/>
         <w:szCs w:val="18"/>
       </w:rPr>
-      <w:t>d</w:t>
+      <w:t>.</w:t>
     </w:r>
     <w:r>
       <w:rPr>
@@ -2040,7 +1962,7 @@
         <w:sz w:val="18"/>
         <w:szCs w:val="18"/>
       </w:rPr>
-      <w:t>.</w:t>
+      <w:t>header</w:t>
     </w:r>
     <w:r>
       <w:rPr>
@@ -2048,16 +1970,15 @@
         <w:sz w:val="18"/>
         <w:szCs w:val="18"/>
       </w:rPr>
-      <w:t>header</w:t>
-    </w:r>
-    <w:proofErr w:type="gramEnd"/>
+      <w:t>.filterText</w:t>
+    </w:r>
     <w:r>
       <w:rPr>
         <w:rFonts w:ascii="Myriad-Pro, Calibri, Arial" w:hAnsi="Myriad-Pro, Calibri, Arial"/>
         <w:sz w:val="18"/>
         <w:szCs w:val="18"/>
       </w:rPr>
-      <w:t>.filterText</w:t>
+      <w:t>:ifNEM():showBegin</w:t>
     </w:r>
     <w:r>
       <w:rPr>
@@ -2065,34 +1986,31 @@
         <w:sz w:val="18"/>
         <w:szCs w:val="18"/>
       </w:rPr>
-      <w:t>:ifNEM</w:t>
-    </w:r>
-    <w:proofErr w:type="spellEnd"/>
+      <w:t>}</w:t>
+    </w:r>
     <w:r>
       <w:rPr>
         <w:rFonts w:ascii="Myriad-Pro, Calibri, Arial" w:hAnsi="Myriad-Pro, Calibri, Arial"/>
         <w:sz w:val="18"/>
         <w:szCs w:val="18"/>
       </w:rPr>
-      <w:t>():</w:t>
-    </w:r>
-    <w:proofErr w:type="spellStart"/>
+      <w:t>{d</w:t>
+    </w:r>
     <w:r>
       <w:rPr>
         <w:rFonts w:ascii="Myriad-Pro, Calibri, Arial" w:hAnsi="Myriad-Pro, Calibri, Arial"/>
         <w:sz w:val="18"/>
         <w:szCs w:val="18"/>
       </w:rPr>
-      <w:t>showBegin</w:t>
-    </w:r>
-    <w:proofErr w:type="spellEnd"/>
+      <w:t>.</w:t>
+    </w:r>
     <w:r>
       <w:rPr>
         <w:rFonts w:ascii="Myriad-Pro, Calibri, Arial" w:hAnsi="Myriad-Pro, Calibri, Arial"/>
         <w:sz w:val="18"/>
         <w:szCs w:val="18"/>
       </w:rPr>
-      <w:t>}</w:t>
+      <w:t>header</w:t>
     </w:r>
     <w:r>
       <w:rPr>
@@ -2100,50 +2018,16 @@
         <w:sz w:val="18"/>
         <w:szCs w:val="18"/>
       </w:rPr>
-      <w:t>{</w:t>
-    </w:r>
-    <w:proofErr w:type="spellStart"/>
+      <w:t>.</w:t>
+    </w:r>
     <w:r>
       <w:rPr>
         <w:rFonts w:ascii="Myriad-Pro, Calibri, Arial" w:hAnsi="Myriad-Pro, Calibri, Arial"/>
         <w:sz w:val="18"/>
         <w:szCs w:val="18"/>
       </w:rPr>
-      <w:t>d</w:t>
-    </w:r>
-    <w:r>
-      <w:rPr>
-        <w:rFonts w:ascii="Myriad-Pro, Calibri, Arial" w:hAnsi="Myriad-Pro, Calibri, Arial"/>
-        <w:sz w:val="18"/>
-        <w:szCs w:val="18"/>
-      </w:rPr>
-      <w:t>.</w:t>
-    </w:r>
-    <w:r>
-      <w:rPr>
-        <w:rFonts w:ascii="Myriad-Pro, Calibri, Arial" w:hAnsi="Myriad-Pro, Calibri, Arial"/>
-        <w:sz w:val="18"/>
-        <w:szCs w:val="18"/>
-      </w:rPr>
-      <w:t>header</w:t>
-    </w:r>
-    <w:r>
-      <w:rPr>
-        <w:rFonts w:ascii="Myriad-Pro, Calibri, Arial" w:hAnsi="Myriad-Pro, Calibri, Arial"/>
-        <w:sz w:val="18"/>
-        <w:szCs w:val="18"/>
-      </w:rPr>
-      <w:t>.</w:t>
-    </w:r>
-    <w:r>
-      <w:rPr>
-        <w:rFonts w:ascii="Myriad-Pro, Calibri, Arial" w:hAnsi="Myriad-Pro, Calibri, Arial"/>
-        <w:sz w:val="18"/>
-        <w:szCs w:val="18"/>
-      </w:rPr>
       <w:t>filterText</w:t>
     </w:r>
-    <w:proofErr w:type="spellEnd"/>
     <w:r>
       <w:rPr>
         <w:rFonts w:ascii="Myriad-Pro, Calibri, Arial" w:hAnsi="Myriad-Pro, Calibri, Arial"/>
@@ -2164,42 +2048,14 @@
         <w:sz w:val="18"/>
         <w:szCs w:val="18"/>
       </w:rPr>
-      <w:t>{</w:t>
-    </w:r>
-    <w:proofErr w:type="spellStart"/>
-    <w:proofErr w:type="gramStart"/>
-    <w:r>
-      <w:rPr>
-        <w:rFonts w:ascii="Myriad-Pro, Calibri, Arial" w:hAnsi="Myriad-Pro, Calibri, Arial"/>
-        <w:sz w:val="18"/>
-        <w:szCs w:val="18"/>
-      </w:rPr>
-      <w:t>d.header</w:t>
-    </w:r>
-    <w:proofErr w:type="gramEnd"/>
-    <w:r>
-      <w:rPr>
-        <w:rFonts w:ascii="Myriad-Pro, Calibri, Arial" w:hAnsi="Myriad-Pro, Calibri, Arial"/>
-        <w:sz w:val="18"/>
-        <w:szCs w:val="18"/>
-      </w:rPr>
-      <w:t>.filterText:showEnd</w:t>
-    </w:r>
-    <w:proofErr w:type="spellEnd"/>
-    <w:r>
-      <w:rPr>
-        <w:rFonts w:ascii="Myriad-Pro, Calibri, Arial" w:hAnsi="Myriad-Pro, Calibri, Arial"/>
-        <w:sz w:val="18"/>
-        <w:szCs w:val="18"/>
-      </w:rPr>
-      <w:t>}</w:t>
+      <w:t>{d.header.filterText:showEnd}</w:t>
     </w:r>
   </w:p>
 </w:hdr>
 </file>
 
 <file path=word/styles.xml><?xml version="1.0" encoding="utf-8"?>
-<w:styles xmlns:mc="http://schemas.openxmlformats.org/markup-compatibility/2006" xmlns:r="http://schemas.openxmlformats.org/officeDocument/2006/relationships" xmlns:w="http://schemas.openxmlformats.org/wordprocessingml/2006/main" xmlns:w14="http://schemas.microsoft.com/office/word/2010/wordml" xmlns:w15="http://schemas.microsoft.com/office/word/2012/wordml" xmlns:w16cex="http://schemas.microsoft.com/office/word/2018/wordml/cex" xmlns:w16cid="http://schemas.microsoft.com/office/word/2016/wordml/cid" xmlns:w16="http://schemas.microsoft.com/office/word/2018/wordml" xmlns:w16du="http://schemas.microsoft.com/office/word/2023/wordml/word16du" xmlns:w16sdtdh="http://schemas.microsoft.com/office/word/2020/wordml/sdtdatahash" xmlns:w16se="http://schemas.microsoft.com/office/word/2015/wordml/symex" mc:Ignorable="w14 w15 w16se w16cid w16 w16cex w16sdtdh w16du">
+<w:styles xmlns:mc="http://schemas.openxmlformats.org/markup-compatibility/2006" xmlns:r="http://schemas.openxmlformats.org/officeDocument/2006/relationships" xmlns:w="http://schemas.openxmlformats.org/wordprocessingml/2006/main" xmlns:w14="http://schemas.microsoft.com/office/word/2010/wordml" xmlns:w15="http://schemas.microsoft.com/office/word/2012/wordml" xmlns:w16cex="http://schemas.microsoft.com/office/word/2018/wordml/cex" xmlns:w16cid="http://schemas.microsoft.com/office/word/2016/wordml/cid" xmlns:w16="http://schemas.microsoft.com/office/word/2018/wordml" xmlns:w16du="http://schemas.microsoft.com/office/word/2023/wordml/word16du" xmlns:w16sdtdh="http://schemas.microsoft.com/office/word/2020/wordml/sdtdatahash" xmlns:w16sdtfl="http://schemas.microsoft.com/office/word/2024/wordml/sdtformatlock" xmlns:w16se="http://schemas.microsoft.com/office/word/2015/wordml/symex" mc:Ignorable="w14 w15 w16se w16cid w16 w16cex w16sdtdh w16sdtfl w16du">
   <w:docDefaults>
     <w:rPrDefault>
       <w:rPr>

</xml_diff>

<commit_message>
Update medication timeline entry and report (DHSOHG-3326) AB#17031
</commit_message>
<xml_diff>
--- a/Apps/GatewayApi/src/Assets/Templates/MedicationReport.docx
+++ b/Apps/GatewayApi/src/Assets/Templates/MedicationReport.docx
@@ -5,19 +5,20 @@
     <w:tbl>
       <w:tblPr>
         <w:tblStyle w:val="HealthGatewayExportTable"/>
-        <w:tblW w:w="4433" w:type="pct"/>
+        <w:tblW w:w="5000" w:type="pct"/>
         <w:tblLayout w:type="fixed"/>
         <w:tblLook w:val="04A0" w:firstRow="1" w:lastRow="0" w:firstColumn="1" w:lastColumn="0" w:noHBand="0" w:noVBand="1"/>
       </w:tblPr>
       <w:tblGrid>
-        <w:gridCol w:w="1062"/>
-        <w:gridCol w:w="1181"/>
-        <w:gridCol w:w="1049"/>
-        <w:gridCol w:w="1189"/>
-        <w:gridCol w:w="1361"/>
+        <w:gridCol w:w="1265"/>
+        <w:gridCol w:w="975"/>
         <w:gridCol w:w="1222"/>
-        <w:gridCol w:w="1082"/>
-        <w:gridCol w:w="1429"/>
+        <w:gridCol w:w="1222"/>
+        <w:gridCol w:w="1222"/>
+        <w:gridCol w:w="1025"/>
+        <w:gridCol w:w="1138"/>
+        <w:gridCol w:w="1222"/>
+        <w:gridCol w:w="1509"/>
       </w:tblGrid>
       <w:tr>
         <w:trPr>
@@ -28,7 +29,7 @@
         </w:trPr>
         <w:tc>
           <w:tcPr>
-            <w:tcW w:w="2920" w:type="dxa"/>
+            <w:tcW w:w="1261" w:type="dxa"/>
           </w:tcPr>
           <w:p>
             <w:pPr>
@@ -58,7 +59,7 @@
         </w:tc>
         <w:tc>
           <w:tcPr>
-            <w:tcW w:w="3291" w:type="dxa"/>
+            <w:tcW w:w="971" w:type="dxa"/>
           </w:tcPr>
           <w:p>
             <w:pPr>
@@ -88,7 +89,7 @@
         </w:tc>
         <w:tc>
           <w:tcPr>
-            <w:tcW w:w="2876" w:type="dxa"/>
+            <w:tcW w:w="1217" w:type="dxa"/>
           </w:tcPr>
           <w:p>
             <w:pPr>
@@ -118,7 +119,7 @@
         </w:tc>
         <w:tc>
           <w:tcPr>
-            <w:tcW w:w="3314" w:type="dxa"/>
+            <w:tcW w:w="1217" w:type="dxa"/>
           </w:tcPr>
           <w:p>
             <w:pPr>
@@ -148,7 +149,7 @@
         </w:tc>
         <w:tc>
           <w:tcPr>
-            <w:tcW w:w="3853" w:type="dxa"/>
+            <w:tcW w:w="1217" w:type="dxa"/>
           </w:tcPr>
           <w:p>
             <w:pPr>
@@ -178,7 +179,7 @@
         </w:tc>
         <w:tc>
           <w:tcPr>
-            <w:tcW w:w="3419" w:type="dxa"/>
+            <w:tcW w:w="1021" w:type="dxa"/>
           </w:tcPr>
           <w:p>
             <w:pPr>
@@ -208,7 +209,7 @@
         </w:tc>
         <w:tc>
           <w:tcPr>
-            <w:tcW w:w="2982" w:type="dxa"/>
+            <w:tcW w:w="1134" w:type="dxa"/>
           </w:tcPr>
           <w:p>
             <w:pPr>
@@ -232,13 +233,43 @@
                 <w:sz w:val="14"/>
                 <w:szCs w:val="14"/>
               </w:rPr>
-              <w:t>Form</w:t>
+              <w:t>Strength</w:t>
             </w:r>
           </w:p>
         </w:tc>
         <w:tc>
           <w:tcPr>
-            <w:tcW w:w="4066" w:type="dxa"/>
+            <w:tcW w:w="1217" w:type="dxa"/>
+          </w:tcPr>
+          <w:p>
+            <w:pPr>
+              <w:rPr>
+                <w:rStyle w:val="Strong"/>
+                <w:rFonts w:ascii="Myriad-Pro, Calibri, Arial" w:hAnsi="Myriad-Pro, Calibri, Arial"/>
+                <w:b/>
+                <w:bCs w:val="0"/>
+                <w:color w:val="auto"/>
+                <w:sz w:val="14"/>
+                <w:szCs w:val="14"/>
+              </w:rPr>
+            </w:pPr>
+            <w:r>
+              <w:rPr>
+                <w:rStyle w:val="Strong"/>
+                <w:rFonts w:ascii="Myriad-Pro, Calibri, Arial" w:hAnsi="Myriad-Pro, Calibri, Arial"/>
+                <w:b/>
+                <w:bCs w:val="0"/>
+                <w:color w:val="auto"/>
+                <w:sz w:val="14"/>
+                <w:szCs w:val="14"/>
+              </w:rPr>
+              <w:t>Form</w:t>
+            </w:r>
+          </w:p>
+        </w:tc>
+        <w:tc>
+          <w:tcPr>
+            <w:tcW w:w="1503" w:type="dxa"/>
           </w:tcPr>
           <w:p>
             <w:pPr>
@@ -275,7 +306,7 @@
         </w:trPr>
         <w:tc>
           <w:tcPr>
-            <w:tcW w:w="2920" w:type="dxa"/>
+            <w:tcW w:w="1261" w:type="dxa"/>
           </w:tcPr>
           <w:p>
             <w:pPr>
@@ -339,7 +370,7 @@
         </w:tc>
         <w:tc>
           <w:tcPr>
-            <w:tcW w:w="3291" w:type="dxa"/>
+            <w:tcW w:w="971" w:type="dxa"/>
           </w:tcPr>
           <w:p>
             <w:pPr>
@@ -419,7 +450,7 @@
         </w:tc>
         <w:tc>
           <w:tcPr>
-            <w:tcW w:w="2876" w:type="dxa"/>
+            <w:tcW w:w="1217" w:type="dxa"/>
           </w:tcPr>
           <w:p>
             <w:pPr>
@@ -469,7 +500,14 @@
                 <w:rFonts w:ascii="Myriad-Pro, Calibri, Arial" w:hAnsi="Myriad-Pro, Calibri, Arial"/>
                 <w:color w:val="auto"/>
               </w:rPr>
-              <w:t>].title</w:t>
+              <w:t>].</w:t>
+            </w:r>
+            <w:r>
+              <w:rPr>
+                <w:rFonts w:ascii="Myriad-Pro, Calibri, Arial" w:hAnsi="Myriad-Pro, Calibri, Arial"/>
+                <w:color w:val="auto"/>
+              </w:rPr>
+              <w:t>title</w:t>
             </w:r>
             <w:proofErr w:type="gramEnd"/>
             <w:r>
@@ -483,7 +521,7 @@
         </w:tc>
         <w:tc>
           <w:tcPr>
-            <w:tcW w:w="3314" w:type="dxa"/>
+            <w:tcW w:w="1217" w:type="dxa"/>
           </w:tcPr>
           <w:p>
             <w:pPr>
@@ -533,7 +571,14 @@
                 <w:rFonts w:ascii="Myriad-Pro, Calibri, Arial" w:hAnsi="Myriad-Pro, Calibri, Arial"/>
                 <w:color w:val="auto"/>
               </w:rPr>
-              <w:t>].subtitle</w:t>
+              <w:t>].</w:t>
+            </w:r>
+            <w:r>
+              <w:rPr>
+                <w:rFonts w:ascii="Myriad-Pro, Calibri, Arial" w:hAnsi="Myriad-Pro, Calibri, Arial"/>
+                <w:color w:val="auto"/>
+              </w:rPr>
+              <w:t>subtitle</w:t>
             </w:r>
             <w:proofErr w:type="gramEnd"/>
             <w:r>
@@ -547,7 +592,7 @@
         </w:tc>
         <w:tc>
           <w:tcPr>
-            <w:tcW w:w="3853" w:type="dxa"/>
+            <w:tcW w:w="1217" w:type="dxa"/>
           </w:tcPr>
           <w:p>
             <w:pPr>
@@ -611,7 +656,7 @@
         </w:tc>
         <w:tc>
           <w:tcPr>
-            <w:tcW w:w="3419" w:type="dxa"/>
+            <w:tcW w:w="1021" w:type="dxa"/>
           </w:tcPr>
           <w:p>
             <w:pPr>
@@ -675,7 +720,7 @@
         </w:tc>
         <w:tc>
           <w:tcPr>
-            <w:tcW w:w="2982" w:type="dxa"/>
+            <w:tcW w:w="1134" w:type="dxa"/>
           </w:tcPr>
           <w:p>
             <w:pPr>
@@ -683,30 +728,32 @@
               <w:rPr>
                 <w:rFonts w:ascii="Myriad-Pro, Calibri, Arial" w:hAnsi="Myriad-Pro, Calibri, Arial"/>
                 <w:color w:val="auto"/>
+                <w:lang w:val="en-CA"/>
               </w:rPr>
             </w:pPr>
             <w:r>
               <w:rPr>
                 <w:rFonts w:ascii="Myriad-Pro, Calibri, Arial" w:hAnsi="Myriad-Pro, Calibri, Arial"/>
                 <w:color w:val="auto"/>
+                <w:lang w:val="en-CA"/>
               </w:rPr>
               <w:t>{</w:t>
             </w:r>
             <w:proofErr w:type="spellStart"/>
-            <w:proofErr w:type="gramStart"/>
-            <w:r>
-              <w:rPr>
-                <w:rFonts w:ascii="Myriad-Pro, Calibri, Arial" w:hAnsi="Myriad-Pro, Calibri, Arial"/>
-                <w:color w:val="auto"/>
+            <w:r>
+              <w:rPr>
+                <w:rFonts w:ascii="Myriad-Pro, Calibri, Arial" w:hAnsi="Myriad-Pro, Calibri, Arial"/>
+                <w:color w:val="auto"/>
+                <w:lang w:val="en-CA"/>
               </w:rPr>
               <w:t>d.records</w:t>
             </w:r>
             <w:proofErr w:type="spellEnd"/>
-            <w:proofErr w:type="gramEnd"/>
-            <w:r>
-              <w:rPr>
-                <w:rFonts w:ascii="Myriad-Pro, Calibri, Arial" w:hAnsi="Myriad-Pro, Calibri, Arial"/>
-                <w:color w:val="auto"/>
+            <w:r>
+              <w:rPr>
+                <w:rFonts w:ascii="Myriad-Pro, Calibri, Arial" w:hAnsi="Myriad-Pro, Calibri, Arial"/>
+                <w:color w:val="auto"/>
+                <w:lang w:val="en-CA"/>
               </w:rPr>
               <w:t>[</w:t>
             </w:r>
@@ -715,23 +762,142 @@
               <w:rPr>
                 <w:rFonts w:ascii="Myriad-Pro, Calibri, Arial" w:hAnsi="Myriad-Pro, Calibri, Arial"/>
                 <w:color w:val="auto"/>
+                <w:lang w:val="en-CA"/>
               </w:rPr>
               <w:t>i</w:t>
             </w:r>
             <w:proofErr w:type="spellEnd"/>
-            <w:proofErr w:type="gramStart"/>
-            <w:r>
-              <w:rPr>
-                <w:rFonts w:ascii="Myriad-Pro, Calibri, Arial" w:hAnsi="Myriad-Pro, Calibri, Arial"/>
-                <w:color w:val="auto"/>
-              </w:rPr>
-              <w:t>].form</w:t>
-            </w:r>
-            <w:proofErr w:type="gramEnd"/>
-            <w:r>
-              <w:rPr>
-                <w:rFonts w:ascii="Myriad-Pro, Calibri, Arial" w:hAnsi="Myriad-Pro, Calibri, Arial"/>
-                <w:color w:val="auto"/>
+            <w:r>
+              <w:rPr>
+                <w:rFonts w:ascii="Myriad-Pro, Calibri, Arial" w:hAnsi="Myriad-Pro, Calibri, Arial"/>
+                <w:color w:val="auto"/>
+                <w:lang w:val="en-CA"/>
+              </w:rPr>
+              <w:t>].strength}{</w:t>
+            </w:r>
+            <w:proofErr w:type="spellStart"/>
+            <w:r>
+              <w:rPr>
+                <w:rFonts w:ascii="Myriad-Pro, Calibri, Arial" w:hAnsi="Myriad-Pro, Calibri, Arial"/>
+                <w:color w:val="auto"/>
+                <w:lang w:val="en-CA"/>
+              </w:rPr>
+              <w:t>d.records</w:t>
+            </w:r>
+            <w:proofErr w:type="spellEnd"/>
+            <w:r>
+              <w:rPr>
+                <w:rFonts w:ascii="Myriad-Pro, Calibri, Arial" w:hAnsi="Myriad-Pro, Calibri, Arial"/>
+                <w:color w:val="auto"/>
+                <w:lang w:val="en-CA"/>
+              </w:rPr>
+              <w:t>[</w:t>
+            </w:r>
+            <w:proofErr w:type="spellStart"/>
+            <w:r>
+              <w:rPr>
+                <w:rFonts w:ascii="Myriad-Pro, Calibri, Arial" w:hAnsi="Myriad-Pro, Calibri, Arial"/>
+                <w:color w:val="auto"/>
+                <w:lang w:val="en-CA"/>
+              </w:rPr>
+              <w:t>i</w:t>
+            </w:r>
+            <w:proofErr w:type="spellEnd"/>
+            <w:r>
+              <w:rPr>
+                <w:rFonts w:ascii="Myriad-Pro, Calibri, Arial" w:hAnsi="Myriad-Pro, Calibri, Arial"/>
+                <w:color w:val="auto"/>
+                <w:lang w:val="en-CA"/>
+              </w:rPr>
+              <w:t>].</w:t>
+            </w:r>
+            <w:proofErr w:type="spellStart"/>
+            <w:r>
+              <w:rPr>
+                <w:rFonts w:ascii="Myriad-Pro, Calibri, Arial" w:hAnsi="Myriad-Pro, Calibri, Arial"/>
+                <w:color w:val="auto"/>
+                <w:lang w:val="en-CA"/>
+              </w:rPr>
+              <w:t>check_din:showBegin</w:t>
+            </w:r>
+            <w:proofErr w:type="spellEnd"/>
+            <w:r>
+              <w:rPr>
+                <w:rFonts w:ascii="Myriad-Pro, Calibri, Arial" w:hAnsi="Myriad-Pro, Calibri, Arial"/>
+                <w:color w:val="auto"/>
+                <w:lang w:val="en-CA"/>
+              </w:rPr>
+              <w:t>}</w:t>
+            </w:r>
+            <w:hyperlink r:id="rId7" w:history="1">
+              <w:r>
+                <w:rPr>
+                  <w:rStyle w:val="Hyperlink"/>
+                  <w:rFonts w:ascii="Myriad-Pro, Calibri, Arial" w:hAnsi="Myriad-Pro, Calibri, Arial"/>
+                  <w:lang w:val="en-CA"/>
+                </w:rPr>
+                <w:t>Check DIN</w:t>
+              </w:r>
+            </w:hyperlink>
+            <w:r>
+              <w:rPr>
+                <w:rFonts w:ascii="Myriad-Pro, Calibri, Arial" w:hAnsi="Myriad-Pro, Calibri, Arial"/>
+                <w:color w:val="auto"/>
+                <w:lang w:val="en-CA"/>
+              </w:rPr>
+              <w:t>{</w:t>
+            </w:r>
+            <w:proofErr w:type="spellStart"/>
+            <w:r>
+              <w:rPr>
+                <w:rFonts w:ascii="Myriad-Pro, Calibri, Arial" w:hAnsi="Myriad-Pro, Calibri, Arial"/>
+                <w:color w:val="auto"/>
+                <w:lang w:val="en-CA"/>
+              </w:rPr>
+              <w:t>d.records</w:t>
+            </w:r>
+            <w:proofErr w:type="spellEnd"/>
+            <w:r>
+              <w:rPr>
+                <w:rFonts w:ascii="Myriad-Pro, Calibri, Arial" w:hAnsi="Myriad-Pro, Calibri, Arial"/>
+                <w:color w:val="auto"/>
+                <w:lang w:val="en-CA"/>
+              </w:rPr>
+              <w:t>[</w:t>
+            </w:r>
+            <w:proofErr w:type="spellStart"/>
+            <w:r>
+              <w:rPr>
+                <w:rFonts w:ascii="Myriad-Pro, Calibri, Arial" w:hAnsi="Myriad-Pro, Calibri, Arial"/>
+                <w:color w:val="auto"/>
+                <w:lang w:val="en-CA"/>
+              </w:rPr>
+              <w:t>i</w:t>
+            </w:r>
+            <w:proofErr w:type="spellEnd"/>
+            <w:r>
+              <w:rPr>
+                <w:rFonts w:ascii="Myriad-Pro, Calibri, Arial" w:hAnsi="Myriad-Pro, Calibri, Arial"/>
+                <w:color w:val="auto"/>
+                <w:lang w:val="en-CA"/>
+              </w:rPr>
+              <w:t>].</w:t>
+            </w:r>
+            <w:proofErr w:type="spellStart"/>
+            <w:r>
+              <w:rPr>
+                <w:rFonts w:ascii="Myriad-Pro, Calibri, Arial" w:hAnsi="Myriad-Pro, Calibri, Arial"/>
+                <w:color w:val="auto"/>
+                <w:lang w:val="en-CA"/>
+              </w:rPr>
+              <w:t>check_din:showEnd</w:t>
+            </w:r>
+            <w:proofErr w:type="spellEnd"/>
+            <w:r>
+              <w:rPr>
+                <w:rFonts w:ascii="Myriad-Pro, Calibri, Arial" w:hAnsi="Myriad-Pro, Calibri, Arial"/>
+                <w:color w:val="auto"/>
+                <w:lang w:val="en-CA"/>
               </w:rPr>
               <w:t>}</w:t>
             </w:r>
@@ -739,7 +905,71 @@
         </w:tc>
         <w:tc>
           <w:tcPr>
-            <w:tcW w:w="4066" w:type="dxa"/>
+            <w:tcW w:w="1217" w:type="dxa"/>
+          </w:tcPr>
+          <w:p>
+            <w:pPr>
+              <w:pStyle w:val="Small"/>
+              <w:rPr>
+                <w:rFonts w:ascii="Myriad-Pro, Calibri, Arial" w:hAnsi="Myriad-Pro, Calibri, Arial"/>
+                <w:color w:val="auto"/>
+              </w:rPr>
+            </w:pPr>
+            <w:r>
+              <w:rPr>
+                <w:rFonts w:ascii="Myriad-Pro, Calibri, Arial" w:hAnsi="Myriad-Pro, Calibri, Arial"/>
+                <w:color w:val="auto"/>
+              </w:rPr>
+              <w:t>{</w:t>
+            </w:r>
+            <w:proofErr w:type="spellStart"/>
+            <w:proofErr w:type="gramStart"/>
+            <w:r>
+              <w:rPr>
+                <w:rFonts w:ascii="Myriad-Pro, Calibri, Arial" w:hAnsi="Myriad-Pro, Calibri, Arial"/>
+                <w:color w:val="auto"/>
+              </w:rPr>
+              <w:t>d.records</w:t>
+            </w:r>
+            <w:proofErr w:type="spellEnd"/>
+            <w:proofErr w:type="gramEnd"/>
+            <w:r>
+              <w:rPr>
+                <w:rFonts w:ascii="Myriad-Pro, Calibri, Arial" w:hAnsi="Myriad-Pro, Calibri, Arial"/>
+                <w:color w:val="auto"/>
+              </w:rPr>
+              <w:t>[</w:t>
+            </w:r>
+            <w:proofErr w:type="spellStart"/>
+            <w:r>
+              <w:rPr>
+                <w:rFonts w:ascii="Myriad-Pro, Calibri, Arial" w:hAnsi="Myriad-Pro, Calibri, Arial"/>
+                <w:color w:val="auto"/>
+              </w:rPr>
+              <w:t>i</w:t>
+            </w:r>
+            <w:proofErr w:type="spellEnd"/>
+            <w:proofErr w:type="gramStart"/>
+            <w:r>
+              <w:rPr>
+                <w:rFonts w:ascii="Myriad-Pro, Calibri, Arial" w:hAnsi="Myriad-Pro, Calibri, Arial"/>
+                <w:color w:val="auto"/>
+              </w:rPr>
+              <w:t>].form</w:t>
+            </w:r>
+            <w:proofErr w:type="gramEnd"/>
+            <w:r>
+              <w:rPr>
+                <w:rFonts w:ascii="Myriad-Pro, Calibri, Arial" w:hAnsi="Myriad-Pro, Calibri, Arial"/>
+                <w:color w:val="auto"/>
+              </w:rPr>
+              <w:t>}</w:t>
+            </w:r>
+          </w:p>
+        </w:tc>
+        <w:tc>
+          <w:tcPr>
+            <w:tcW w:w="1503" w:type="dxa"/>
           </w:tcPr>
           <w:p>
             <w:pPr>
@@ -809,7 +1039,7 @@
         </w:trPr>
         <w:tc>
           <w:tcPr>
-            <w:tcW w:w="2920" w:type="dxa"/>
+            <w:tcW w:w="1261" w:type="dxa"/>
           </w:tcPr>
           <w:p>
             <w:pPr>
@@ -864,7 +1094,7 @@
         </w:tc>
         <w:tc>
           <w:tcPr>
-            <w:tcW w:w="3291" w:type="dxa"/>
+            <w:tcW w:w="971" w:type="dxa"/>
           </w:tcPr>
           <w:p>
             <w:pPr>
@@ -935,7 +1165,7 @@
         </w:tc>
         <w:tc>
           <w:tcPr>
-            <w:tcW w:w="2876" w:type="dxa"/>
+            <w:tcW w:w="1217" w:type="dxa"/>
           </w:tcPr>
           <w:p>
             <w:pPr>
@@ -976,7 +1206,14 @@
                 <w:rFonts w:ascii="Myriad-Pro, Calibri, Arial" w:hAnsi="Myriad-Pro, Calibri, Arial"/>
                 <w:color w:val="auto"/>
               </w:rPr>
-              <w:t>].title</w:t>
+              <w:t>].</w:t>
+            </w:r>
+            <w:r>
+              <w:rPr>
+                <w:rFonts w:ascii="Myriad-Pro, Calibri, Arial" w:hAnsi="Myriad-Pro, Calibri, Arial"/>
+                <w:color w:val="auto"/>
+              </w:rPr>
+              <w:t>title</w:t>
             </w:r>
             <w:proofErr w:type="gramEnd"/>
             <w:r>
@@ -990,7 +1227,7 @@
         </w:tc>
         <w:tc>
           <w:tcPr>
-            <w:tcW w:w="3314" w:type="dxa"/>
+            <w:tcW w:w="1217" w:type="dxa"/>
           </w:tcPr>
           <w:p>
             <w:pPr>
@@ -1031,7 +1268,14 @@
                 <w:rFonts w:ascii="Myriad-Pro, Calibri, Arial" w:hAnsi="Myriad-Pro, Calibri, Arial"/>
                 <w:color w:val="auto"/>
               </w:rPr>
-              <w:t>].subtitle</w:t>
+              <w:t>].</w:t>
+            </w:r>
+            <w:r>
+              <w:rPr>
+                <w:rFonts w:ascii="Myriad-Pro, Calibri, Arial" w:hAnsi="Myriad-Pro, Calibri, Arial"/>
+                <w:color w:val="auto"/>
+              </w:rPr>
+              <w:t>subtitle</w:t>
             </w:r>
             <w:proofErr w:type="gramEnd"/>
             <w:r>
@@ -1045,7 +1289,7 @@
         </w:tc>
         <w:tc>
           <w:tcPr>
-            <w:tcW w:w="3853" w:type="dxa"/>
+            <w:tcW w:w="1217" w:type="dxa"/>
           </w:tcPr>
           <w:p>
             <w:pPr>
@@ -1100,7 +1344,7 @@
         </w:tc>
         <w:tc>
           <w:tcPr>
-            <w:tcW w:w="3419" w:type="dxa"/>
+            <w:tcW w:w="1021" w:type="dxa"/>
           </w:tcPr>
           <w:p>
             <w:pPr>
@@ -1155,7 +1399,7 @@
         </w:tc>
         <w:tc>
           <w:tcPr>
-            <w:tcW w:w="2982" w:type="dxa"/>
+            <w:tcW w:w="1134" w:type="dxa"/>
           </w:tcPr>
           <w:p>
             <w:pPr>
@@ -1163,6 +1407,7 @@
               <w:rPr>
                 <w:rFonts w:ascii="Myriad-Pro, Calibri, Arial" w:hAnsi="Myriad-Pro, Calibri, Arial"/>
                 <w:color w:val="auto"/>
+                <w:lang w:val="en-CA"/>
               </w:rPr>
             </w:pPr>
             <w:r>
@@ -1172,37 +1417,65 @@
               </w:rPr>
               <w:t>{</w:t>
             </w:r>
+            <w:r>
+              <w:rPr>
+                <w:rFonts w:ascii="Myriad-Pro, Calibri, Arial" w:hAnsi="Myriad-Pro, Calibri, Arial"/>
+                <w:color w:val="auto"/>
+                <w:lang w:val="en-CA"/>
+              </w:rPr>
+              <w:t>d.records[i+1].strength}{d.records[i+1].check_din:showBegin}</w:t>
+            </w:r>
+            <w:hyperlink r:id="rId8" w:history="1">
+              <w:r>
+                <w:rPr>
+                  <w:rStyle w:val="Hyperlink"/>
+                  <w:rFonts w:ascii="Myriad-Pro, Calibri, Arial" w:hAnsi="Myriad-Pro, Calibri, Arial"/>
+                  <w:lang w:val="en-CA"/>
+                </w:rPr>
+                <w:t>Check DIN</w:t>
+              </w:r>
+            </w:hyperlink>
+            <w:r>
+              <w:rPr>
+                <w:rFonts w:ascii="Myriad-Pro, Calibri, Arial" w:hAnsi="Myriad-Pro, Calibri, Arial"/>
+                <w:color w:val="auto"/>
+                <w:lang w:val="en-CA"/>
+              </w:rPr>
+              <w:t>{</w:t>
+            </w:r>
             <w:proofErr w:type="spellStart"/>
-            <w:proofErr w:type="gramStart"/>
-            <w:r>
-              <w:rPr>
-                <w:rFonts w:ascii="Myriad-Pro, Calibri, Arial" w:hAnsi="Myriad-Pro, Calibri, Arial"/>
-                <w:color w:val="auto"/>
+            <w:r>
+              <w:rPr>
+                <w:rFonts w:ascii="Myriad-Pro, Calibri, Arial" w:hAnsi="Myriad-Pro, Calibri, Arial"/>
+                <w:color w:val="auto"/>
+                <w:lang w:val="en-CA"/>
               </w:rPr>
               <w:t>d.records</w:t>
             </w:r>
             <w:proofErr w:type="spellEnd"/>
-            <w:proofErr w:type="gramEnd"/>
-            <w:r>
-              <w:rPr>
-                <w:rFonts w:ascii="Myriad-Pro, Calibri, Arial" w:hAnsi="Myriad-Pro, Calibri, Arial"/>
-                <w:color w:val="auto"/>
-              </w:rPr>
-              <w:t>[i+1</w:t>
-            </w:r>
-            <w:proofErr w:type="gramStart"/>
-            <w:r>
-              <w:rPr>
-                <w:rFonts w:ascii="Myriad-Pro, Calibri, Arial" w:hAnsi="Myriad-Pro, Calibri, Arial"/>
-                <w:color w:val="auto"/>
-              </w:rPr>
-              <w:t>].form</w:t>
-            </w:r>
-            <w:proofErr w:type="gramEnd"/>
-            <w:r>
-              <w:rPr>
-                <w:rFonts w:ascii="Myriad-Pro, Calibri, Arial" w:hAnsi="Myriad-Pro, Calibri, Arial"/>
-                <w:color w:val="auto"/>
+            <w:r>
+              <w:rPr>
+                <w:rFonts w:ascii="Myriad-Pro, Calibri, Arial" w:hAnsi="Myriad-Pro, Calibri, Arial"/>
+                <w:color w:val="auto"/>
+                <w:lang w:val="en-CA"/>
+              </w:rPr>
+              <w:t>[i+1].</w:t>
+            </w:r>
+            <w:proofErr w:type="spellStart"/>
+            <w:r>
+              <w:rPr>
+                <w:rFonts w:ascii="Myriad-Pro, Calibri, Arial" w:hAnsi="Myriad-Pro, Calibri, Arial"/>
+                <w:color w:val="auto"/>
+                <w:lang w:val="en-CA"/>
+              </w:rPr>
+              <w:t>check_din:showEnd</w:t>
+            </w:r>
+            <w:proofErr w:type="spellEnd"/>
+            <w:r>
+              <w:rPr>
+                <w:rFonts w:ascii="Myriad-Pro, Calibri, Arial" w:hAnsi="Myriad-Pro, Calibri, Arial"/>
+                <w:color w:val="auto"/>
+                <w:lang w:val="en-CA"/>
               </w:rPr>
               <w:t>}</w:t>
             </w:r>
@@ -1210,7 +1483,62 @@
         </w:tc>
         <w:tc>
           <w:tcPr>
-            <w:tcW w:w="4066" w:type="dxa"/>
+            <w:tcW w:w="1217" w:type="dxa"/>
+          </w:tcPr>
+          <w:p>
+            <w:pPr>
+              <w:pStyle w:val="Small"/>
+              <w:rPr>
+                <w:rFonts w:ascii="Myriad-Pro, Calibri, Arial" w:hAnsi="Myriad-Pro, Calibri, Arial"/>
+                <w:color w:val="auto"/>
+              </w:rPr>
+            </w:pPr>
+            <w:r>
+              <w:rPr>
+                <w:rFonts w:ascii="Myriad-Pro, Calibri, Arial" w:hAnsi="Myriad-Pro, Calibri, Arial"/>
+                <w:color w:val="auto"/>
+              </w:rPr>
+              <w:t>{</w:t>
+            </w:r>
+            <w:proofErr w:type="spellStart"/>
+            <w:proofErr w:type="gramStart"/>
+            <w:r>
+              <w:rPr>
+                <w:rFonts w:ascii="Myriad-Pro, Calibri, Arial" w:hAnsi="Myriad-Pro, Calibri, Arial"/>
+                <w:color w:val="auto"/>
+              </w:rPr>
+              <w:t>d.records</w:t>
+            </w:r>
+            <w:proofErr w:type="spellEnd"/>
+            <w:proofErr w:type="gramEnd"/>
+            <w:r>
+              <w:rPr>
+                <w:rFonts w:ascii="Myriad-Pro, Calibri, Arial" w:hAnsi="Myriad-Pro, Calibri, Arial"/>
+                <w:color w:val="auto"/>
+              </w:rPr>
+              <w:t>[i+1</w:t>
+            </w:r>
+            <w:proofErr w:type="gramStart"/>
+            <w:r>
+              <w:rPr>
+                <w:rFonts w:ascii="Myriad-Pro, Calibri, Arial" w:hAnsi="Myriad-Pro, Calibri, Arial"/>
+                <w:color w:val="auto"/>
+              </w:rPr>
+              <w:t>].form</w:t>
+            </w:r>
+            <w:proofErr w:type="gramEnd"/>
+            <w:r>
+              <w:rPr>
+                <w:rFonts w:ascii="Myriad-Pro, Calibri, Arial" w:hAnsi="Myriad-Pro, Calibri, Arial"/>
+                <w:color w:val="auto"/>
+              </w:rPr>
+              <w:t>}</w:t>
+            </w:r>
+          </w:p>
+        </w:tc>
+        <w:tc>
+          <w:tcPr>
+            <w:tcW w:w="1503" w:type="dxa"/>
           </w:tcPr>
           <w:p>
             <w:pPr>
@@ -1281,12 +1609,21 @@
         <w:t>{</w:t>
       </w:r>
       <w:proofErr w:type="spellStart"/>
+      <w:proofErr w:type="gramStart"/>
       <w:r>
         <w:rPr>
           <w:rFonts w:ascii="Myriad-Pro, Calibri, Arial" w:hAnsi="Myriad-Pro, Calibri, Arial"/>
           <w:color w:val="000000" w:themeColor="text1"/>
         </w:rPr>
-        <w:t>d.records:ifEM</w:t>
+        <w:t>d.records</w:t>
+      </w:r>
+      <w:proofErr w:type="gramEnd"/>
+      <w:r>
+        <w:rPr>
+          <w:rFonts w:ascii="Myriad-Pro, Calibri, Arial" w:hAnsi="Myriad-Pro, Calibri, Arial"/>
+          <w:color w:val="000000" w:themeColor="text1"/>
+        </w:rPr>
+        <w:t>:ifEM</w:t>
       </w:r>
       <w:proofErr w:type="spellEnd"/>
       <w:r>
@@ -1294,7 +1631,15 @@
           <w:rFonts w:ascii="Myriad-Pro, Calibri, Arial" w:hAnsi="Myriad-Pro, Calibri, Arial"/>
           <w:color w:val="000000" w:themeColor="text1"/>
         </w:rPr>
-        <w:t>():</w:t>
+        <w:t>(</w:t>
+      </w:r>
+      <w:proofErr w:type="gramStart"/>
+      <w:r>
+        <w:rPr>
+          <w:rFonts w:ascii="Myriad-Pro, Calibri, Arial" w:hAnsi="Myriad-Pro, Calibri, Arial"/>
+          <w:color w:val="000000" w:themeColor="text1"/>
+        </w:rPr>
+        <w:t>):</w:t>
       </w:r>
       <w:proofErr w:type="spellStart"/>
       <w:r>
@@ -1305,15 +1650,23 @@
         <w:t>showBegin</w:t>
       </w:r>
       <w:proofErr w:type="spellEnd"/>
+      <w:proofErr w:type="gramEnd"/>
       <w:r>
         <w:rPr>
           <w:rFonts w:ascii="Myriad-Pro, Calibri, Arial" w:hAnsi="Myriad-Pro, Calibri, Arial"/>
           <w:color w:val="000000" w:themeColor="text1"/>
         </w:rPr>
-        <w:t>}No records found.{</w:t>
+        <w:t xml:space="preserve">}No records </w:t>
+      </w:r>
+      <w:proofErr w:type="gramStart"/>
+      <w:r>
+        <w:rPr>
+          <w:rFonts w:ascii="Myriad-Pro, Calibri, Arial" w:hAnsi="Myriad-Pro, Calibri, Arial"/>
+          <w:color w:val="000000" w:themeColor="text1"/>
+        </w:rPr>
+        <w:t>found.{</w:t>
       </w:r>
       <w:proofErr w:type="spellStart"/>
-      <w:proofErr w:type="gramStart"/>
       <w:r>
         <w:rPr>
           <w:rFonts w:ascii="Myriad-Pro, Calibri, Arial" w:hAnsi="Myriad-Pro, Calibri, Arial"/>
@@ -1339,9 +1692,9 @@
       </w:r>
     </w:p>
     <w:sectPr>
-      <w:headerReference w:type="default" r:id="rId7"/>
-      <w:footerReference w:type="even" r:id="rId8"/>
-      <w:footerReference w:type="default" r:id="rId9"/>
+      <w:headerReference w:type="default" r:id="rId9"/>
+      <w:footerReference w:type="even" r:id="rId10"/>
+      <w:footerReference w:type="default" r:id="rId11"/>
       <w:pgSz w:w="12240" w:h="15840"/>
       <w:pgMar w:top="720" w:right="720" w:bottom="720" w:left="720" w:header="708" w:footer="708" w:gutter="0"/>
       <w:cols w:space="708"/>
@@ -1414,11 +1767,27 @@
           </w:rPr>
           <w:t xml:space="preserve"> {</w:t>
         </w:r>
+        <w:proofErr w:type="spellStart"/>
+        <w:proofErr w:type="gramStart"/>
         <w:r>
           <w:rPr>
             <w:rFonts w:ascii="Myriad-Pro, Calibri, Arial" w:hAnsi="Myriad-Pro, Calibri, Arial"/>
           </w:rPr>
-          <w:t>d.header.datePrinted}</w:t>
+          <w:t>d.header</w:t>
+        </w:r>
+        <w:proofErr w:type="gramEnd"/>
+        <w:r>
+          <w:rPr>
+            <w:rFonts w:ascii="Myriad-Pro, Calibri, Arial" w:hAnsi="Myriad-Pro, Calibri, Arial"/>
+          </w:rPr>
+          <w:t>.datePrinted</w:t>
+        </w:r>
+        <w:proofErr w:type="spellEnd"/>
+        <w:r>
+          <w:rPr>
+            <w:rFonts w:ascii="Myriad-Pro, Calibri, Arial" w:hAnsi="Myriad-Pro, Calibri, Arial"/>
+          </w:rPr>
+          <w:t>}</w:t>
         </w:r>
         <w:r>
           <w:rPr>
@@ -1648,6 +2017,8 @@
       </w:rPr>
       <w:t>{</w:t>
     </w:r>
+    <w:proofErr w:type="spellStart"/>
+    <w:proofErr w:type="gramStart"/>
     <w:r>
       <w:rPr>
         <w:rFonts w:ascii="Myriad-Pro, Calibri, Arial" w:hAnsi="Myriad-Pro, Calibri, Arial"/>
@@ -1658,6 +2029,96 @@
       <w:rPr>
         <w:rFonts w:ascii="Myriad-Pro, Calibri, Arial" w:hAnsi="Myriad-Pro, Calibri, Arial"/>
       </w:rPr>
+      <w:t>header</w:t>
+    </w:r>
+    <w:proofErr w:type="gramEnd"/>
+    <w:r>
+      <w:rPr>
+        <w:rFonts w:ascii="Myriad-Pro, Calibri, Arial" w:hAnsi="Myriad-Pro, Calibri, Arial"/>
+      </w:rPr>
+      <w:t>.</w:t>
+    </w:r>
+    <w:proofErr w:type="gramStart"/>
+    <w:r>
+      <w:rPr>
+        <w:rFonts w:ascii="Myriad-Pro, Calibri, Arial" w:hAnsi="Myriad-Pro, Calibri, Arial"/>
+      </w:rPr>
+      <w:t>isR</w:t>
+    </w:r>
+    <w:r>
+      <w:rPr>
+        <w:rFonts w:ascii="Myriad-Pro, Calibri, Arial" w:hAnsi="Myriad-Pro, Calibri, Arial"/>
+      </w:rPr>
+      <w:t>edacted:ifEQ</w:t>
+    </w:r>
+    <w:proofErr w:type="spellEnd"/>
+    <w:proofErr w:type="gramEnd"/>
+    <w:r>
+      <w:rPr>
+        <w:rFonts w:ascii="Myriad-Pro, Calibri, Arial" w:hAnsi="Myriad-Pro, Calibri, Arial"/>
+      </w:rPr>
+      <w:t>(true</w:t>
+    </w:r>
+    <w:proofErr w:type="gramStart"/>
+    <w:r>
+      <w:rPr>
+        <w:rFonts w:ascii="Myriad-Pro, Calibri, Arial" w:hAnsi="Myriad-Pro, Calibri, Arial"/>
+      </w:rPr>
+      <w:t>):</w:t>
+    </w:r>
+    <w:proofErr w:type="spellStart"/>
+    <w:r>
+      <w:rPr>
+        <w:rFonts w:ascii="Myriad-Pro, Calibri, Arial" w:hAnsi="Myriad-Pro, Calibri, Arial"/>
+      </w:rPr>
+      <w:t>show</w:t>
+    </w:r>
+    <w:r>
+      <w:rPr>
+        <w:rFonts w:ascii="Myriad-Pro, Calibri, Arial" w:hAnsi="Myriad-Pro, Calibri, Arial"/>
+      </w:rPr>
+      <w:t>Begin</w:t>
+    </w:r>
+    <w:proofErr w:type="spellEnd"/>
+    <w:proofErr w:type="gramEnd"/>
+    <w:r>
+      <w:rPr>
+        <w:rFonts w:ascii="Myriad-Pro, Calibri, Arial" w:hAnsi="Myriad-Pro, Calibri, Arial"/>
+      </w:rPr>
+      <w:t>}(</w:t>
+    </w:r>
+    <w:r>
+      <w:rPr>
+        <w:rFonts w:ascii="Myriad-Pro, Calibri, Arial" w:hAnsi="Myriad-Pro, Calibri, Arial"/>
+      </w:rPr>
+      <w:t>Redacted</w:t>
+    </w:r>
+    <w:proofErr w:type="gramStart"/>
+    <w:r>
+      <w:rPr>
+        <w:rFonts w:ascii="Myriad-Pro, Calibri, Arial" w:hAnsi="Myriad-Pro, Calibri, Arial"/>
+      </w:rPr>
+      <w:t>){</w:t>
+    </w:r>
+    <w:proofErr w:type="gramEnd"/>
+    <w:r>
+      <w:rPr>
+        <w:rFonts w:ascii="Myriad-Pro, Calibri, Arial" w:hAnsi="Myriad-Pro, Calibri, Arial"/>
+      </w:rPr>
+      <w:t>d.</w:t>
+    </w:r>
+    <w:r>
+      <w:rPr>
+        <w:rFonts w:ascii="Myriad-Pro, Calibri, Arial" w:hAnsi="Myriad-Pro, Calibri, Arial"/>
+      </w:rPr>
+      <w:t xml:space="preserve"> </w:t>
+    </w:r>
+    <w:proofErr w:type="spellStart"/>
+    <w:proofErr w:type="gramStart"/>
+    <w:r>
+      <w:rPr>
+        <w:rFonts w:ascii="Myriad-Pro, Calibri, Arial" w:hAnsi="Myriad-Pro, Calibri, Arial"/>
+      </w:rPr>
       <w:t>header.</w:t>
     </w:r>
     <w:r>
@@ -1670,49 +2131,21 @@
       <w:rPr>
         <w:rFonts w:ascii="Myriad-Pro, Calibri, Arial" w:hAnsi="Myriad-Pro, Calibri, Arial"/>
       </w:rPr>
-      <w:t>edacted:ifEQ(true):show</w:t>
-    </w:r>
-    <w:r>
-      <w:rPr>
-        <w:rFonts w:ascii="Myriad-Pro, Calibri, Arial" w:hAnsi="Myriad-Pro, Calibri, Arial"/>
-      </w:rPr>
-      <w:t>Begin}(</w:t>
-    </w:r>
-    <w:r>
-      <w:rPr>
-        <w:rFonts w:ascii="Myriad-Pro, Calibri, Arial" w:hAnsi="Myriad-Pro, Calibri, Arial"/>
-      </w:rPr>
-      <w:t>Redacted</w:t>
-    </w:r>
-    <w:r>
-      <w:rPr>
-        <w:rFonts w:ascii="Myriad-Pro, Calibri, Arial" w:hAnsi="Myriad-Pro, Calibri, Arial"/>
-      </w:rPr>
-      <w:t>){d.</w:t>
-    </w:r>
-    <w:r>
-      <w:rPr>
-        <w:rFonts w:ascii="Myriad-Pro, Calibri, Arial" w:hAnsi="Myriad-Pro, Calibri, Arial"/>
-      </w:rPr>
-      <w:t xml:space="preserve"> </w:t>
-    </w:r>
-    <w:r>
-      <w:rPr>
-        <w:rFonts w:ascii="Myriad-Pro, Calibri, Arial" w:hAnsi="Myriad-Pro, Calibri, Arial"/>
-      </w:rPr>
-      <w:t>header.</w:t>
-    </w:r>
-    <w:r>
-      <w:rPr>
-        <w:rFonts w:ascii="Myriad-Pro, Calibri, Arial" w:hAnsi="Myriad-Pro, Calibri, Arial"/>
-      </w:rPr>
-      <w:t>isR</w:t>
-    </w:r>
-    <w:r>
-      <w:rPr>
-        <w:rFonts w:ascii="Myriad-Pro, Calibri, Arial" w:hAnsi="Myriad-Pro, Calibri, Arial"/>
-      </w:rPr>
-      <w:t>edacted:showEnd}</w:t>
+      <w:t>edacted</w:t>
+    </w:r>
+    <w:proofErr w:type="gramEnd"/>
+    <w:r>
+      <w:rPr>
+        <w:rFonts w:ascii="Myriad-Pro, Calibri, Arial" w:hAnsi="Myriad-Pro, Calibri, Arial"/>
+      </w:rPr>
+      <w:t>:showEnd</w:t>
+    </w:r>
+    <w:proofErr w:type="spellEnd"/>
+    <w:r>
+      <w:rPr>
+        <w:rFonts w:ascii="Myriad-Pro, Calibri, Arial" w:hAnsi="Myriad-Pro, Calibri, Arial"/>
+      </w:rPr>
+      <w:t>}</w:t>
     </w:r>
   </w:p>
   <w:p>
@@ -1818,7 +2251,14 @@
             <w:rPr>
               <w:rFonts w:ascii="Myriad-Pro, Calibri, Arial" w:hAnsi="Myriad-Pro, Calibri, Arial"/>
             </w:rPr>
-            <w:t xml:space="preserve"> {d.</w:t>
+            <w:t xml:space="preserve"> {</w:t>
+          </w:r>
+          <w:proofErr w:type="gramStart"/>
+          <w:r>
+            <w:rPr>
+              <w:rFonts w:ascii="Myriad-Pro, Calibri, Arial" w:hAnsi="Myriad-Pro, Calibri, Arial"/>
+            </w:rPr>
+            <w:t>d.</w:t>
           </w:r>
           <w:r>
             <w:rPr>
@@ -1830,7 +2270,14 @@
             <w:rPr>
               <w:rFonts w:ascii="Myriad-Pro, Calibri, Arial" w:hAnsi="Myriad-Pro, Calibri, Arial"/>
             </w:rPr>
-            <w:t>name}</w:t>
+            <w:t>name</w:t>
+          </w:r>
+          <w:proofErr w:type="gramEnd"/>
+          <w:r>
+            <w:rPr>
+              <w:rFonts w:ascii="Myriad-Pro, Calibri, Arial" w:hAnsi="Myriad-Pro, Calibri, Arial"/>
+            </w:rPr>
+            <w:t>}</w:t>
           </w:r>
         </w:p>
       </w:tc>
@@ -1856,7 +2303,14 @@
             <w:rPr>
               <w:rFonts w:ascii="Myriad-Pro, Calibri, Arial" w:hAnsi="Myriad-Pro, Calibri, Arial"/>
             </w:rPr>
-            <w:t xml:space="preserve"> {d.</w:t>
+            <w:t xml:space="preserve"> {</w:t>
+          </w:r>
+          <w:proofErr w:type="spellStart"/>
+          <w:r>
+            <w:rPr>
+              <w:rFonts w:ascii="Myriad-Pro, Calibri, Arial" w:hAnsi="Myriad-Pro, Calibri, Arial"/>
+            </w:rPr>
+            <w:t>d.</w:t>
           </w:r>
           <w:r>
             <w:rPr>
@@ -1870,6 +2324,7 @@
             </w:rPr>
             <w:t>.phn</w:t>
           </w:r>
+          <w:proofErr w:type="spellEnd"/>
           <w:r>
             <w:rPr>
               <w:rFonts w:ascii="Myriad-Pro, Calibri, Arial" w:hAnsi="Myriad-Pro, Calibri, Arial"/>
@@ -1900,7 +2355,15 @@
             <w:rPr>
               <w:rFonts w:ascii="Myriad-Pro, Calibri, Arial" w:hAnsi="Myriad-Pro, Calibri, Arial"/>
             </w:rPr>
-            <w:t xml:space="preserve"> {d</w:t>
+            <w:t xml:space="preserve"> {</w:t>
+          </w:r>
+          <w:proofErr w:type="spellStart"/>
+          <w:proofErr w:type="gramStart"/>
+          <w:r>
+            <w:rPr>
+              <w:rFonts w:ascii="Myriad-Pro, Calibri, Arial" w:hAnsi="Myriad-Pro, Calibri, Arial"/>
+            </w:rPr>
+            <w:t>d</w:t>
           </w:r>
           <w:r>
             <w:rPr>
@@ -1914,12 +2377,14 @@
             </w:rPr>
             <w:t>header</w:t>
           </w:r>
+          <w:proofErr w:type="gramEnd"/>
           <w:r>
             <w:rPr>
               <w:rFonts w:ascii="Myriad-Pro, Calibri, Arial" w:hAnsi="Myriad-Pro, Calibri, Arial"/>
             </w:rPr>
             <w:t>.dateOfBirth</w:t>
           </w:r>
+          <w:proofErr w:type="spellEnd"/>
           <w:r>
             <w:rPr>
               <w:rFonts w:ascii="Myriad-Pro, Calibri, Arial" w:hAnsi="Myriad-Pro, Calibri, Arial"/>
@@ -1946,15 +2411,17 @@
         <w:sz w:val="18"/>
         <w:szCs w:val="18"/>
       </w:rPr>
-      <w:t>{d</w:t>
-    </w:r>
+      <w:t>{</w:t>
+    </w:r>
+    <w:proofErr w:type="spellStart"/>
+    <w:proofErr w:type="gramStart"/>
     <w:r>
       <w:rPr>
         <w:rFonts w:ascii="Myriad-Pro, Calibri, Arial" w:hAnsi="Myriad-Pro, Calibri, Arial"/>
         <w:sz w:val="18"/>
         <w:szCs w:val="18"/>
       </w:rPr>
-      <w:t>.</w:t>
+      <w:t>d</w:t>
     </w:r>
     <w:r>
       <w:rPr>
@@ -1962,7 +2429,7 @@
         <w:sz w:val="18"/>
         <w:szCs w:val="18"/>
       </w:rPr>
-      <w:t>header</w:t>
+      <w:t>.</w:t>
     </w:r>
     <w:r>
       <w:rPr>
@@ -1970,23 +2437,25 @@
         <w:sz w:val="18"/>
         <w:szCs w:val="18"/>
       </w:rPr>
-      <w:t>.filterText</w:t>
-    </w:r>
+      <w:t>header</w:t>
+    </w:r>
+    <w:proofErr w:type="gramEnd"/>
     <w:r>
       <w:rPr>
         <w:rFonts w:ascii="Myriad-Pro, Calibri, Arial" w:hAnsi="Myriad-Pro, Calibri, Arial"/>
         <w:sz w:val="18"/>
         <w:szCs w:val="18"/>
       </w:rPr>
-      <w:t>:ifNEM():showBegin</w:t>
-    </w:r>
+      <w:t>.</w:t>
+    </w:r>
+    <w:proofErr w:type="gramStart"/>
     <w:r>
       <w:rPr>
         <w:rFonts w:ascii="Myriad-Pro, Calibri, Arial" w:hAnsi="Myriad-Pro, Calibri, Arial"/>
         <w:sz w:val="18"/>
         <w:szCs w:val="18"/>
       </w:rPr>
-      <w:t>}</w:t>
+      <w:t>filterText</w:t>
     </w:r>
     <w:r>
       <w:rPr>
@@ -1994,40 +2463,98 @@
         <w:sz w:val="18"/>
         <w:szCs w:val="18"/>
       </w:rPr>
-      <w:t>{d</w:t>
-    </w:r>
+      <w:t>:ifNEM</w:t>
+    </w:r>
+    <w:proofErr w:type="spellEnd"/>
+    <w:proofErr w:type="gramEnd"/>
     <w:r>
       <w:rPr>
         <w:rFonts w:ascii="Myriad-Pro, Calibri, Arial" w:hAnsi="Myriad-Pro, Calibri, Arial"/>
         <w:sz w:val="18"/>
         <w:szCs w:val="18"/>
       </w:rPr>
-      <w:t>.</w:t>
-    </w:r>
+      <w:t>(</w:t>
+    </w:r>
+    <w:proofErr w:type="gramStart"/>
     <w:r>
       <w:rPr>
         <w:rFonts w:ascii="Myriad-Pro, Calibri, Arial" w:hAnsi="Myriad-Pro, Calibri, Arial"/>
         <w:sz w:val="18"/>
         <w:szCs w:val="18"/>
       </w:rPr>
-      <w:t>header</w:t>
-    </w:r>
+      <w:t>):</w:t>
+    </w:r>
+    <w:proofErr w:type="spellStart"/>
     <w:r>
       <w:rPr>
         <w:rFonts w:ascii="Myriad-Pro, Calibri, Arial" w:hAnsi="Myriad-Pro, Calibri, Arial"/>
         <w:sz w:val="18"/>
         <w:szCs w:val="18"/>
       </w:rPr>
-      <w:t>.</w:t>
-    </w:r>
+      <w:t>showBegin</w:t>
+    </w:r>
+    <w:proofErr w:type="spellEnd"/>
+    <w:proofErr w:type="gramEnd"/>
     <w:r>
       <w:rPr>
         <w:rFonts w:ascii="Myriad-Pro, Calibri, Arial" w:hAnsi="Myriad-Pro, Calibri, Arial"/>
         <w:sz w:val="18"/>
         <w:szCs w:val="18"/>
       </w:rPr>
+      <w:t>}</w:t>
+    </w:r>
+    <w:r>
+      <w:rPr>
+        <w:rFonts w:ascii="Myriad-Pro, Calibri, Arial" w:hAnsi="Myriad-Pro, Calibri, Arial"/>
+        <w:sz w:val="18"/>
+        <w:szCs w:val="18"/>
+      </w:rPr>
+      <w:t>{</w:t>
+    </w:r>
+    <w:proofErr w:type="spellStart"/>
+    <w:proofErr w:type="gramStart"/>
+    <w:r>
+      <w:rPr>
+        <w:rFonts w:ascii="Myriad-Pro, Calibri, Arial" w:hAnsi="Myriad-Pro, Calibri, Arial"/>
+        <w:sz w:val="18"/>
+        <w:szCs w:val="18"/>
+      </w:rPr>
+      <w:t>d</w:t>
+    </w:r>
+    <w:r>
+      <w:rPr>
+        <w:rFonts w:ascii="Myriad-Pro, Calibri, Arial" w:hAnsi="Myriad-Pro, Calibri, Arial"/>
+        <w:sz w:val="18"/>
+        <w:szCs w:val="18"/>
+      </w:rPr>
+      <w:t>.</w:t>
+    </w:r>
+    <w:r>
+      <w:rPr>
+        <w:rFonts w:ascii="Myriad-Pro, Calibri, Arial" w:hAnsi="Myriad-Pro, Calibri, Arial"/>
+        <w:sz w:val="18"/>
+        <w:szCs w:val="18"/>
+      </w:rPr>
+      <w:t>header</w:t>
+    </w:r>
+    <w:proofErr w:type="gramEnd"/>
+    <w:r>
+      <w:rPr>
+        <w:rFonts w:ascii="Myriad-Pro, Calibri, Arial" w:hAnsi="Myriad-Pro, Calibri, Arial"/>
+        <w:sz w:val="18"/>
+        <w:szCs w:val="18"/>
+      </w:rPr>
+      <w:t>.</w:t>
+    </w:r>
+    <w:r>
+      <w:rPr>
+        <w:rFonts w:ascii="Myriad-Pro, Calibri, Arial" w:hAnsi="Myriad-Pro, Calibri, Arial"/>
+        <w:sz w:val="18"/>
+        <w:szCs w:val="18"/>
+      </w:rPr>
       <w:t>filterText</w:t>
     </w:r>
+    <w:proofErr w:type="spellEnd"/>
     <w:r>
       <w:rPr>
         <w:rFonts w:ascii="Myriad-Pro, Calibri, Arial" w:hAnsi="Myriad-Pro, Calibri, Arial"/>
@@ -2048,7 +2575,45 @@
         <w:sz w:val="18"/>
         <w:szCs w:val="18"/>
       </w:rPr>
-      <w:t>{d.header.filterText:showEnd}</w:t>
+      <w:t>{</w:t>
+    </w:r>
+    <w:proofErr w:type="spellStart"/>
+    <w:proofErr w:type="gramStart"/>
+    <w:r>
+      <w:rPr>
+        <w:rFonts w:ascii="Myriad-Pro, Calibri, Arial" w:hAnsi="Myriad-Pro, Calibri, Arial"/>
+        <w:sz w:val="18"/>
+        <w:szCs w:val="18"/>
+      </w:rPr>
+      <w:t>d.header</w:t>
+    </w:r>
+    <w:proofErr w:type="gramEnd"/>
+    <w:r>
+      <w:rPr>
+        <w:rFonts w:ascii="Myriad-Pro, Calibri, Arial" w:hAnsi="Myriad-Pro, Calibri, Arial"/>
+        <w:sz w:val="18"/>
+        <w:szCs w:val="18"/>
+      </w:rPr>
+      <w:t>.</w:t>
+    </w:r>
+    <w:proofErr w:type="gramStart"/>
+    <w:r>
+      <w:rPr>
+        <w:rFonts w:ascii="Myriad-Pro, Calibri, Arial" w:hAnsi="Myriad-Pro, Calibri, Arial"/>
+        <w:sz w:val="18"/>
+        <w:szCs w:val="18"/>
+      </w:rPr>
+      <w:t>filterText:showEnd</w:t>
+    </w:r>
+    <w:proofErr w:type="spellEnd"/>
+    <w:proofErr w:type="gramEnd"/>
+    <w:r>
+      <w:rPr>
+        <w:rFonts w:ascii="Myriad-Pro, Calibri, Arial" w:hAnsi="Myriad-Pro, Calibri, Arial"/>
+        <w:sz w:val="18"/>
+        <w:szCs w:val="18"/>
+      </w:rPr>
+      <w:t>}</w:t>
     </w:r>
   </w:p>
 </w:hdr>
@@ -2493,7 +3058,6 @@
   <w:style w:type="character" w:default="1" w:styleId="DefaultParagraphFont">
     <w:name w:val="Default Paragraph Font"/>
     <w:uiPriority w:val="1"/>
-    <w:semiHidden/>
     <w:unhideWhenUsed/>
   </w:style>
   <w:style w:type="table" w:default="1" w:styleId="TableNormal">

</xml_diff>

<commit_message>
Update medication timeline entry and report (DHSOHG-3326) AB#17031 (#6637)
</commit_message>
<xml_diff>
--- a/Apps/GatewayApi/src/Assets/Templates/MedicationReport.docx
+++ b/Apps/GatewayApi/src/Assets/Templates/MedicationReport.docx
@@ -5,19 +5,20 @@
     <w:tbl>
       <w:tblPr>
         <w:tblStyle w:val="HealthGatewayExportTable"/>
-        <w:tblW w:w="4433" w:type="pct"/>
+        <w:tblW w:w="5000" w:type="pct"/>
         <w:tblLayout w:type="fixed"/>
         <w:tblLook w:val="04A0" w:firstRow="1" w:lastRow="0" w:firstColumn="1" w:lastColumn="0" w:noHBand="0" w:noVBand="1"/>
       </w:tblPr>
       <w:tblGrid>
-        <w:gridCol w:w="1062"/>
-        <w:gridCol w:w="1181"/>
-        <w:gridCol w:w="1049"/>
-        <w:gridCol w:w="1189"/>
-        <w:gridCol w:w="1361"/>
+        <w:gridCol w:w="1265"/>
+        <w:gridCol w:w="975"/>
         <w:gridCol w:w="1222"/>
-        <w:gridCol w:w="1082"/>
-        <w:gridCol w:w="1429"/>
+        <w:gridCol w:w="1222"/>
+        <w:gridCol w:w="1222"/>
+        <w:gridCol w:w="1025"/>
+        <w:gridCol w:w="1138"/>
+        <w:gridCol w:w="1222"/>
+        <w:gridCol w:w="1509"/>
       </w:tblGrid>
       <w:tr>
         <w:trPr>
@@ -28,7 +29,7 @@
         </w:trPr>
         <w:tc>
           <w:tcPr>
-            <w:tcW w:w="2920" w:type="dxa"/>
+            <w:tcW w:w="1261" w:type="dxa"/>
           </w:tcPr>
           <w:p>
             <w:pPr>
@@ -58,7 +59,7 @@
         </w:tc>
         <w:tc>
           <w:tcPr>
-            <w:tcW w:w="3291" w:type="dxa"/>
+            <w:tcW w:w="971" w:type="dxa"/>
           </w:tcPr>
           <w:p>
             <w:pPr>
@@ -88,7 +89,7 @@
         </w:tc>
         <w:tc>
           <w:tcPr>
-            <w:tcW w:w="2876" w:type="dxa"/>
+            <w:tcW w:w="1217" w:type="dxa"/>
           </w:tcPr>
           <w:p>
             <w:pPr>
@@ -118,7 +119,7 @@
         </w:tc>
         <w:tc>
           <w:tcPr>
-            <w:tcW w:w="3314" w:type="dxa"/>
+            <w:tcW w:w="1217" w:type="dxa"/>
           </w:tcPr>
           <w:p>
             <w:pPr>
@@ -148,7 +149,7 @@
         </w:tc>
         <w:tc>
           <w:tcPr>
-            <w:tcW w:w="3853" w:type="dxa"/>
+            <w:tcW w:w="1217" w:type="dxa"/>
           </w:tcPr>
           <w:p>
             <w:pPr>
@@ -178,7 +179,7 @@
         </w:tc>
         <w:tc>
           <w:tcPr>
-            <w:tcW w:w="3419" w:type="dxa"/>
+            <w:tcW w:w="1021" w:type="dxa"/>
           </w:tcPr>
           <w:p>
             <w:pPr>
@@ -208,7 +209,7 @@
         </w:tc>
         <w:tc>
           <w:tcPr>
-            <w:tcW w:w="2982" w:type="dxa"/>
+            <w:tcW w:w="1134" w:type="dxa"/>
           </w:tcPr>
           <w:p>
             <w:pPr>
@@ -232,13 +233,43 @@
                 <w:sz w:val="14"/>
                 <w:szCs w:val="14"/>
               </w:rPr>
-              <w:t>Form</w:t>
+              <w:t>Strength</w:t>
             </w:r>
           </w:p>
         </w:tc>
         <w:tc>
           <w:tcPr>
-            <w:tcW w:w="4066" w:type="dxa"/>
+            <w:tcW w:w="1217" w:type="dxa"/>
+          </w:tcPr>
+          <w:p>
+            <w:pPr>
+              <w:rPr>
+                <w:rStyle w:val="Strong"/>
+                <w:rFonts w:ascii="Myriad-Pro, Calibri, Arial" w:hAnsi="Myriad-Pro, Calibri, Arial"/>
+                <w:b/>
+                <w:bCs w:val="0"/>
+                <w:color w:val="auto"/>
+                <w:sz w:val="14"/>
+                <w:szCs w:val="14"/>
+              </w:rPr>
+            </w:pPr>
+            <w:r>
+              <w:rPr>
+                <w:rStyle w:val="Strong"/>
+                <w:rFonts w:ascii="Myriad-Pro, Calibri, Arial" w:hAnsi="Myriad-Pro, Calibri, Arial"/>
+                <w:b/>
+                <w:bCs w:val="0"/>
+                <w:color w:val="auto"/>
+                <w:sz w:val="14"/>
+                <w:szCs w:val="14"/>
+              </w:rPr>
+              <w:t>Form</w:t>
+            </w:r>
+          </w:p>
+        </w:tc>
+        <w:tc>
+          <w:tcPr>
+            <w:tcW w:w="1503" w:type="dxa"/>
           </w:tcPr>
           <w:p>
             <w:pPr>
@@ -275,7 +306,7 @@
         </w:trPr>
         <w:tc>
           <w:tcPr>
-            <w:tcW w:w="2920" w:type="dxa"/>
+            <w:tcW w:w="1261" w:type="dxa"/>
           </w:tcPr>
           <w:p>
             <w:pPr>
@@ -339,7 +370,7 @@
         </w:tc>
         <w:tc>
           <w:tcPr>
-            <w:tcW w:w="3291" w:type="dxa"/>
+            <w:tcW w:w="971" w:type="dxa"/>
           </w:tcPr>
           <w:p>
             <w:pPr>
@@ -419,7 +450,7 @@
         </w:tc>
         <w:tc>
           <w:tcPr>
-            <w:tcW w:w="2876" w:type="dxa"/>
+            <w:tcW w:w="1217" w:type="dxa"/>
           </w:tcPr>
           <w:p>
             <w:pPr>
@@ -469,7 +500,14 @@
                 <w:rFonts w:ascii="Myriad-Pro, Calibri, Arial" w:hAnsi="Myriad-Pro, Calibri, Arial"/>
                 <w:color w:val="auto"/>
               </w:rPr>
-              <w:t>].title</w:t>
+              <w:t>].</w:t>
+            </w:r>
+            <w:r>
+              <w:rPr>
+                <w:rFonts w:ascii="Myriad-Pro, Calibri, Arial" w:hAnsi="Myriad-Pro, Calibri, Arial"/>
+                <w:color w:val="auto"/>
+              </w:rPr>
+              <w:t>title</w:t>
             </w:r>
             <w:proofErr w:type="gramEnd"/>
             <w:r>
@@ -483,7 +521,7 @@
         </w:tc>
         <w:tc>
           <w:tcPr>
-            <w:tcW w:w="3314" w:type="dxa"/>
+            <w:tcW w:w="1217" w:type="dxa"/>
           </w:tcPr>
           <w:p>
             <w:pPr>
@@ -533,7 +571,14 @@
                 <w:rFonts w:ascii="Myriad-Pro, Calibri, Arial" w:hAnsi="Myriad-Pro, Calibri, Arial"/>
                 <w:color w:val="auto"/>
               </w:rPr>
-              <w:t>].subtitle</w:t>
+              <w:t>].</w:t>
+            </w:r>
+            <w:r>
+              <w:rPr>
+                <w:rFonts w:ascii="Myriad-Pro, Calibri, Arial" w:hAnsi="Myriad-Pro, Calibri, Arial"/>
+                <w:color w:val="auto"/>
+              </w:rPr>
+              <w:t>subtitle</w:t>
             </w:r>
             <w:proofErr w:type="gramEnd"/>
             <w:r>
@@ -547,7 +592,7 @@
         </w:tc>
         <w:tc>
           <w:tcPr>
-            <w:tcW w:w="3853" w:type="dxa"/>
+            <w:tcW w:w="1217" w:type="dxa"/>
           </w:tcPr>
           <w:p>
             <w:pPr>
@@ -611,7 +656,7 @@
         </w:tc>
         <w:tc>
           <w:tcPr>
-            <w:tcW w:w="3419" w:type="dxa"/>
+            <w:tcW w:w="1021" w:type="dxa"/>
           </w:tcPr>
           <w:p>
             <w:pPr>
@@ -675,7 +720,7 @@
         </w:tc>
         <w:tc>
           <w:tcPr>
-            <w:tcW w:w="2982" w:type="dxa"/>
+            <w:tcW w:w="1134" w:type="dxa"/>
           </w:tcPr>
           <w:p>
             <w:pPr>
@@ -683,30 +728,32 @@
               <w:rPr>
                 <w:rFonts w:ascii="Myriad-Pro, Calibri, Arial" w:hAnsi="Myriad-Pro, Calibri, Arial"/>
                 <w:color w:val="auto"/>
+                <w:lang w:val="en-CA"/>
               </w:rPr>
             </w:pPr>
             <w:r>
               <w:rPr>
                 <w:rFonts w:ascii="Myriad-Pro, Calibri, Arial" w:hAnsi="Myriad-Pro, Calibri, Arial"/>
                 <w:color w:val="auto"/>
+                <w:lang w:val="en-CA"/>
               </w:rPr>
               <w:t>{</w:t>
             </w:r>
             <w:proofErr w:type="spellStart"/>
-            <w:proofErr w:type="gramStart"/>
-            <w:r>
-              <w:rPr>
-                <w:rFonts w:ascii="Myriad-Pro, Calibri, Arial" w:hAnsi="Myriad-Pro, Calibri, Arial"/>
-                <w:color w:val="auto"/>
+            <w:r>
+              <w:rPr>
+                <w:rFonts w:ascii="Myriad-Pro, Calibri, Arial" w:hAnsi="Myriad-Pro, Calibri, Arial"/>
+                <w:color w:val="auto"/>
+                <w:lang w:val="en-CA"/>
               </w:rPr>
               <w:t>d.records</w:t>
             </w:r>
             <w:proofErr w:type="spellEnd"/>
-            <w:proofErr w:type="gramEnd"/>
-            <w:r>
-              <w:rPr>
-                <w:rFonts w:ascii="Myriad-Pro, Calibri, Arial" w:hAnsi="Myriad-Pro, Calibri, Arial"/>
-                <w:color w:val="auto"/>
+            <w:r>
+              <w:rPr>
+                <w:rFonts w:ascii="Myriad-Pro, Calibri, Arial" w:hAnsi="Myriad-Pro, Calibri, Arial"/>
+                <w:color w:val="auto"/>
+                <w:lang w:val="en-CA"/>
               </w:rPr>
               <w:t>[</w:t>
             </w:r>
@@ -715,23 +762,142 @@
               <w:rPr>
                 <w:rFonts w:ascii="Myriad-Pro, Calibri, Arial" w:hAnsi="Myriad-Pro, Calibri, Arial"/>
                 <w:color w:val="auto"/>
+                <w:lang w:val="en-CA"/>
               </w:rPr>
               <w:t>i</w:t>
             </w:r>
             <w:proofErr w:type="spellEnd"/>
-            <w:proofErr w:type="gramStart"/>
-            <w:r>
-              <w:rPr>
-                <w:rFonts w:ascii="Myriad-Pro, Calibri, Arial" w:hAnsi="Myriad-Pro, Calibri, Arial"/>
-                <w:color w:val="auto"/>
-              </w:rPr>
-              <w:t>].form</w:t>
-            </w:r>
-            <w:proofErr w:type="gramEnd"/>
-            <w:r>
-              <w:rPr>
-                <w:rFonts w:ascii="Myriad-Pro, Calibri, Arial" w:hAnsi="Myriad-Pro, Calibri, Arial"/>
-                <w:color w:val="auto"/>
+            <w:r>
+              <w:rPr>
+                <w:rFonts w:ascii="Myriad-Pro, Calibri, Arial" w:hAnsi="Myriad-Pro, Calibri, Arial"/>
+                <w:color w:val="auto"/>
+                <w:lang w:val="en-CA"/>
+              </w:rPr>
+              <w:t>].strength}{</w:t>
+            </w:r>
+            <w:proofErr w:type="spellStart"/>
+            <w:r>
+              <w:rPr>
+                <w:rFonts w:ascii="Myriad-Pro, Calibri, Arial" w:hAnsi="Myriad-Pro, Calibri, Arial"/>
+                <w:color w:val="auto"/>
+                <w:lang w:val="en-CA"/>
+              </w:rPr>
+              <w:t>d.records</w:t>
+            </w:r>
+            <w:proofErr w:type="spellEnd"/>
+            <w:r>
+              <w:rPr>
+                <w:rFonts w:ascii="Myriad-Pro, Calibri, Arial" w:hAnsi="Myriad-Pro, Calibri, Arial"/>
+                <w:color w:val="auto"/>
+                <w:lang w:val="en-CA"/>
+              </w:rPr>
+              <w:t>[</w:t>
+            </w:r>
+            <w:proofErr w:type="spellStart"/>
+            <w:r>
+              <w:rPr>
+                <w:rFonts w:ascii="Myriad-Pro, Calibri, Arial" w:hAnsi="Myriad-Pro, Calibri, Arial"/>
+                <w:color w:val="auto"/>
+                <w:lang w:val="en-CA"/>
+              </w:rPr>
+              <w:t>i</w:t>
+            </w:r>
+            <w:proofErr w:type="spellEnd"/>
+            <w:r>
+              <w:rPr>
+                <w:rFonts w:ascii="Myriad-Pro, Calibri, Arial" w:hAnsi="Myriad-Pro, Calibri, Arial"/>
+                <w:color w:val="auto"/>
+                <w:lang w:val="en-CA"/>
+              </w:rPr>
+              <w:t>].</w:t>
+            </w:r>
+            <w:proofErr w:type="spellStart"/>
+            <w:r>
+              <w:rPr>
+                <w:rFonts w:ascii="Myriad-Pro, Calibri, Arial" w:hAnsi="Myriad-Pro, Calibri, Arial"/>
+                <w:color w:val="auto"/>
+                <w:lang w:val="en-CA"/>
+              </w:rPr>
+              <w:t>check_din:showBegin</w:t>
+            </w:r>
+            <w:proofErr w:type="spellEnd"/>
+            <w:r>
+              <w:rPr>
+                <w:rFonts w:ascii="Myriad-Pro, Calibri, Arial" w:hAnsi="Myriad-Pro, Calibri, Arial"/>
+                <w:color w:val="auto"/>
+                <w:lang w:val="en-CA"/>
+              </w:rPr>
+              <w:t>}</w:t>
+            </w:r>
+            <w:hyperlink r:id="rId7" w:history="1">
+              <w:r>
+                <w:rPr>
+                  <w:rStyle w:val="Hyperlink"/>
+                  <w:rFonts w:ascii="Myriad-Pro, Calibri, Arial" w:hAnsi="Myriad-Pro, Calibri, Arial"/>
+                  <w:lang w:val="en-CA"/>
+                </w:rPr>
+                <w:t>Check DIN</w:t>
+              </w:r>
+            </w:hyperlink>
+            <w:r>
+              <w:rPr>
+                <w:rFonts w:ascii="Myriad-Pro, Calibri, Arial" w:hAnsi="Myriad-Pro, Calibri, Arial"/>
+                <w:color w:val="auto"/>
+                <w:lang w:val="en-CA"/>
+              </w:rPr>
+              <w:t>{</w:t>
+            </w:r>
+            <w:proofErr w:type="spellStart"/>
+            <w:r>
+              <w:rPr>
+                <w:rFonts w:ascii="Myriad-Pro, Calibri, Arial" w:hAnsi="Myriad-Pro, Calibri, Arial"/>
+                <w:color w:val="auto"/>
+                <w:lang w:val="en-CA"/>
+              </w:rPr>
+              <w:t>d.records</w:t>
+            </w:r>
+            <w:proofErr w:type="spellEnd"/>
+            <w:r>
+              <w:rPr>
+                <w:rFonts w:ascii="Myriad-Pro, Calibri, Arial" w:hAnsi="Myriad-Pro, Calibri, Arial"/>
+                <w:color w:val="auto"/>
+                <w:lang w:val="en-CA"/>
+              </w:rPr>
+              <w:t>[</w:t>
+            </w:r>
+            <w:proofErr w:type="spellStart"/>
+            <w:r>
+              <w:rPr>
+                <w:rFonts w:ascii="Myriad-Pro, Calibri, Arial" w:hAnsi="Myriad-Pro, Calibri, Arial"/>
+                <w:color w:val="auto"/>
+                <w:lang w:val="en-CA"/>
+              </w:rPr>
+              <w:t>i</w:t>
+            </w:r>
+            <w:proofErr w:type="spellEnd"/>
+            <w:r>
+              <w:rPr>
+                <w:rFonts w:ascii="Myriad-Pro, Calibri, Arial" w:hAnsi="Myriad-Pro, Calibri, Arial"/>
+                <w:color w:val="auto"/>
+                <w:lang w:val="en-CA"/>
+              </w:rPr>
+              <w:t>].</w:t>
+            </w:r>
+            <w:proofErr w:type="spellStart"/>
+            <w:r>
+              <w:rPr>
+                <w:rFonts w:ascii="Myriad-Pro, Calibri, Arial" w:hAnsi="Myriad-Pro, Calibri, Arial"/>
+                <w:color w:val="auto"/>
+                <w:lang w:val="en-CA"/>
+              </w:rPr>
+              <w:t>check_din:showEnd</w:t>
+            </w:r>
+            <w:proofErr w:type="spellEnd"/>
+            <w:r>
+              <w:rPr>
+                <w:rFonts w:ascii="Myriad-Pro, Calibri, Arial" w:hAnsi="Myriad-Pro, Calibri, Arial"/>
+                <w:color w:val="auto"/>
+                <w:lang w:val="en-CA"/>
               </w:rPr>
               <w:t>}</w:t>
             </w:r>
@@ -739,7 +905,71 @@
         </w:tc>
         <w:tc>
           <w:tcPr>
-            <w:tcW w:w="4066" w:type="dxa"/>
+            <w:tcW w:w="1217" w:type="dxa"/>
+          </w:tcPr>
+          <w:p>
+            <w:pPr>
+              <w:pStyle w:val="Small"/>
+              <w:rPr>
+                <w:rFonts w:ascii="Myriad-Pro, Calibri, Arial" w:hAnsi="Myriad-Pro, Calibri, Arial"/>
+                <w:color w:val="auto"/>
+              </w:rPr>
+            </w:pPr>
+            <w:r>
+              <w:rPr>
+                <w:rFonts w:ascii="Myriad-Pro, Calibri, Arial" w:hAnsi="Myriad-Pro, Calibri, Arial"/>
+                <w:color w:val="auto"/>
+              </w:rPr>
+              <w:t>{</w:t>
+            </w:r>
+            <w:proofErr w:type="spellStart"/>
+            <w:proofErr w:type="gramStart"/>
+            <w:r>
+              <w:rPr>
+                <w:rFonts w:ascii="Myriad-Pro, Calibri, Arial" w:hAnsi="Myriad-Pro, Calibri, Arial"/>
+                <w:color w:val="auto"/>
+              </w:rPr>
+              <w:t>d.records</w:t>
+            </w:r>
+            <w:proofErr w:type="spellEnd"/>
+            <w:proofErr w:type="gramEnd"/>
+            <w:r>
+              <w:rPr>
+                <w:rFonts w:ascii="Myriad-Pro, Calibri, Arial" w:hAnsi="Myriad-Pro, Calibri, Arial"/>
+                <w:color w:val="auto"/>
+              </w:rPr>
+              <w:t>[</w:t>
+            </w:r>
+            <w:proofErr w:type="spellStart"/>
+            <w:r>
+              <w:rPr>
+                <w:rFonts w:ascii="Myriad-Pro, Calibri, Arial" w:hAnsi="Myriad-Pro, Calibri, Arial"/>
+                <w:color w:val="auto"/>
+              </w:rPr>
+              <w:t>i</w:t>
+            </w:r>
+            <w:proofErr w:type="spellEnd"/>
+            <w:proofErr w:type="gramStart"/>
+            <w:r>
+              <w:rPr>
+                <w:rFonts w:ascii="Myriad-Pro, Calibri, Arial" w:hAnsi="Myriad-Pro, Calibri, Arial"/>
+                <w:color w:val="auto"/>
+              </w:rPr>
+              <w:t>].form</w:t>
+            </w:r>
+            <w:proofErr w:type="gramEnd"/>
+            <w:r>
+              <w:rPr>
+                <w:rFonts w:ascii="Myriad-Pro, Calibri, Arial" w:hAnsi="Myriad-Pro, Calibri, Arial"/>
+                <w:color w:val="auto"/>
+              </w:rPr>
+              <w:t>}</w:t>
+            </w:r>
+          </w:p>
+        </w:tc>
+        <w:tc>
+          <w:tcPr>
+            <w:tcW w:w="1503" w:type="dxa"/>
           </w:tcPr>
           <w:p>
             <w:pPr>
@@ -809,7 +1039,7 @@
         </w:trPr>
         <w:tc>
           <w:tcPr>
-            <w:tcW w:w="2920" w:type="dxa"/>
+            <w:tcW w:w="1261" w:type="dxa"/>
           </w:tcPr>
           <w:p>
             <w:pPr>
@@ -864,7 +1094,7 @@
         </w:tc>
         <w:tc>
           <w:tcPr>
-            <w:tcW w:w="3291" w:type="dxa"/>
+            <w:tcW w:w="971" w:type="dxa"/>
           </w:tcPr>
           <w:p>
             <w:pPr>
@@ -935,7 +1165,7 @@
         </w:tc>
         <w:tc>
           <w:tcPr>
-            <w:tcW w:w="2876" w:type="dxa"/>
+            <w:tcW w:w="1217" w:type="dxa"/>
           </w:tcPr>
           <w:p>
             <w:pPr>
@@ -976,7 +1206,14 @@
                 <w:rFonts w:ascii="Myriad-Pro, Calibri, Arial" w:hAnsi="Myriad-Pro, Calibri, Arial"/>
                 <w:color w:val="auto"/>
               </w:rPr>
-              <w:t>].title</w:t>
+              <w:t>].</w:t>
+            </w:r>
+            <w:r>
+              <w:rPr>
+                <w:rFonts w:ascii="Myriad-Pro, Calibri, Arial" w:hAnsi="Myriad-Pro, Calibri, Arial"/>
+                <w:color w:val="auto"/>
+              </w:rPr>
+              <w:t>title</w:t>
             </w:r>
             <w:proofErr w:type="gramEnd"/>
             <w:r>
@@ -990,7 +1227,7 @@
         </w:tc>
         <w:tc>
           <w:tcPr>
-            <w:tcW w:w="3314" w:type="dxa"/>
+            <w:tcW w:w="1217" w:type="dxa"/>
           </w:tcPr>
           <w:p>
             <w:pPr>
@@ -1031,7 +1268,14 @@
                 <w:rFonts w:ascii="Myriad-Pro, Calibri, Arial" w:hAnsi="Myriad-Pro, Calibri, Arial"/>
                 <w:color w:val="auto"/>
               </w:rPr>
-              <w:t>].subtitle</w:t>
+              <w:t>].</w:t>
+            </w:r>
+            <w:r>
+              <w:rPr>
+                <w:rFonts w:ascii="Myriad-Pro, Calibri, Arial" w:hAnsi="Myriad-Pro, Calibri, Arial"/>
+                <w:color w:val="auto"/>
+              </w:rPr>
+              <w:t>subtitle</w:t>
             </w:r>
             <w:proofErr w:type="gramEnd"/>
             <w:r>
@@ -1045,7 +1289,7 @@
         </w:tc>
         <w:tc>
           <w:tcPr>
-            <w:tcW w:w="3853" w:type="dxa"/>
+            <w:tcW w:w="1217" w:type="dxa"/>
           </w:tcPr>
           <w:p>
             <w:pPr>
@@ -1100,7 +1344,7 @@
         </w:tc>
         <w:tc>
           <w:tcPr>
-            <w:tcW w:w="3419" w:type="dxa"/>
+            <w:tcW w:w="1021" w:type="dxa"/>
           </w:tcPr>
           <w:p>
             <w:pPr>
@@ -1155,7 +1399,7 @@
         </w:tc>
         <w:tc>
           <w:tcPr>
-            <w:tcW w:w="2982" w:type="dxa"/>
+            <w:tcW w:w="1134" w:type="dxa"/>
           </w:tcPr>
           <w:p>
             <w:pPr>
@@ -1163,6 +1407,7 @@
               <w:rPr>
                 <w:rFonts w:ascii="Myriad-Pro, Calibri, Arial" w:hAnsi="Myriad-Pro, Calibri, Arial"/>
                 <w:color w:val="auto"/>
+                <w:lang w:val="en-CA"/>
               </w:rPr>
             </w:pPr>
             <w:r>
@@ -1172,37 +1417,65 @@
               </w:rPr>
               <w:t>{</w:t>
             </w:r>
+            <w:r>
+              <w:rPr>
+                <w:rFonts w:ascii="Myriad-Pro, Calibri, Arial" w:hAnsi="Myriad-Pro, Calibri, Arial"/>
+                <w:color w:val="auto"/>
+                <w:lang w:val="en-CA"/>
+              </w:rPr>
+              <w:t>d.records[i+1].strength}{d.records[i+1].check_din:showBegin}</w:t>
+            </w:r>
+            <w:hyperlink r:id="rId8" w:history="1">
+              <w:r>
+                <w:rPr>
+                  <w:rStyle w:val="Hyperlink"/>
+                  <w:rFonts w:ascii="Myriad-Pro, Calibri, Arial" w:hAnsi="Myriad-Pro, Calibri, Arial"/>
+                  <w:lang w:val="en-CA"/>
+                </w:rPr>
+                <w:t>Check DIN</w:t>
+              </w:r>
+            </w:hyperlink>
+            <w:r>
+              <w:rPr>
+                <w:rFonts w:ascii="Myriad-Pro, Calibri, Arial" w:hAnsi="Myriad-Pro, Calibri, Arial"/>
+                <w:color w:val="auto"/>
+                <w:lang w:val="en-CA"/>
+              </w:rPr>
+              <w:t>{</w:t>
+            </w:r>
             <w:proofErr w:type="spellStart"/>
-            <w:proofErr w:type="gramStart"/>
-            <w:r>
-              <w:rPr>
-                <w:rFonts w:ascii="Myriad-Pro, Calibri, Arial" w:hAnsi="Myriad-Pro, Calibri, Arial"/>
-                <w:color w:val="auto"/>
+            <w:r>
+              <w:rPr>
+                <w:rFonts w:ascii="Myriad-Pro, Calibri, Arial" w:hAnsi="Myriad-Pro, Calibri, Arial"/>
+                <w:color w:val="auto"/>
+                <w:lang w:val="en-CA"/>
               </w:rPr>
               <w:t>d.records</w:t>
             </w:r>
             <w:proofErr w:type="spellEnd"/>
-            <w:proofErr w:type="gramEnd"/>
-            <w:r>
-              <w:rPr>
-                <w:rFonts w:ascii="Myriad-Pro, Calibri, Arial" w:hAnsi="Myriad-Pro, Calibri, Arial"/>
-                <w:color w:val="auto"/>
-              </w:rPr>
-              <w:t>[i+1</w:t>
-            </w:r>
-            <w:proofErr w:type="gramStart"/>
-            <w:r>
-              <w:rPr>
-                <w:rFonts w:ascii="Myriad-Pro, Calibri, Arial" w:hAnsi="Myriad-Pro, Calibri, Arial"/>
-                <w:color w:val="auto"/>
-              </w:rPr>
-              <w:t>].form</w:t>
-            </w:r>
-            <w:proofErr w:type="gramEnd"/>
-            <w:r>
-              <w:rPr>
-                <w:rFonts w:ascii="Myriad-Pro, Calibri, Arial" w:hAnsi="Myriad-Pro, Calibri, Arial"/>
-                <w:color w:val="auto"/>
+            <w:r>
+              <w:rPr>
+                <w:rFonts w:ascii="Myriad-Pro, Calibri, Arial" w:hAnsi="Myriad-Pro, Calibri, Arial"/>
+                <w:color w:val="auto"/>
+                <w:lang w:val="en-CA"/>
+              </w:rPr>
+              <w:t>[i+1].</w:t>
+            </w:r>
+            <w:proofErr w:type="spellStart"/>
+            <w:r>
+              <w:rPr>
+                <w:rFonts w:ascii="Myriad-Pro, Calibri, Arial" w:hAnsi="Myriad-Pro, Calibri, Arial"/>
+                <w:color w:val="auto"/>
+                <w:lang w:val="en-CA"/>
+              </w:rPr>
+              <w:t>check_din:showEnd</w:t>
+            </w:r>
+            <w:proofErr w:type="spellEnd"/>
+            <w:r>
+              <w:rPr>
+                <w:rFonts w:ascii="Myriad-Pro, Calibri, Arial" w:hAnsi="Myriad-Pro, Calibri, Arial"/>
+                <w:color w:val="auto"/>
+                <w:lang w:val="en-CA"/>
               </w:rPr>
               <w:t>}</w:t>
             </w:r>
@@ -1210,7 +1483,62 @@
         </w:tc>
         <w:tc>
           <w:tcPr>
-            <w:tcW w:w="4066" w:type="dxa"/>
+            <w:tcW w:w="1217" w:type="dxa"/>
+          </w:tcPr>
+          <w:p>
+            <w:pPr>
+              <w:pStyle w:val="Small"/>
+              <w:rPr>
+                <w:rFonts w:ascii="Myriad-Pro, Calibri, Arial" w:hAnsi="Myriad-Pro, Calibri, Arial"/>
+                <w:color w:val="auto"/>
+              </w:rPr>
+            </w:pPr>
+            <w:r>
+              <w:rPr>
+                <w:rFonts w:ascii="Myriad-Pro, Calibri, Arial" w:hAnsi="Myriad-Pro, Calibri, Arial"/>
+                <w:color w:val="auto"/>
+              </w:rPr>
+              <w:t>{</w:t>
+            </w:r>
+            <w:proofErr w:type="spellStart"/>
+            <w:proofErr w:type="gramStart"/>
+            <w:r>
+              <w:rPr>
+                <w:rFonts w:ascii="Myriad-Pro, Calibri, Arial" w:hAnsi="Myriad-Pro, Calibri, Arial"/>
+                <w:color w:val="auto"/>
+              </w:rPr>
+              <w:t>d.records</w:t>
+            </w:r>
+            <w:proofErr w:type="spellEnd"/>
+            <w:proofErr w:type="gramEnd"/>
+            <w:r>
+              <w:rPr>
+                <w:rFonts w:ascii="Myriad-Pro, Calibri, Arial" w:hAnsi="Myriad-Pro, Calibri, Arial"/>
+                <w:color w:val="auto"/>
+              </w:rPr>
+              <w:t>[i+1</w:t>
+            </w:r>
+            <w:proofErr w:type="gramStart"/>
+            <w:r>
+              <w:rPr>
+                <w:rFonts w:ascii="Myriad-Pro, Calibri, Arial" w:hAnsi="Myriad-Pro, Calibri, Arial"/>
+                <w:color w:val="auto"/>
+              </w:rPr>
+              <w:t>].form</w:t>
+            </w:r>
+            <w:proofErr w:type="gramEnd"/>
+            <w:r>
+              <w:rPr>
+                <w:rFonts w:ascii="Myriad-Pro, Calibri, Arial" w:hAnsi="Myriad-Pro, Calibri, Arial"/>
+                <w:color w:val="auto"/>
+              </w:rPr>
+              <w:t>}</w:t>
+            </w:r>
+          </w:p>
+        </w:tc>
+        <w:tc>
+          <w:tcPr>
+            <w:tcW w:w="1503" w:type="dxa"/>
           </w:tcPr>
           <w:p>
             <w:pPr>
@@ -1281,12 +1609,21 @@
         <w:t>{</w:t>
       </w:r>
       <w:proofErr w:type="spellStart"/>
+      <w:proofErr w:type="gramStart"/>
       <w:r>
         <w:rPr>
           <w:rFonts w:ascii="Myriad-Pro, Calibri, Arial" w:hAnsi="Myriad-Pro, Calibri, Arial"/>
           <w:color w:val="000000" w:themeColor="text1"/>
         </w:rPr>
-        <w:t>d.records:ifEM</w:t>
+        <w:t>d.records</w:t>
+      </w:r>
+      <w:proofErr w:type="gramEnd"/>
+      <w:r>
+        <w:rPr>
+          <w:rFonts w:ascii="Myriad-Pro, Calibri, Arial" w:hAnsi="Myriad-Pro, Calibri, Arial"/>
+          <w:color w:val="000000" w:themeColor="text1"/>
+        </w:rPr>
+        <w:t>:ifEM</w:t>
       </w:r>
       <w:proofErr w:type="spellEnd"/>
       <w:r>
@@ -1294,7 +1631,15 @@
           <w:rFonts w:ascii="Myriad-Pro, Calibri, Arial" w:hAnsi="Myriad-Pro, Calibri, Arial"/>
           <w:color w:val="000000" w:themeColor="text1"/>
         </w:rPr>
-        <w:t>():</w:t>
+        <w:t>(</w:t>
+      </w:r>
+      <w:proofErr w:type="gramStart"/>
+      <w:r>
+        <w:rPr>
+          <w:rFonts w:ascii="Myriad-Pro, Calibri, Arial" w:hAnsi="Myriad-Pro, Calibri, Arial"/>
+          <w:color w:val="000000" w:themeColor="text1"/>
+        </w:rPr>
+        <w:t>):</w:t>
       </w:r>
       <w:proofErr w:type="spellStart"/>
       <w:r>
@@ -1305,15 +1650,23 @@
         <w:t>showBegin</w:t>
       </w:r>
       <w:proofErr w:type="spellEnd"/>
+      <w:proofErr w:type="gramEnd"/>
       <w:r>
         <w:rPr>
           <w:rFonts w:ascii="Myriad-Pro, Calibri, Arial" w:hAnsi="Myriad-Pro, Calibri, Arial"/>
           <w:color w:val="000000" w:themeColor="text1"/>
         </w:rPr>
-        <w:t>}No records found.{</w:t>
+        <w:t xml:space="preserve">}No records </w:t>
+      </w:r>
+      <w:proofErr w:type="gramStart"/>
+      <w:r>
+        <w:rPr>
+          <w:rFonts w:ascii="Myriad-Pro, Calibri, Arial" w:hAnsi="Myriad-Pro, Calibri, Arial"/>
+          <w:color w:val="000000" w:themeColor="text1"/>
+        </w:rPr>
+        <w:t>found.{</w:t>
       </w:r>
       <w:proofErr w:type="spellStart"/>
-      <w:proofErr w:type="gramStart"/>
       <w:r>
         <w:rPr>
           <w:rFonts w:ascii="Myriad-Pro, Calibri, Arial" w:hAnsi="Myriad-Pro, Calibri, Arial"/>
@@ -1339,9 +1692,9 @@
       </w:r>
     </w:p>
     <w:sectPr>
-      <w:headerReference w:type="default" r:id="rId7"/>
-      <w:footerReference w:type="even" r:id="rId8"/>
-      <w:footerReference w:type="default" r:id="rId9"/>
+      <w:headerReference w:type="default" r:id="rId9"/>
+      <w:footerReference w:type="even" r:id="rId10"/>
+      <w:footerReference w:type="default" r:id="rId11"/>
       <w:pgSz w:w="12240" w:h="15840"/>
       <w:pgMar w:top="720" w:right="720" w:bottom="720" w:left="720" w:header="708" w:footer="708" w:gutter="0"/>
       <w:cols w:space="708"/>
@@ -1414,11 +1767,27 @@
           </w:rPr>
           <w:t xml:space="preserve"> {</w:t>
         </w:r>
+        <w:proofErr w:type="spellStart"/>
+        <w:proofErr w:type="gramStart"/>
         <w:r>
           <w:rPr>
             <w:rFonts w:ascii="Myriad-Pro, Calibri, Arial" w:hAnsi="Myriad-Pro, Calibri, Arial"/>
           </w:rPr>
-          <w:t>d.header.datePrinted}</w:t>
+          <w:t>d.header</w:t>
+        </w:r>
+        <w:proofErr w:type="gramEnd"/>
+        <w:r>
+          <w:rPr>
+            <w:rFonts w:ascii="Myriad-Pro, Calibri, Arial" w:hAnsi="Myriad-Pro, Calibri, Arial"/>
+          </w:rPr>
+          <w:t>.datePrinted</w:t>
+        </w:r>
+        <w:proofErr w:type="spellEnd"/>
+        <w:r>
+          <w:rPr>
+            <w:rFonts w:ascii="Myriad-Pro, Calibri, Arial" w:hAnsi="Myriad-Pro, Calibri, Arial"/>
+          </w:rPr>
+          <w:t>}</w:t>
         </w:r>
         <w:r>
           <w:rPr>
@@ -1648,6 +2017,8 @@
       </w:rPr>
       <w:t>{</w:t>
     </w:r>
+    <w:proofErr w:type="spellStart"/>
+    <w:proofErr w:type="gramStart"/>
     <w:r>
       <w:rPr>
         <w:rFonts w:ascii="Myriad-Pro, Calibri, Arial" w:hAnsi="Myriad-Pro, Calibri, Arial"/>
@@ -1658,6 +2029,96 @@
       <w:rPr>
         <w:rFonts w:ascii="Myriad-Pro, Calibri, Arial" w:hAnsi="Myriad-Pro, Calibri, Arial"/>
       </w:rPr>
+      <w:t>header</w:t>
+    </w:r>
+    <w:proofErr w:type="gramEnd"/>
+    <w:r>
+      <w:rPr>
+        <w:rFonts w:ascii="Myriad-Pro, Calibri, Arial" w:hAnsi="Myriad-Pro, Calibri, Arial"/>
+      </w:rPr>
+      <w:t>.</w:t>
+    </w:r>
+    <w:proofErr w:type="gramStart"/>
+    <w:r>
+      <w:rPr>
+        <w:rFonts w:ascii="Myriad-Pro, Calibri, Arial" w:hAnsi="Myriad-Pro, Calibri, Arial"/>
+      </w:rPr>
+      <w:t>isR</w:t>
+    </w:r>
+    <w:r>
+      <w:rPr>
+        <w:rFonts w:ascii="Myriad-Pro, Calibri, Arial" w:hAnsi="Myriad-Pro, Calibri, Arial"/>
+      </w:rPr>
+      <w:t>edacted:ifEQ</w:t>
+    </w:r>
+    <w:proofErr w:type="spellEnd"/>
+    <w:proofErr w:type="gramEnd"/>
+    <w:r>
+      <w:rPr>
+        <w:rFonts w:ascii="Myriad-Pro, Calibri, Arial" w:hAnsi="Myriad-Pro, Calibri, Arial"/>
+      </w:rPr>
+      <w:t>(true</w:t>
+    </w:r>
+    <w:proofErr w:type="gramStart"/>
+    <w:r>
+      <w:rPr>
+        <w:rFonts w:ascii="Myriad-Pro, Calibri, Arial" w:hAnsi="Myriad-Pro, Calibri, Arial"/>
+      </w:rPr>
+      <w:t>):</w:t>
+    </w:r>
+    <w:proofErr w:type="spellStart"/>
+    <w:r>
+      <w:rPr>
+        <w:rFonts w:ascii="Myriad-Pro, Calibri, Arial" w:hAnsi="Myriad-Pro, Calibri, Arial"/>
+      </w:rPr>
+      <w:t>show</w:t>
+    </w:r>
+    <w:r>
+      <w:rPr>
+        <w:rFonts w:ascii="Myriad-Pro, Calibri, Arial" w:hAnsi="Myriad-Pro, Calibri, Arial"/>
+      </w:rPr>
+      <w:t>Begin</w:t>
+    </w:r>
+    <w:proofErr w:type="spellEnd"/>
+    <w:proofErr w:type="gramEnd"/>
+    <w:r>
+      <w:rPr>
+        <w:rFonts w:ascii="Myriad-Pro, Calibri, Arial" w:hAnsi="Myriad-Pro, Calibri, Arial"/>
+      </w:rPr>
+      <w:t>}(</w:t>
+    </w:r>
+    <w:r>
+      <w:rPr>
+        <w:rFonts w:ascii="Myriad-Pro, Calibri, Arial" w:hAnsi="Myriad-Pro, Calibri, Arial"/>
+      </w:rPr>
+      <w:t>Redacted</w:t>
+    </w:r>
+    <w:proofErr w:type="gramStart"/>
+    <w:r>
+      <w:rPr>
+        <w:rFonts w:ascii="Myriad-Pro, Calibri, Arial" w:hAnsi="Myriad-Pro, Calibri, Arial"/>
+      </w:rPr>
+      <w:t>){</w:t>
+    </w:r>
+    <w:proofErr w:type="gramEnd"/>
+    <w:r>
+      <w:rPr>
+        <w:rFonts w:ascii="Myriad-Pro, Calibri, Arial" w:hAnsi="Myriad-Pro, Calibri, Arial"/>
+      </w:rPr>
+      <w:t>d.</w:t>
+    </w:r>
+    <w:r>
+      <w:rPr>
+        <w:rFonts w:ascii="Myriad-Pro, Calibri, Arial" w:hAnsi="Myriad-Pro, Calibri, Arial"/>
+      </w:rPr>
+      <w:t xml:space="preserve"> </w:t>
+    </w:r>
+    <w:proofErr w:type="spellStart"/>
+    <w:proofErr w:type="gramStart"/>
+    <w:r>
+      <w:rPr>
+        <w:rFonts w:ascii="Myriad-Pro, Calibri, Arial" w:hAnsi="Myriad-Pro, Calibri, Arial"/>
+      </w:rPr>
       <w:t>header.</w:t>
     </w:r>
     <w:r>
@@ -1670,49 +2131,21 @@
       <w:rPr>
         <w:rFonts w:ascii="Myriad-Pro, Calibri, Arial" w:hAnsi="Myriad-Pro, Calibri, Arial"/>
       </w:rPr>
-      <w:t>edacted:ifEQ(true):show</w:t>
-    </w:r>
-    <w:r>
-      <w:rPr>
-        <w:rFonts w:ascii="Myriad-Pro, Calibri, Arial" w:hAnsi="Myriad-Pro, Calibri, Arial"/>
-      </w:rPr>
-      <w:t>Begin}(</w:t>
-    </w:r>
-    <w:r>
-      <w:rPr>
-        <w:rFonts w:ascii="Myriad-Pro, Calibri, Arial" w:hAnsi="Myriad-Pro, Calibri, Arial"/>
-      </w:rPr>
-      <w:t>Redacted</w:t>
-    </w:r>
-    <w:r>
-      <w:rPr>
-        <w:rFonts w:ascii="Myriad-Pro, Calibri, Arial" w:hAnsi="Myriad-Pro, Calibri, Arial"/>
-      </w:rPr>
-      <w:t>){d.</w:t>
-    </w:r>
-    <w:r>
-      <w:rPr>
-        <w:rFonts w:ascii="Myriad-Pro, Calibri, Arial" w:hAnsi="Myriad-Pro, Calibri, Arial"/>
-      </w:rPr>
-      <w:t xml:space="preserve"> </w:t>
-    </w:r>
-    <w:r>
-      <w:rPr>
-        <w:rFonts w:ascii="Myriad-Pro, Calibri, Arial" w:hAnsi="Myriad-Pro, Calibri, Arial"/>
-      </w:rPr>
-      <w:t>header.</w:t>
-    </w:r>
-    <w:r>
-      <w:rPr>
-        <w:rFonts w:ascii="Myriad-Pro, Calibri, Arial" w:hAnsi="Myriad-Pro, Calibri, Arial"/>
-      </w:rPr>
-      <w:t>isR</w:t>
-    </w:r>
-    <w:r>
-      <w:rPr>
-        <w:rFonts w:ascii="Myriad-Pro, Calibri, Arial" w:hAnsi="Myriad-Pro, Calibri, Arial"/>
-      </w:rPr>
-      <w:t>edacted:showEnd}</w:t>
+      <w:t>edacted</w:t>
+    </w:r>
+    <w:proofErr w:type="gramEnd"/>
+    <w:r>
+      <w:rPr>
+        <w:rFonts w:ascii="Myriad-Pro, Calibri, Arial" w:hAnsi="Myriad-Pro, Calibri, Arial"/>
+      </w:rPr>
+      <w:t>:showEnd</w:t>
+    </w:r>
+    <w:proofErr w:type="spellEnd"/>
+    <w:r>
+      <w:rPr>
+        <w:rFonts w:ascii="Myriad-Pro, Calibri, Arial" w:hAnsi="Myriad-Pro, Calibri, Arial"/>
+      </w:rPr>
+      <w:t>}</w:t>
     </w:r>
   </w:p>
   <w:p>
@@ -1818,7 +2251,14 @@
             <w:rPr>
               <w:rFonts w:ascii="Myriad-Pro, Calibri, Arial" w:hAnsi="Myriad-Pro, Calibri, Arial"/>
             </w:rPr>
-            <w:t xml:space="preserve"> {d.</w:t>
+            <w:t xml:space="preserve"> {</w:t>
+          </w:r>
+          <w:proofErr w:type="gramStart"/>
+          <w:r>
+            <w:rPr>
+              <w:rFonts w:ascii="Myriad-Pro, Calibri, Arial" w:hAnsi="Myriad-Pro, Calibri, Arial"/>
+            </w:rPr>
+            <w:t>d.</w:t>
           </w:r>
           <w:r>
             <w:rPr>
@@ -1830,7 +2270,14 @@
             <w:rPr>
               <w:rFonts w:ascii="Myriad-Pro, Calibri, Arial" w:hAnsi="Myriad-Pro, Calibri, Arial"/>
             </w:rPr>
-            <w:t>name}</w:t>
+            <w:t>name</w:t>
+          </w:r>
+          <w:proofErr w:type="gramEnd"/>
+          <w:r>
+            <w:rPr>
+              <w:rFonts w:ascii="Myriad-Pro, Calibri, Arial" w:hAnsi="Myriad-Pro, Calibri, Arial"/>
+            </w:rPr>
+            <w:t>}</w:t>
           </w:r>
         </w:p>
       </w:tc>
@@ -1856,7 +2303,14 @@
             <w:rPr>
               <w:rFonts w:ascii="Myriad-Pro, Calibri, Arial" w:hAnsi="Myriad-Pro, Calibri, Arial"/>
             </w:rPr>
-            <w:t xml:space="preserve"> {d.</w:t>
+            <w:t xml:space="preserve"> {</w:t>
+          </w:r>
+          <w:proofErr w:type="spellStart"/>
+          <w:r>
+            <w:rPr>
+              <w:rFonts w:ascii="Myriad-Pro, Calibri, Arial" w:hAnsi="Myriad-Pro, Calibri, Arial"/>
+            </w:rPr>
+            <w:t>d.</w:t>
           </w:r>
           <w:r>
             <w:rPr>
@@ -1870,6 +2324,7 @@
             </w:rPr>
             <w:t>.phn</w:t>
           </w:r>
+          <w:proofErr w:type="spellEnd"/>
           <w:r>
             <w:rPr>
               <w:rFonts w:ascii="Myriad-Pro, Calibri, Arial" w:hAnsi="Myriad-Pro, Calibri, Arial"/>
@@ -1900,7 +2355,15 @@
             <w:rPr>
               <w:rFonts w:ascii="Myriad-Pro, Calibri, Arial" w:hAnsi="Myriad-Pro, Calibri, Arial"/>
             </w:rPr>
-            <w:t xml:space="preserve"> {d</w:t>
+            <w:t xml:space="preserve"> {</w:t>
+          </w:r>
+          <w:proofErr w:type="spellStart"/>
+          <w:proofErr w:type="gramStart"/>
+          <w:r>
+            <w:rPr>
+              <w:rFonts w:ascii="Myriad-Pro, Calibri, Arial" w:hAnsi="Myriad-Pro, Calibri, Arial"/>
+            </w:rPr>
+            <w:t>d</w:t>
           </w:r>
           <w:r>
             <w:rPr>
@@ -1914,12 +2377,14 @@
             </w:rPr>
             <w:t>header</w:t>
           </w:r>
+          <w:proofErr w:type="gramEnd"/>
           <w:r>
             <w:rPr>
               <w:rFonts w:ascii="Myriad-Pro, Calibri, Arial" w:hAnsi="Myriad-Pro, Calibri, Arial"/>
             </w:rPr>
             <w:t>.dateOfBirth</w:t>
           </w:r>
+          <w:proofErr w:type="spellEnd"/>
           <w:r>
             <w:rPr>
               <w:rFonts w:ascii="Myriad-Pro, Calibri, Arial" w:hAnsi="Myriad-Pro, Calibri, Arial"/>
@@ -1946,15 +2411,17 @@
         <w:sz w:val="18"/>
         <w:szCs w:val="18"/>
       </w:rPr>
-      <w:t>{d</w:t>
-    </w:r>
+      <w:t>{</w:t>
+    </w:r>
+    <w:proofErr w:type="spellStart"/>
+    <w:proofErr w:type="gramStart"/>
     <w:r>
       <w:rPr>
         <w:rFonts w:ascii="Myriad-Pro, Calibri, Arial" w:hAnsi="Myriad-Pro, Calibri, Arial"/>
         <w:sz w:val="18"/>
         <w:szCs w:val="18"/>
       </w:rPr>
-      <w:t>.</w:t>
+      <w:t>d</w:t>
     </w:r>
     <w:r>
       <w:rPr>
@@ -1962,7 +2429,7 @@
         <w:sz w:val="18"/>
         <w:szCs w:val="18"/>
       </w:rPr>
-      <w:t>header</w:t>
+      <w:t>.</w:t>
     </w:r>
     <w:r>
       <w:rPr>
@@ -1970,23 +2437,25 @@
         <w:sz w:val="18"/>
         <w:szCs w:val="18"/>
       </w:rPr>
-      <w:t>.filterText</w:t>
-    </w:r>
+      <w:t>header</w:t>
+    </w:r>
+    <w:proofErr w:type="gramEnd"/>
     <w:r>
       <w:rPr>
         <w:rFonts w:ascii="Myriad-Pro, Calibri, Arial" w:hAnsi="Myriad-Pro, Calibri, Arial"/>
         <w:sz w:val="18"/>
         <w:szCs w:val="18"/>
       </w:rPr>
-      <w:t>:ifNEM():showBegin</w:t>
-    </w:r>
+      <w:t>.</w:t>
+    </w:r>
+    <w:proofErr w:type="gramStart"/>
     <w:r>
       <w:rPr>
         <w:rFonts w:ascii="Myriad-Pro, Calibri, Arial" w:hAnsi="Myriad-Pro, Calibri, Arial"/>
         <w:sz w:val="18"/>
         <w:szCs w:val="18"/>
       </w:rPr>
-      <w:t>}</w:t>
+      <w:t>filterText</w:t>
     </w:r>
     <w:r>
       <w:rPr>
@@ -1994,40 +2463,98 @@
         <w:sz w:val="18"/>
         <w:szCs w:val="18"/>
       </w:rPr>
-      <w:t>{d</w:t>
-    </w:r>
+      <w:t>:ifNEM</w:t>
+    </w:r>
+    <w:proofErr w:type="spellEnd"/>
+    <w:proofErr w:type="gramEnd"/>
     <w:r>
       <w:rPr>
         <w:rFonts w:ascii="Myriad-Pro, Calibri, Arial" w:hAnsi="Myriad-Pro, Calibri, Arial"/>
         <w:sz w:val="18"/>
         <w:szCs w:val="18"/>
       </w:rPr>
-      <w:t>.</w:t>
-    </w:r>
+      <w:t>(</w:t>
+    </w:r>
+    <w:proofErr w:type="gramStart"/>
     <w:r>
       <w:rPr>
         <w:rFonts w:ascii="Myriad-Pro, Calibri, Arial" w:hAnsi="Myriad-Pro, Calibri, Arial"/>
         <w:sz w:val="18"/>
         <w:szCs w:val="18"/>
       </w:rPr>
-      <w:t>header</w:t>
-    </w:r>
+      <w:t>):</w:t>
+    </w:r>
+    <w:proofErr w:type="spellStart"/>
     <w:r>
       <w:rPr>
         <w:rFonts w:ascii="Myriad-Pro, Calibri, Arial" w:hAnsi="Myriad-Pro, Calibri, Arial"/>
         <w:sz w:val="18"/>
         <w:szCs w:val="18"/>
       </w:rPr>
-      <w:t>.</w:t>
-    </w:r>
+      <w:t>showBegin</w:t>
+    </w:r>
+    <w:proofErr w:type="spellEnd"/>
+    <w:proofErr w:type="gramEnd"/>
     <w:r>
       <w:rPr>
         <w:rFonts w:ascii="Myriad-Pro, Calibri, Arial" w:hAnsi="Myriad-Pro, Calibri, Arial"/>
         <w:sz w:val="18"/>
         <w:szCs w:val="18"/>
       </w:rPr>
+      <w:t>}</w:t>
+    </w:r>
+    <w:r>
+      <w:rPr>
+        <w:rFonts w:ascii="Myriad-Pro, Calibri, Arial" w:hAnsi="Myriad-Pro, Calibri, Arial"/>
+        <w:sz w:val="18"/>
+        <w:szCs w:val="18"/>
+      </w:rPr>
+      <w:t>{</w:t>
+    </w:r>
+    <w:proofErr w:type="spellStart"/>
+    <w:proofErr w:type="gramStart"/>
+    <w:r>
+      <w:rPr>
+        <w:rFonts w:ascii="Myriad-Pro, Calibri, Arial" w:hAnsi="Myriad-Pro, Calibri, Arial"/>
+        <w:sz w:val="18"/>
+        <w:szCs w:val="18"/>
+      </w:rPr>
+      <w:t>d</w:t>
+    </w:r>
+    <w:r>
+      <w:rPr>
+        <w:rFonts w:ascii="Myriad-Pro, Calibri, Arial" w:hAnsi="Myriad-Pro, Calibri, Arial"/>
+        <w:sz w:val="18"/>
+        <w:szCs w:val="18"/>
+      </w:rPr>
+      <w:t>.</w:t>
+    </w:r>
+    <w:r>
+      <w:rPr>
+        <w:rFonts w:ascii="Myriad-Pro, Calibri, Arial" w:hAnsi="Myriad-Pro, Calibri, Arial"/>
+        <w:sz w:val="18"/>
+        <w:szCs w:val="18"/>
+      </w:rPr>
+      <w:t>header</w:t>
+    </w:r>
+    <w:proofErr w:type="gramEnd"/>
+    <w:r>
+      <w:rPr>
+        <w:rFonts w:ascii="Myriad-Pro, Calibri, Arial" w:hAnsi="Myriad-Pro, Calibri, Arial"/>
+        <w:sz w:val="18"/>
+        <w:szCs w:val="18"/>
+      </w:rPr>
+      <w:t>.</w:t>
+    </w:r>
+    <w:r>
+      <w:rPr>
+        <w:rFonts w:ascii="Myriad-Pro, Calibri, Arial" w:hAnsi="Myriad-Pro, Calibri, Arial"/>
+        <w:sz w:val="18"/>
+        <w:szCs w:val="18"/>
+      </w:rPr>
       <w:t>filterText</w:t>
     </w:r>
+    <w:proofErr w:type="spellEnd"/>
     <w:r>
       <w:rPr>
         <w:rFonts w:ascii="Myriad-Pro, Calibri, Arial" w:hAnsi="Myriad-Pro, Calibri, Arial"/>
@@ -2048,7 +2575,45 @@
         <w:sz w:val="18"/>
         <w:szCs w:val="18"/>
       </w:rPr>
-      <w:t>{d.header.filterText:showEnd}</w:t>
+      <w:t>{</w:t>
+    </w:r>
+    <w:proofErr w:type="spellStart"/>
+    <w:proofErr w:type="gramStart"/>
+    <w:r>
+      <w:rPr>
+        <w:rFonts w:ascii="Myriad-Pro, Calibri, Arial" w:hAnsi="Myriad-Pro, Calibri, Arial"/>
+        <w:sz w:val="18"/>
+        <w:szCs w:val="18"/>
+      </w:rPr>
+      <w:t>d.header</w:t>
+    </w:r>
+    <w:proofErr w:type="gramEnd"/>
+    <w:r>
+      <w:rPr>
+        <w:rFonts w:ascii="Myriad-Pro, Calibri, Arial" w:hAnsi="Myriad-Pro, Calibri, Arial"/>
+        <w:sz w:val="18"/>
+        <w:szCs w:val="18"/>
+      </w:rPr>
+      <w:t>.</w:t>
+    </w:r>
+    <w:proofErr w:type="gramStart"/>
+    <w:r>
+      <w:rPr>
+        <w:rFonts w:ascii="Myriad-Pro, Calibri, Arial" w:hAnsi="Myriad-Pro, Calibri, Arial"/>
+        <w:sz w:val="18"/>
+        <w:szCs w:val="18"/>
+      </w:rPr>
+      <w:t>filterText:showEnd</w:t>
+    </w:r>
+    <w:proofErr w:type="spellEnd"/>
+    <w:proofErr w:type="gramEnd"/>
+    <w:r>
+      <w:rPr>
+        <w:rFonts w:ascii="Myriad-Pro, Calibri, Arial" w:hAnsi="Myriad-Pro, Calibri, Arial"/>
+        <w:sz w:val="18"/>
+        <w:szCs w:val="18"/>
+      </w:rPr>
+      <w:t>}</w:t>
     </w:r>
   </w:p>
 </w:hdr>
@@ -2493,7 +3058,6 @@
   <w:style w:type="character" w:default="1" w:styleId="DefaultParagraphFont">
     <w:name w:val="Default Paragraph Font"/>
     <w:uiPriority w:val="1"/>
-    <w:semiHidden/>
     <w:unhideWhenUsed/>
   </w:style>
   <w:style w:type="table" w:default="1" w:styleId="TableNormal">

</xml_diff>